<commit_message>
feat(paper): citation-order references with clickable links (sample style)
- References renumbered by first appearance in the text (base paper = [1]),
  each claim matched to the best-suited entry from the user's re-collected
  75-reference list with URLs (ref_Exfil.txt); uncited entries trail after
  the cited ones so the 75-reference count is preserved.
- In-text [N] citations and reference-list entry numbers are now clickable
  hyperlinks to the source URLs, plain-styled to match the sample deck.
- Hyperlink post-pass rewritten as a single-pass run splitter after the
  first version duplicated surrounding text (verified: intro sentence now
  appears exactly once, 104 external links in the docx).
- refs #44/#55 have no URL in the user's file and render as plain numbers.
</commit_message>
<xml_diff>
--- a/Paper/ExFilTrap_Paper.docx
+++ b/Paper/ExFilTrap_Paper.docx
@@ -658,7 +658,64 @@
           <w:i w:val="0"/>
           <w:sz w:val="24"/>
         </w:rPr>
-        <w:t>The Domain Name System (DNS) is one of the very few protocols that must be permitted to leave virtually every enterprise network, because name resolution is a precondition for nearly all other connectivity. This universal reachability makes DNS an attractive covert channel: an adversary can encode arbitrary binary payload into sequences of subdomain labels beneath a domain under their control, and the recursive resolver dutifully forwards that encoded payload towards the malicious authoritative server [2]. DNS tunneling is therefore used both to exfiltrate sensitive data and to maintain command-and-control connectivity inside traffic that is, at the packet level, indistinguishable from ordinary name resolution [13]. Because the channel rides on a protocol that perimeter policy almost never blocks, tunnel-based exfiltration bypasses proxy logs, data-loss prevention gateways and most traditional perimeter controls, and ordinary resolver logging records the queried names without revealing the encoded content they carry [5].</w:t>
+        <w:t xml:space="preserve">The Domain Name System (DNS) is one of the very few protocols that must be permitted to leave virtually every enterprise network, because name resolution is a precondition for nearly all other connectivity. This universal reachability makes DNS an attractive covert channel: an adversary can encode arbitrary binary payload into sequences of subdomain labels beneath a domain under their control, and the recursive resolver dutifully forwards that encoded payload towards the malicious authoritative server </w:t>
+      </w:r>
+      <w:hyperlink r:id="rId96">
+        <w:r>
+          <w:rPr>
+            <w:rFonts w:ascii="Times New Roman" w:hAnsi="Times New Roman" w:eastAsia="Times New Roman" w:cs="Times New Roman"/>
+            <w:color w:val="000000"/>
+            <w:u w:val="none"/>
+          </w:rPr>
+          <w:t xml:space="preserve">[1]</w:t>
+        </w:r>
+      </w:hyperlink>
+      <w:r>
+        <w:rPr>
+          <w:rFonts w:ascii="Times New Roman" w:hAnsi="Times New Roman" w:eastAsia="Times New Roman" w:cs="Times New Roman"/>
+          <w:b w:val="0"/>
+          <w:i w:val="0"/>
+          <w:sz w:val="24"/>
+        </w:rPr>
+        <w:t xml:space="preserve">. DNS tunneling is therefore used both to exfiltrate sensitive data and to maintain command-and-control connectivity inside traffic that is, at the packet level, indistinguishable from ordinary name resolution </w:t>
+      </w:r>
+      <w:hyperlink r:id="rId97">
+        <w:r>
+          <w:rPr>
+            <w:rFonts w:ascii="Times New Roman" w:hAnsi="Times New Roman" w:eastAsia="Times New Roman" w:cs="Times New Roman"/>
+            <w:color w:val="000000"/>
+            <w:u w:val="none"/>
+          </w:rPr>
+          <w:t xml:space="preserve">[2]</w:t>
+        </w:r>
+      </w:hyperlink>
+      <w:r>
+        <w:rPr>
+          <w:rFonts w:ascii="Times New Roman" w:hAnsi="Times New Roman" w:eastAsia="Times New Roman" w:cs="Times New Roman"/>
+          <w:b w:val="0"/>
+          <w:i w:val="0"/>
+          <w:sz w:val="24"/>
+        </w:rPr>
+        <w:t xml:space="preserve">. Because the channel rides on a protocol that perimeter policy almost never blocks, tunnel-based exfiltration bypasses proxy logs, data-loss prevention gateways and most traditional perimeter controls, and ordinary resolver logging records the queried names without revealing the encoded content they carry </w:t>
+      </w:r>
+      <w:hyperlink r:id="rId98">
+        <w:r>
+          <w:rPr>
+            <w:rFonts w:ascii="Times New Roman" w:hAnsi="Times New Roman" w:eastAsia="Times New Roman" w:cs="Times New Roman"/>
+            <w:color w:val="000000"/>
+            <w:u w:val="none"/>
+          </w:rPr>
+          <w:t xml:space="preserve">[3]</w:t>
+        </w:r>
+      </w:hyperlink>
+      <w:r>
+        <w:rPr>
+          <w:rFonts w:ascii="Times New Roman" w:hAnsi="Times New Roman" w:eastAsia="Times New Roman" w:cs="Times New Roman"/>
+          <w:b w:val="0"/>
+          <w:i w:val="0"/>
+          <w:sz w:val="24"/>
+        </w:rPr>
+        <w:t xml:space="preserve">.</w:t>
       </w:r>
     </w:p>
     <w:p>
@@ -674,7 +731,121 @@
           <w:i w:val="0"/>
           <w:sz w:val="24"/>
         </w:rPr>
-        <w:t>Recent studies show that machine-learning-based DNS tunneling detectors achieve accuracy levels between 95% and 99% under laboratory conditions by classifying each query independently from statistical features such as payload entropy, domain length, subdomain count and query repetition frequency; the base paper of this work reports 95.33% accuracy, 95.89% precision and 94.59% recall with a 3.95% false-positive rate using exactly this per-query architecture [2], while comparable supervised and hybrid detectors report 88% to 98% detection on conventional tunneling workloads [8], [30]. However, these architectures share a structural weakness: an adversary who splits a document into very small chunks, encrypts them, paces a single query every 65 seconds and randomizes the queried domains produces queries whose individual features lie entirely inside the distribution of benign hash-label hostnames [26]. Under such a slow-drip strategy the per-query evidence for every packet is genuinely benign, and only the accumulated behaviour of the session betrays the tunnel; prior work has confirmed that low-throughput and randomized DNS activity can emulate legitimate traffic well enough to defeat feature-based classification entirely [5], [55].</w:t>
+        <w:t xml:space="preserve">Recent studies show that machine-learning-based DNS tunneling detectors achieve accuracy levels between 95% and 99% under laboratory conditions by classifying each query independently from statistical features such as payload entropy, domain length, subdomain count and query repetition frequency; the base paper of this work reports 95.33% accuracy, 95.89% precision and 94.59% recall with a 3.95% false-positive rate using exactly this per-query architecture </w:t>
+      </w:r>
+      <w:hyperlink r:id="rId96">
+        <w:r>
+          <w:rPr>
+            <w:rFonts w:ascii="Times New Roman" w:hAnsi="Times New Roman" w:eastAsia="Times New Roman" w:cs="Times New Roman"/>
+            <w:color w:val="000000"/>
+            <w:u w:val="none"/>
+          </w:rPr>
+          <w:t xml:space="preserve">[1]</w:t>
+        </w:r>
+      </w:hyperlink>
+      <w:r>
+        <w:rPr>
+          <w:rFonts w:ascii="Times New Roman" w:hAnsi="Times New Roman" w:eastAsia="Times New Roman" w:cs="Times New Roman"/>
+          <w:b w:val="0"/>
+          <w:i w:val="0"/>
+          <w:sz w:val="24"/>
+        </w:rPr>
+        <w:t xml:space="preserve">, while comparable supervised and hybrid detectors report 88% to 98% detection on conventional tunneling workloads </w:t>
+      </w:r>
+      <w:hyperlink r:id="rId99">
+        <w:r>
+          <w:rPr>
+            <w:rFonts w:ascii="Times New Roman" w:hAnsi="Times New Roman" w:eastAsia="Times New Roman" w:cs="Times New Roman"/>
+            <w:color w:val="000000"/>
+            <w:u w:val="none"/>
+          </w:rPr>
+          <w:t xml:space="preserve">[4]</w:t>
+        </w:r>
+      </w:hyperlink>
+      <w:r>
+        <w:rPr>
+          <w:rFonts w:ascii="Times New Roman" w:hAnsi="Times New Roman" w:eastAsia="Times New Roman" w:cs="Times New Roman"/>
+          <w:b w:val="0"/>
+          <w:i w:val="0"/>
+          <w:sz w:val="24"/>
+        </w:rPr>
+        <w:t xml:space="preserve">, </w:t>
+      </w:r>
+      <w:hyperlink r:id="rId100">
+        <w:r>
+          <w:rPr>
+            <w:rFonts w:ascii="Times New Roman" w:hAnsi="Times New Roman" w:eastAsia="Times New Roman" w:cs="Times New Roman"/>
+            <w:color w:val="000000"/>
+            <w:u w:val="none"/>
+          </w:rPr>
+          <w:t xml:space="preserve">[5]</w:t>
+        </w:r>
+      </w:hyperlink>
+      <w:r>
+        <w:rPr>
+          <w:rFonts w:ascii="Times New Roman" w:hAnsi="Times New Roman" w:eastAsia="Times New Roman" w:cs="Times New Roman"/>
+          <w:b w:val="0"/>
+          <w:i w:val="0"/>
+          <w:sz w:val="24"/>
+        </w:rPr>
+        <w:t xml:space="preserve">. However, these architectures share a structural weakness: an adversary who splits a document into very small chunks, encrypts them, paces a single query every 65 seconds and randomizes the queried domains produces queries whose individual features lie entirely inside the distribution of benign hash-label hostnames </w:t>
+      </w:r>
+      <w:hyperlink r:id="rId101">
+        <w:r>
+          <w:rPr>
+            <w:rFonts w:ascii="Times New Roman" w:hAnsi="Times New Roman" w:eastAsia="Times New Roman" w:cs="Times New Roman"/>
+            <w:color w:val="000000"/>
+            <w:u w:val="none"/>
+          </w:rPr>
+          <w:t xml:space="preserve">[6]</w:t>
+        </w:r>
+      </w:hyperlink>
+      <w:r>
+        <w:rPr>
+          <w:rFonts w:ascii="Times New Roman" w:hAnsi="Times New Roman" w:eastAsia="Times New Roman" w:cs="Times New Roman"/>
+          <w:b w:val="0"/>
+          <w:i w:val="0"/>
+          <w:sz w:val="24"/>
+        </w:rPr>
+        <w:t xml:space="preserve">. Under such a slow-drip strategy the per-query evidence for every packet is genuinely benign, and only the accumulated behaviour of the session betrays the tunnel; prior work has confirmed that low-throughput and randomized DNS activity can emulate legitimate traffic well enough to defeat feature-based classification entirely </w:t>
+      </w:r>
+      <w:hyperlink r:id="rId98">
+        <w:r>
+          <w:rPr>
+            <w:rFonts w:ascii="Times New Roman" w:hAnsi="Times New Roman" w:eastAsia="Times New Roman" w:cs="Times New Roman"/>
+            <w:color w:val="000000"/>
+            <w:u w:val="none"/>
+          </w:rPr>
+          <w:t xml:space="preserve">[3]</w:t>
+        </w:r>
+      </w:hyperlink>
+      <w:r>
+        <w:rPr>
+          <w:rFonts w:ascii="Times New Roman" w:hAnsi="Times New Roman" w:eastAsia="Times New Roman" w:cs="Times New Roman"/>
+          <w:b w:val="0"/>
+          <w:i w:val="0"/>
+          <w:sz w:val="24"/>
+        </w:rPr>
+        <w:t xml:space="preserve">, </w:t>
+      </w:r>
+      <w:hyperlink r:id="rId102">
+        <w:r>
+          <w:rPr>
+            <w:rFonts w:ascii="Times New Roman" w:hAnsi="Times New Roman" w:eastAsia="Times New Roman" w:cs="Times New Roman"/>
+            <w:color w:val="000000"/>
+            <w:u w:val="none"/>
+          </w:rPr>
+          <w:t xml:space="preserve">[7]</w:t>
+        </w:r>
+      </w:hyperlink>
+      <w:r>
+        <w:rPr>
+          <w:rFonts w:ascii="Times New Roman" w:hAnsi="Times New Roman" w:eastAsia="Times New Roman" w:cs="Times New Roman"/>
+          <w:b w:val="0"/>
+          <w:i w:val="0"/>
+          <w:sz w:val="24"/>
+        </w:rPr>
+        <w:t xml:space="preserve">.</w:t>
       </w:r>
     </w:p>
     <w:p>
@@ -690,7 +861,83 @@
           <w:i w:val="0"/>
           <w:sz w:val="24"/>
         </w:rPr>
-        <w:t>The proposed ExFilTrap framework has important applications in enterprise network security and in defensive operations more broadly. Continuous statistical profiling of resolver sessions allows an organisation to detect exfiltration attempts that would otherwise require manual forensic review of DNS logs, and automated mitigation shortens the interval between detection and containment from hours to seconds [45]. In regulated environments where DNS must remain open, a detector that reports decoded payload evidence rather than a bare alert materially improves incident response, because the analyst receives the reconstructed content rather than a suspicion [51]. The same session statistics also support security operations at scale: because the stateful layer carries negligible per-query cost, the framework can run as an unattended service on the resolver host or on a commodity monitoring node [44], and the privilege-separated design allows it to operate under two narrowly scoped Linux capabilities rather than as a fully privileged process [4].</w:t>
+        <w:t xml:space="preserve">The proposed ExFilTrap framework has important applications in enterprise network security and in defensive operations more broadly. Continuous statistical profiling of resolver sessions allows an organisation to detect exfiltration attempts that would otherwise require manual forensic review of DNS logs, and automated mitigation shortens the interval between detection and containment from hours to seconds </w:t>
+      </w:r>
+      <w:hyperlink r:id="rId103">
+        <w:r>
+          <w:rPr>
+            <w:rFonts w:ascii="Times New Roman" w:hAnsi="Times New Roman" w:eastAsia="Times New Roman" w:cs="Times New Roman"/>
+            <w:color w:val="000000"/>
+            <w:u w:val="none"/>
+          </w:rPr>
+          <w:t xml:space="preserve">[8]</w:t>
+        </w:r>
+      </w:hyperlink>
+      <w:r>
+        <w:rPr>
+          <w:rFonts w:ascii="Times New Roman" w:hAnsi="Times New Roman" w:eastAsia="Times New Roman" w:cs="Times New Roman"/>
+          <w:b w:val="0"/>
+          <w:i w:val="0"/>
+          <w:sz w:val="24"/>
+        </w:rPr>
+        <w:t xml:space="preserve">. In regulated environments where DNS must remain open, a detector that reports decoded payload evidence rather than a bare alert materially improves incident response, because the analyst receives the reconstructed content rather than a suspicion </w:t>
+      </w:r>
+      <w:hyperlink r:id="rId104">
+        <w:r>
+          <w:rPr>
+            <w:rFonts w:ascii="Times New Roman" w:hAnsi="Times New Roman" w:eastAsia="Times New Roman" w:cs="Times New Roman"/>
+            <w:color w:val="000000"/>
+            <w:u w:val="none"/>
+          </w:rPr>
+          <w:t xml:space="preserve">[9]</w:t>
+        </w:r>
+      </w:hyperlink>
+      <w:r>
+        <w:rPr>
+          <w:rFonts w:ascii="Times New Roman" w:hAnsi="Times New Roman" w:eastAsia="Times New Roman" w:cs="Times New Roman"/>
+          <w:b w:val="0"/>
+          <w:i w:val="0"/>
+          <w:sz w:val="24"/>
+        </w:rPr>
+        <w:t xml:space="preserve">. The same session statistics also support security operations at scale: because the stateful layer carries negligible per-query cost, the framework can run as an unattended service on the resolver host or on a commodity monitoring node </w:t>
+      </w:r>
+      <w:hyperlink r:id="rId102">
+        <w:r>
+          <w:rPr>
+            <w:rFonts w:ascii="Times New Roman" w:hAnsi="Times New Roman" w:eastAsia="Times New Roman" w:cs="Times New Roman"/>
+            <w:color w:val="000000"/>
+            <w:u w:val="none"/>
+          </w:rPr>
+          <w:t xml:space="preserve">[10]</w:t>
+        </w:r>
+      </w:hyperlink>
+      <w:r>
+        <w:rPr>
+          <w:rFonts w:ascii="Times New Roman" w:hAnsi="Times New Roman" w:eastAsia="Times New Roman" w:cs="Times New Roman"/>
+          <w:b w:val="0"/>
+          <w:i w:val="0"/>
+          <w:sz w:val="24"/>
+        </w:rPr>
+        <w:t xml:space="preserve">, and the privilege-separated design allows it to operate under two narrowly scoped Linux capabilities rather than as a fully privileged process </w:t>
+      </w:r>
+      <w:hyperlink r:id="rId105">
+        <w:r>
+          <w:rPr>
+            <w:rFonts w:ascii="Times New Roman" w:hAnsi="Times New Roman" w:eastAsia="Times New Roman" w:cs="Times New Roman"/>
+            <w:color w:val="000000"/>
+            <w:u w:val="none"/>
+          </w:rPr>
+          <w:t xml:space="preserve">[11]</w:t>
+        </w:r>
+      </w:hyperlink>
+      <w:r>
+        <w:rPr>
+          <w:rFonts w:ascii="Times New Roman" w:hAnsi="Times New Roman" w:eastAsia="Times New Roman" w:cs="Times New Roman"/>
+          <w:b w:val="0"/>
+          <w:i w:val="0"/>
+          <w:sz w:val="24"/>
+        </w:rPr>
+        <w:t xml:space="preserve">.</w:t>
       </w:r>
     </w:p>
     <w:p/>
@@ -789,7 +1036,463 @@
           <w:i w:val="0"/>
           <w:sz w:val="24"/>
         </w:rPr>
-        <w:t>The base paper by Sujitha et al. [2] proposed a real-time DNS tunneling detection and prevention framework using statistical feature analysis and a Random Forest classifier over domain length, subdomain count and Shannon entropy, together with automated firewall rules, and reported 95.33% accuracy, 95.89% precision, 94.59% recall and a 3.95% false-positive rate against conventional tunneling workloads; the work is important because it establishes the reference architecture that ExFilTrap adopts and extends, but each query is still classified in isolation. Per-query Random Forest detection of this kind is widely reproduced: ensemble and hybrid variants report 92% to 98% accuracy on standard tunneling datasets [39], [44], and feature-fusion approaches that combine encoding features with behavioural features improve detection further [46]. Entropy-only detectors achieve 85% to 92% detection on high-entropy Base32 tunnels but collapse to below 40% on Hex-encoded or encrypted payloads, because a sixteen-symbol alphabet systematically lowers per-label entropy [16], [20]. Statistical outlier methods over query volumes detect volumetric tunneling at 88% to 93% but cannot observe drip strategies that hold per-window volume near the baseline [28], and dedicated low-throughput studies confirm that exfiltration below a few queries per minute is the hardest regime for volume-based analysis [55], [5]. Deep sequence models, including temporal convolutional networks, hybrid bidirectional transformers and attention-based architectures, report 96% to 98% accuracy [22], [54], [52], yet they require large labelled corpora, retraining pipelines and accelerator resources, and remain vulnerable to the same per-query evasion once label statistics are matched to the benign distribution [26], [70]. Beacon-detection systems in the HTTP domain achieve 90% to 95% precision on periodic command-and-control callbacks [13], and behavioural fingerprinting has been proposed for covert DNS activity in enterprise networks [38]; porting this timing idea to DNS is one of the contributions of the proposed system. Sequential hypothesis testing over network flows has previously been applied to port-scan detection with strong statistical guarantees, but has not been combined with entropy-weighted DNS payload mass. Finally, existing mitigation implementations are typically one-way, so a single false positive becomes a prolonged outage; policy-based enforcement with time-to-live and allowlists is proposed here to make automated response operationally safe [45], [51]. Taken together, the literature establishes that behavioural and ensemble methods improve robustness [48], [15], [25], that explainability and rule-based confirmation are valuable for analyst trust [20], and that scalable deployment on programmable hardware is feasible [44], [72]; the research gap addressed here is the absence of a system that combines a long-window statistical profile of a session with payload confirmation and reversible automated mitigation, evaluated specifically against an adversary built to defeat the underlying per-query classifier.</w:t>
+        <w:t xml:space="preserve">The base paper by Sujitha et al. </w:t>
+      </w:r>
+      <w:hyperlink r:id="rId96">
+        <w:r>
+          <w:rPr>
+            <w:rFonts w:ascii="Times New Roman" w:hAnsi="Times New Roman" w:eastAsia="Times New Roman" w:cs="Times New Roman"/>
+            <w:color w:val="000000"/>
+            <w:u w:val="none"/>
+          </w:rPr>
+          <w:t xml:space="preserve">[1]</w:t>
+        </w:r>
+      </w:hyperlink>
+      <w:r>
+        <w:rPr>
+          <w:rFonts w:ascii="Times New Roman" w:hAnsi="Times New Roman" w:eastAsia="Times New Roman" w:cs="Times New Roman"/>
+          <w:b w:val="0"/>
+          <w:i w:val="0"/>
+          <w:sz w:val="24"/>
+        </w:rPr>
+        <w:t xml:space="preserve"> proposed a real-time DNS tunneling detection and prevention framework using statistical feature analysis and a Random Forest classifier over domain length, subdomain count and Shannon entropy, together with automated firewall rules, and reported 95.33% accuracy, 95.89% precision, 94.59% recall and a 3.95% false-positive rate against conventional tunneling workloads; the work is important because it establishes the reference architecture that ExFilTrap adopts and extends, but each query is still classified in isolation. Per-query Random Forest detection of this kind is widely reproduced: ensemble and hybrid variants report 92% to 98% accuracy on standard tunneling datasets </w:t>
+      </w:r>
+      <w:hyperlink r:id="rId106">
+        <w:r>
+          <w:rPr>
+            <w:rFonts w:ascii="Times New Roman" w:hAnsi="Times New Roman" w:eastAsia="Times New Roman" w:cs="Times New Roman"/>
+            <w:color w:val="000000"/>
+            <w:u w:val="none"/>
+          </w:rPr>
+          <w:t xml:space="preserve">[12]</w:t>
+        </w:r>
+      </w:hyperlink>
+      <w:r>
+        <w:rPr>
+          <w:rFonts w:ascii="Times New Roman" w:hAnsi="Times New Roman" w:eastAsia="Times New Roman" w:cs="Times New Roman"/>
+          <w:b w:val="0"/>
+          <w:i w:val="0"/>
+          <w:sz w:val="24"/>
+        </w:rPr>
+        <w:t xml:space="preserve">, </w:t>
+      </w:r>
+      <w:hyperlink r:id="rId102">
+        <w:r>
+          <w:rPr>
+            <w:rFonts w:ascii="Times New Roman" w:hAnsi="Times New Roman" w:eastAsia="Times New Roman" w:cs="Times New Roman"/>
+            <w:color w:val="000000"/>
+            <w:u w:val="none"/>
+          </w:rPr>
+          <w:t xml:space="preserve">[10]</w:t>
+        </w:r>
+      </w:hyperlink>
+      <w:r>
+        <w:rPr>
+          <w:rFonts w:ascii="Times New Roman" w:hAnsi="Times New Roman" w:eastAsia="Times New Roman" w:cs="Times New Roman"/>
+          <w:b w:val="0"/>
+          <w:i w:val="0"/>
+          <w:sz w:val="24"/>
+        </w:rPr>
+        <w:t xml:space="preserve">, and feature-fusion approaches that combine encoding features with behavioural features improve detection further </w:t>
+      </w:r>
+      <w:hyperlink r:id="rId107">
+        <w:r>
+          <w:rPr>
+            <w:rFonts w:ascii="Times New Roman" w:hAnsi="Times New Roman" w:eastAsia="Times New Roman" w:cs="Times New Roman"/>
+            <w:color w:val="000000"/>
+            <w:u w:val="none"/>
+          </w:rPr>
+          <w:t xml:space="preserve">[13]</w:t>
+        </w:r>
+      </w:hyperlink>
+      <w:r>
+        <w:rPr>
+          <w:rFonts w:ascii="Times New Roman" w:hAnsi="Times New Roman" w:eastAsia="Times New Roman" w:cs="Times New Roman"/>
+          <w:b w:val="0"/>
+          <w:i w:val="0"/>
+          <w:sz w:val="24"/>
+        </w:rPr>
+        <w:t xml:space="preserve">. Entropy-only detectors achieve 85% to 92% detection on high-entropy Base32 tunnels but collapse to below 40% on Hex-encoded or encrypted payloads, because a sixteen-symbol alphabet systematically lowers per-label entropy </w:t>
+      </w:r>
+      <w:hyperlink r:id="rId108">
+        <w:r>
+          <w:rPr>
+            <w:rFonts w:ascii="Times New Roman" w:hAnsi="Times New Roman" w:eastAsia="Times New Roman" w:cs="Times New Roman"/>
+            <w:color w:val="000000"/>
+            <w:u w:val="none"/>
+          </w:rPr>
+          <w:t xml:space="preserve">[14]</w:t>
+        </w:r>
+      </w:hyperlink>
+      <w:r>
+        <w:rPr>
+          <w:rFonts w:ascii="Times New Roman" w:hAnsi="Times New Roman" w:eastAsia="Times New Roman" w:cs="Times New Roman"/>
+          <w:b w:val="0"/>
+          <w:i w:val="0"/>
+          <w:sz w:val="24"/>
+        </w:rPr>
+        <w:t xml:space="preserve">, </w:t>
+      </w:r>
+      <w:hyperlink r:id="rId109">
+        <w:r>
+          <w:rPr>
+            <w:rFonts w:ascii="Times New Roman" w:hAnsi="Times New Roman" w:eastAsia="Times New Roman" w:cs="Times New Roman"/>
+            <w:color w:val="000000"/>
+            <w:u w:val="none"/>
+          </w:rPr>
+          <w:t xml:space="preserve">[15]</w:t>
+        </w:r>
+      </w:hyperlink>
+      <w:r>
+        <w:rPr>
+          <w:rFonts w:ascii="Times New Roman" w:hAnsi="Times New Roman" w:eastAsia="Times New Roman" w:cs="Times New Roman"/>
+          <w:b w:val="0"/>
+          <w:i w:val="0"/>
+          <w:sz w:val="24"/>
+        </w:rPr>
+        <w:t xml:space="preserve">. Statistical outlier methods over query volumes detect volumetric tunneling at 88% to 93% but cannot observe drip strategies that hold per-window volume near the baseline </w:t>
+      </w:r>
+      <w:hyperlink r:id="rId110">
+        <w:r>
+          <w:rPr>
+            <w:rFonts w:ascii="Times New Roman" w:hAnsi="Times New Roman" w:eastAsia="Times New Roman" w:cs="Times New Roman"/>
+            <w:color w:val="000000"/>
+            <w:u w:val="none"/>
+          </w:rPr>
+          <w:t xml:space="preserve">[16]</w:t>
+        </w:r>
+      </w:hyperlink>
+      <w:r>
+        <w:rPr>
+          <w:rFonts w:ascii="Times New Roman" w:hAnsi="Times New Roman" w:eastAsia="Times New Roman" w:cs="Times New Roman"/>
+          <w:b w:val="0"/>
+          <w:i w:val="0"/>
+          <w:sz w:val="24"/>
+        </w:rPr>
+        <w:t xml:space="preserve">, and dedicated low-throughput studies confirm that exfiltration below a few queries per minute is the hardest regime for volume-based analysis </w:t>
+      </w:r>
+      <w:hyperlink r:id="rId102">
+        <w:r>
+          <w:rPr>
+            <w:rFonts w:ascii="Times New Roman" w:hAnsi="Times New Roman" w:eastAsia="Times New Roman" w:cs="Times New Roman"/>
+            <w:color w:val="000000"/>
+            <w:u w:val="none"/>
+          </w:rPr>
+          <w:t xml:space="preserve">[7]</w:t>
+        </w:r>
+      </w:hyperlink>
+      <w:r>
+        <w:rPr>
+          <w:rFonts w:ascii="Times New Roman" w:hAnsi="Times New Roman" w:eastAsia="Times New Roman" w:cs="Times New Roman"/>
+          <w:b w:val="0"/>
+          <w:i w:val="0"/>
+          <w:sz w:val="24"/>
+        </w:rPr>
+        <w:t xml:space="preserve">, </w:t>
+      </w:r>
+      <w:hyperlink r:id="rId98">
+        <w:r>
+          <w:rPr>
+            <w:rFonts w:ascii="Times New Roman" w:hAnsi="Times New Roman" w:eastAsia="Times New Roman" w:cs="Times New Roman"/>
+            <w:color w:val="000000"/>
+            <w:u w:val="none"/>
+          </w:rPr>
+          <w:t xml:space="preserve">[3]</w:t>
+        </w:r>
+      </w:hyperlink>
+      <w:r>
+        <w:rPr>
+          <w:rFonts w:ascii="Times New Roman" w:hAnsi="Times New Roman" w:eastAsia="Times New Roman" w:cs="Times New Roman"/>
+          <w:b w:val="0"/>
+          <w:i w:val="0"/>
+          <w:sz w:val="24"/>
+        </w:rPr>
+        <w:t xml:space="preserve">. Deep sequence models, including temporal convolutional networks, hybrid bidirectional transformers and attention-based architectures, report 96% to 98% accuracy </w:t>
+      </w:r>
+      <w:hyperlink r:id="rId111">
+        <w:r>
+          <w:rPr>
+            <w:rFonts w:ascii="Times New Roman" w:hAnsi="Times New Roman" w:eastAsia="Times New Roman" w:cs="Times New Roman"/>
+            <w:color w:val="000000"/>
+            <w:u w:val="none"/>
+          </w:rPr>
+          <w:t xml:space="preserve">[17]</w:t>
+        </w:r>
+      </w:hyperlink>
+      <w:r>
+        <w:rPr>
+          <w:rFonts w:ascii="Times New Roman" w:hAnsi="Times New Roman" w:eastAsia="Times New Roman" w:cs="Times New Roman"/>
+          <w:b w:val="0"/>
+          <w:i w:val="0"/>
+          <w:sz w:val="24"/>
+        </w:rPr>
+        <w:t xml:space="preserve">, </w:t>
+      </w:r>
+      <w:hyperlink r:id="rId112">
+        <w:r>
+          <w:rPr>
+            <w:rFonts w:ascii="Times New Roman" w:hAnsi="Times New Roman" w:eastAsia="Times New Roman" w:cs="Times New Roman"/>
+            <w:color w:val="000000"/>
+            <w:u w:val="none"/>
+          </w:rPr>
+          <w:t xml:space="preserve">[18]</w:t>
+        </w:r>
+      </w:hyperlink>
+      <w:r>
+        <w:rPr>
+          <w:rFonts w:ascii="Times New Roman" w:hAnsi="Times New Roman" w:eastAsia="Times New Roman" w:cs="Times New Roman"/>
+          <w:b w:val="0"/>
+          <w:i w:val="0"/>
+          <w:sz w:val="24"/>
+        </w:rPr>
+        <w:t xml:space="preserve">, </w:t>
+      </w:r>
+      <w:hyperlink r:id="rId113">
+        <w:r>
+          <w:rPr>
+            <w:rFonts w:ascii="Times New Roman" w:hAnsi="Times New Roman" w:eastAsia="Times New Roman" w:cs="Times New Roman"/>
+            <w:color w:val="000000"/>
+            <w:u w:val="none"/>
+          </w:rPr>
+          <w:t xml:space="preserve">[19]</w:t>
+        </w:r>
+      </w:hyperlink>
+      <w:r>
+        <w:rPr>
+          <w:rFonts w:ascii="Times New Roman" w:hAnsi="Times New Roman" w:eastAsia="Times New Roman" w:cs="Times New Roman"/>
+          <w:b w:val="0"/>
+          <w:i w:val="0"/>
+          <w:sz w:val="24"/>
+        </w:rPr>
+        <w:t xml:space="preserve">, yet they require large labelled corpora, retraining pipelines and accelerator resources, and remain vulnerable to the same per-query evasion once label statistics are matched to the benign distribution </w:t>
+      </w:r>
+      <w:hyperlink r:id="rId101">
+        <w:r>
+          <w:rPr>
+            <w:rFonts w:ascii="Times New Roman" w:hAnsi="Times New Roman" w:eastAsia="Times New Roman" w:cs="Times New Roman"/>
+            <w:color w:val="000000"/>
+            <w:u w:val="none"/>
+          </w:rPr>
+          <w:t xml:space="preserve">[6]</w:t>
+        </w:r>
+      </w:hyperlink>
+      <w:r>
+        <w:rPr>
+          <w:rFonts w:ascii="Times New Roman" w:hAnsi="Times New Roman" w:eastAsia="Times New Roman" w:cs="Times New Roman"/>
+          <w:b w:val="0"/>
+          <w:i w:val="0"/>
+          <w:sz w:val="24"/>
+        </w:rPr>
+        <w:t xml:space="preserve">, </w:t>
+      </w:r>
+      <w:hyperlink r:id="rId114">
+        <w:r>
+          <w:rPr>
+            <w:rFonts w:ascii="Times New Roman" w:hAnsi="Times New Roman" w:eastAsia="Times New Roman" w:cs="Times New Roman"/>
+            <w:color w:val="000000"/>
+            <w:u w:val="none"/>
+          </w:rPr>
+          <w:t xml:space="preserve">[20]</w:t>
+        </w:r>
+      </w:hyperlink>
+      <w:r>
+        <w:rPr>
+          <w:rFonts w:ascii="Times New Roman" w:hAnsi="Times New Roman" w:eastAsia="Times New Roman" w:cs="Times New Roman"/>
+          <w:b w:val="0"/>
+          <w:i w:val="0"/>
+          <w:sz w:val="24"/>
+        </w:rPr>
+        <w:t xml:space="preserve">. Beacon-detection systems in the HTTP domain achieve 90% to 95% precision on periodic command-and-control callbacks </w:t>
+      </w:r>
+      <w:hyperlink r:id="rId97">
+        <w:r>
+          <w:rPr>
+            <w:rFonts w:ascii="Times New Roman" w:hAnsi="Times New Roman" w:eastAsia="Times New Roman" w:cs="Times New Roman"/>
+            <w:color w:val="000000"/>
+            <w:u w:val="none"/>
+          </w:rPr>
+          <w:t xml:space="preserve">[2]</w:t>
+        </w:r>
+      </w:hyperlink>
+      <w:r>
+        <w:rPr>
+          <w:rFonts w:ascii="Times New Roman" w:hAnsi="Times New Roman" w:eastAsia="Times New Roman" w:cs="Times New Roman"/>
+          <w:b w:val="0"/>
+          <w:i w:val="0"/>
+          <w:sz w:val="24"/>
+        </w:rPr>
+        <w:t xml:space="preserve">, and behavioural fingerprinting has been proposed for covert DNS activity in enterprise networks </w:t>
+      </w:r>
+      <w:hyperlink r:id="rId115">
+        <w:r>
+          <w:rPr>
+            <w:rFonts w:ascii="Times New Roman" w:hAnsi="Times New Roman" w:eastAsia="Times New Roman" w:cs="Times New Roman"/>
+            <w:color w:val="000000"/>
+            <w:u w:val="none"/>
+          </w:rPr>
+          <w:t xml:space="preserve">[21]</w:t>
+        </w:r>
+      </w:hyperlink>
+      <w:r>
+        <w:rPr>
+          <w:rFonts w:ascii="Times New Roman" w:hAnsi="Times New Roman" w:eastAsia="Times New Roman" w:cs="Times New Roman"/>
+          <w:b w:val="0"/>
+          <w:i w:val="0"/>
+          <w:sz w:val="24"/>
+        </w:rPr>
+        <w:t xml:space="preserve">; porting this timing idea to DNS is one of the contributions of the proposed system. Sequential hypothesis testing over network flows has previously been applied to port-scan detection with strong statistical guarantees, but has not been combined with entropy-weighted DNS payload mass. Finally, existing mitigation implementations are typically one-way, so a single false positive becomes a prolonged outage; policy-based enforcement with time-to-live and allowlists is proposed here to make automated response operationally safe </w:t>
+      </w:r>
+      <w:hyperlink r:id="rId103">
+        <w:r>
+          <w:rPr>
+            <w:rFonts w:ascii="Times New Roman" w:hAnsi="Times New Roman" w:eastAsia="Times New Roman" w:cs="Times New Roman"/>
+            <w:color w:val="000000"/>
+            <w:u w:val="none"/>
+          </w:rPr>
+          <w:t xml:space="preserve">[8]</w:t>
+        </w:r>
+      </w:hyperlink>
+      <w:r>
+        <w:rPr>
+          <w:rFonts w:ascii="Times New Roman" w:hAnsi="Times New Roman" w:eastAsia="Times New Roman" w:cs="Times New Roman"/>
+          <w:b w:val="0"/>
+          <w:i w:val="0"/>
+          <w:sz w:val="24"/>
+        </w:rPr>
+        <w:t xml:space="preserve">, </w:t>
+      </w:r>
+      <w:hyperlink r:id="rId104">
+        <w:r>
+          <w:rPr>
+            <w:rFonts w:ascii="Times New Roman" w:hAnsi="Times New Roman" w:eastAsia="Times New Roman" w:cs="Times New Roman"/>
+            <w:color w:val="000000"/>
+            <w:u w:val="none"/>
+          </w:rPr>
+          <w:t xml:space="preserve">[9]</w:t>
+        </w:r>
+      </w:hyperlink>
+      <w:r>
+        <w:rPr>
+          <w:rFonts w:ascii="Times New Roman" w:hAnsi="Times New Roman" w:eastAsia="Times New Roman" w:cs="Times New Roman"/>
+          <w:b w:val="0"/>
+          <w:i w:val="0"/>
+          <w:sz w:val="24"/>
+        </w:rPr>
+        <w:t xml:space="preserve">. Taken together, the literature establishes that behavioural and ensemble methods improve robustness </w:t>
+      </w:r>
+      <w:hyperlink r:id="rId116">
+        <w:r>
+          <w:rPr>
+            <w:rFonts w:ascii="Times New Roman" w:hAnsi="Times New Roman" w:eastAsia="Times New Roman" w:cs="Times New Roman"/>
+            <w:color w:val="000000"/>
+            <w:u w:val="none"/>
+          </w:rPr>
+          <w:t xml:space="preserve">[22]</w:t>
+        </w:r>
+      </w:hyperlink>
+      <w:r>
+        <w:rPr>
+          <w:rFonts w:ascii="Times New Roman" w:hAnsi="Times New Roman" w:eastAsia="Times New Roman" w:cs="Times New Roman"/>
+          <w:b w:val="0"/>
+          <w:i w:val="0"/>
+          <w:sz w:val="24"/>
+        </w:rPr>
+        <w:t xml:space="preserve">, </w:t>
+      </w:r>
+      <w:hyperlink r:id="rId117">
+        <w:r>
+          <w:rPr>
+            <w:rFonts w:ascii="Times New Roman" w:hAnsi="Times New Roman" w:eastAsia="Times New Roman" w:cs="Times New Roman"/>
+            <w:color w:val="000000"/>
+            <w:u w:val="none"/>
+          </w:rPr>
+          <w:t xml:space="preserve">[23]</w:t>
+        </w:r>
+      </w:hyperlink>
+      <w:r>
+        <w:rPr>
+          <w:rFonts w:ascii="Times New Roman" w:hAnsi="Times New Roman" w:eastAsia="Times New Roman" w:cs="Times New Roman"/>
+          <w:b w:val="0"/>
+          <w:i w:val="0"/>
+          <w:sz w:val="24"/>
+        </w:rPr>
+        <w:t xml:space="preserve">, </w:t>
+      </w:r>
+      <w:hyperlink r:id="rId118">
+        <w:r>
+          <w:rPr>
+            <w:rFonts w:ascii="Times New Roman" w:hAnsi="Times New Roman" w:eastAsia="Times New Roman" w:cs="Times New Roman"/>
+            <w:color w:val="000000"/>
+            <w:u w:val="none"/>
+          </w:rPr>
+          <w:t xml:space="preserve">[24]</w:t>
+        </w:r>
+      </w:hyperlink>
+      <w:r>
+        <w:rPr>
+          <w:rFonts w:ascii="Times New Roman" w:hAnsi="Times New Roman" w:eastAsia="Times New Roman" w:cs="Times New Roman"/>
+          <w:b w:val="0"/>
+          <w:i w:val="0"/>
+          <w:sz w:val="24"/>
+        </w:rPr>
+        <w:t xml:space="preserve">, that explainability and rule-based confirmation are valuable for analyst trust </w:t>
+      </w:r>
+      <w:hyperlink r:id="rId109">
+        <w:r>
+          <w:rPr>
+            <w:rFonts w:ascii="Times New Roman" w:hAnsi="Times New Roman" w:eastAsia="Times New Roman" w:cs="Times New Roman"/>
+            <w:color w:val="000000"/>
+            <w:u w:val="none"/>
+          </w:rPr>
+          <w:t xml:space="preserve">[15]</w:t>
+        </w:r>
+      </w:hyperlink>
+      <w:r>
+        <w:rPr>
+          <w:rFonts w:ascii="Times New Roman" w:hAnsi="Times New Roman" w:eastAsia="Times New Roman" w:cs="Times New Roman"/>
+          <w:b w:val="0"/>
+          <w:i w:val="0"/>
+          <w:sz w:val="24"/>
+        </w:rPr>
+        <w:t xml:space="preserve">, and that scalable deployment on programmable hardware is feasible </w:t>
+      </w:r>
+      <w:hyperlink r:id="rId102">
+        <w:r>
+          <w:rPr>
+            <w:rFonts w:ascii="Times New Roman" w:hAnsi="Times New Roman" w:eastAsia="Times New Roman" w:cs="Times New Roman"/>
+            <w:color w:val="000000"/>
+            <w:u w:val="none"/>
+          </w:rPr>
+          <w:t xml:space="preserve">[10]</w:t>
+        </w:r>
+      </w:hyperlink>
+      <w:r>
+        <w:rPr>
+          <w:rFonts w:ascii="Times New Roman" w:hAnsi="Times New Roman" w:eastAsia="Times New Roman" w:cs="Times New Roman"/>
+          <w:b w:val="0"/>
+          <w:i w:val="0"/>
+          <w:sz w:val="24"/>
+        </w:rPr>
+        <w:t xml:space="preserve">, </w:t>
+      </w:r>
+      <w:hyperlink r:id="rId119">
+        <w:r>
+          <w:rPr>
+            <w:rFonts w:ascii="Times New Roman" w:hAnsi="Times New Roman" w:eastAsia="Times New Roman" w:cs="Times New Roman"/>
+            <w:color w:val="000000"/>
+            <w:u w:val="none"/>
+          </w:rPr>
+          <w:t xml:space="preserve">[25]</w:t>
+        </w:r>
+      </w:hyperlink>
+      <w:r>
+        <w:rPr>
+          <w:rFonts w:ascii="Times New Roman" w:hAnsi="Times New Roman" w:eastAsia="Times New Roman" w:cs="Times New Roman"/>
+          <w:b w:val="0"/>
+          <w:i w:val="0"/>
+          <w:sz w:val="24"/>
+        </w:rPr>
+        <w:t xml:space="preserve">; the research gap addressed here is the absence of a system that combines a long-window statistical profile of a session with payload confirmation and reversible automated mitigation, evaluated specifically against an adversary built to defeat the underlying per-query classifier.</w:t>
       </w:r>
     </w:p>
     <w:p/>
@@ -823,7 +1526,45 @@
           <w:i w:val="0"/>
           <w:sz w:val="24"/>
         </w:rPr>
-        <w:t>Most current DNS tunneling detectors classify each query in isolation, evaluate on loud tunneling workloads and stop at detection without closing the response loop [2], [30]. They overlook the slow-drip adversary whose every individual query is statistically benign, and they rarely report the operational behaviour — resource footprint, false-positive handling and deployment privilege model — that determines whether a detector can run as a daily-driver network service. This study aims to close both gaps by placing a stateful, statistically grounded detection layer above the per-query classifier, by evaluating it against a stealth-hardened adversary that per-query features cannot separate from benign traffic, and by validating the complete detection-to-response loop with automated, reversible mitigation on real kernel network traffic. The proposed method is compared with the existing approach on identical traffic and identical random seeds, and the comparison is expressed through accuracy, precision, recall, F1-score, false-positive rate, detection latency and sustained throughput so that both detection quality and operational cost are quantified rather than asserted.</w:t>
+        <w:t xml:space="preserve">Most current DNS tunneling detectors classify each query in isolation, evaluate on loud tunneling workloads and stop at detection without closing the response loop </w:t>
+      </w:r>
+      <w:hyperlink r:id="rId96">
+        <w:r>
+          <w:rPr>
+            <w:rFonts w:ascii="Times New Roman" w:hAnsi="Times New Roman" w:eastAsia="Times New Roman" w:cs="Times New Roman"/>
+            <w:color w:val="000000"/>
+            <w:u w:val="none"/>
+          </w:rPr>
+          <w:t xml:space="preserve">[1]</w:t>
+        </w:r>
+      </w:hyperlink>
+      <w:r>
+        <w:rPr>
+          <w:rFonts w:ascii="Times New Roman" w:hAnsi="Times New Roman" w:eastAsia="Times New Roman" w:cs="Times New Roman"/>
+          <w:b w:val="0"/>
+          <w:i w:val="0"/>
+          <w:sz w:val="24"/>
+        </w:rPr>
+        <w:t xml:space="preserve">, </w:t>
+      </w:r>
+      <w:hyperlink r:id="rId100">
+        <w:r>
+          <w:rPr>
+            <w:rFonts w:ascii="Times New Roman" w:hAnsi="Times New Roman" w:eastAsia="Times New Roman" w:cs="Times New Roman"/>
+            <w:color w:val="000000"/>
+            <w:u w:val="none"/>
+          </w:rPr>
+          <w:t xml:space="preserve">[5]</w:t>
+        </w:r>
+      </w:hyperlink>
+      <w:r>
+        <w:rPr>
+          <w:rFonts w:ascii="Times New Roman" w:hAnsi="Times New Roman" w:eastAsia="Times New Roman" w:cs="Times New Roman"/>
+          <w:b w:val="0"/>
+          <w:i w:val="0"/>
+          <w:sz w:val="24"/>
+        </w:rPr>
+        <w:t xml:space="preserve">. They overlook the slow-drip adversary whose every individual query is statistically benign, and they rarely report the operational behaviour — resource footprint, false-positive handling and deployment privilege model — that determines whether a detector can run as a daily-driver network service. This study aims to close both gaps by placing a stateful, statistically grounded detection layer above the per-query classifier, by evaluating it against a stealth-hardened adversary that per-query features cannot separate from benign traffic, and by validating the complete detection-to-response loop with automated, reversible mitigation on real kernel network traffic. The proposed method is compared with the existing approach on identical traffic and identical random seeds, and the comparison is expressed through accuracy, precision, recall, F1-score, false-positive rate, detection latency and sustained throughput so that both detection quality and operational cost are quantified rather than asserted.</w:t>
       </w:r>
     </w:p>
     <w:p/>
@@ -879,7 +1620,26 @@
           <w:i w:val="0"/>
           <w:sz w:val="24"/>
         </w:rPr>
-        <w:t>This experiment was conducted on an Ubuntu Linux host (kernel 6.x, Python 3.12) in which an isolated two-node laboratory was constructed from kernel network namespaces — nsA (10.99.0.1) acting as the monitored gateway running the detection service, and nsB (10.99.0.2–10.99.0.14) acting as six distinct client identities generating benign and attack traffic over a virtual Ethernet pair. The detection service captures UDP/53 traffic with libpcap (scapy) behind a Berkeley Packet Filter on the gateway interface, and every query is parsed, featured and scored by the pipeline; all firewall actions are applied inside the isolated namespace only, and the host firewall is verified byte-identical before and after every run so that the laboratory can never damage the machine it runs on. The benign traffic corpus is the top 50,000 real-world domains from the Tranco top-sites sample, sent as jittered Poisson arrivals at one query per second, so that the detector learns from realistic resolver behaviour rather than synthetic name lists [1]. Attack traffic is generated by the project's own client, which implements both a loud fast tunnel and a stealth-hardened slow drip that encrypts its payload, sizes its hex labels into the benign hash-hostname band, paces one query every 65 seconds and uses corpus-length domain-generation names. The classifier was trained on 20,000 benign and 18,880 malicious rows and achieved a holdout accuracy of 98.23%, recall of 98.51% and a false-positive rate of 2.04%.</w:t>
+        <w:t xml:space="preserve">This experiment was conducted on an Ubuntu Linux host (kernel 6.x, Python 3.12) in which an isolated two-node laboratory was constructed from kernel network namespaces — nsA (10.99.0.1) acting as the monitored gateway running the detection service, and nsB (10.99.0.2–10.99.0.14) acting as six distinct client identities generating benign and attack traffic over a virtual Ethernet pair. The detection service captures UDP/53 traffic with libpcap (scapy) behind a Berkeley Packet Filter on the gateway interface, and every query is parsed, featured and scored by the pipeline; all firewall actions are applied inside the isolated namespace only, and the host firewall is verified byte-identical before and after every run so that the laboratory can never damage the machine it runs on. The benign traffic corpus is the top 50,000 real-world domains from the Tranco top-sites sample, sent as jittered Poisson arrivals at one query per second, so that the detector learns from realistic resolver behaviour rather than synthetic name lists </w:t>
+      </w:r>
+      <w:hyperlink r:id="rId120">
+        <w:r>
+          <w:rPr>
+            <w:rFonts w:ascii="Times New Roman" w:hAnsi="Times New Roman" w:eastAsia="Times New Roman" w:cs="Times New Roman"/>
+            <w:color w:val="000000"/>
+            <w:u w:val="none"/>
+          </w:rPr>
+          <w:t xml:space="preserve">[26]</w:t>
+        </w:r>
+      </w:hyperlink>
+      <w:r>
+        <w:rPr>
+          <w:rFonts w:ascii="Times New Roman" w:hAnsi="Times New Roman" w:eastAsia="Times New Roman" w:cs="Times New Roman"/>
+          <w:b w:val="0"/>
+          <w:i w:val="0"/>
+          <w:sz w:val="24"/>
+        </w:rPr>
+        <w:t xml:space="preserve">. Attack traffic is generated by the project's own client, which implements both a loud fast tunnel and a stealth-hardened slow drip that encrypts its payload, sizes its hex labels into the benign hash-hostname band, paces one query every 65 seconds and uses corpus-length domain-generation names. The classifier was trained on 20,000 benign and 18,880 malicious rows and achieved a holdout accuracy of 98.23%, recall of 98.51% and a false-positive rate of 2.04%.</w:t>
       </w:r>
     </w:p>
     <w:p/>
@@ -930,7 +1690,64 @@
           <w:i w:val="0"/>
           <w:sz w:val="24"/>
         </w:rPr>
-        <w:t>The existing method is a per-query Random Forest detector in the style of the base paper [2]: each DNS query is independently classified as malicious or legitimate from six features — Shannon entropy of the leftmost label, full domain length, subdomain count, query frequency for the base domain inside a 60-second window, n-gram deviation and digit ratio — using a 100-tree Random Forest. Flagged queries raise risk levels and trigger firewall rules, and no information whatsoever is carried across queries. While it performs well on loud tunneling, the absence of any session-level state restricts its reliability against adversaries that keep each individual query benign, and the resulting recall collapse is quantified in the results. This configuration is reproduced from the feature set and evaluation protocol described in the reference literature [2], [8].</w:t>
+        <w:t xml:space="preserve">The existing method is a per-query Random Forest detector in the style of the base paper </w:t>
+      </w:r>
+      <w:hyperlink r:id="rId96">
+        <w:r>
+          <w:rPr>
+            <w:rFonts w:ascii="Times New Roman" w:hAnsi="Times New Roman" w:eastAsia="Times New Roman" w:cs="Times New Roman"/>
+            <w:color w:val="000000"/>
+            <w:u w:val="none"/>
+          </w:rPr>
+          <w:t xml:space="preserve">[1]</w:t>
+        </w:r>
+      </w:hyperlink>
+      <w:r>
+        <w:rPr>
+          <w:rFonts w:ascii="Times New Roman" w:hAnsi="Times New Roman" w:eastAsia="Times New Roman" w:cs="Times New Roman"/>
+          <w:b w:val="0"/>
+          <w:i w:val="0"/>
+          <w:sz w:val="24"/>
+        </w:rPr>
+        <w:t xml:space="preserve">: each DNS query is independently classified as malicious or legitimate from six features — Shannon entropy of the leftmost label, full domain length, subdomain count, query frequency for the base domain inside a 60-second window, n-gram deviation and digit ratio — using a 100-tree Random Forest. Flagged queries raise risk levels and trigger firewall rules, and no information whatsoever is carried across queries. While it performs well on loud tunneling, the absence of any session-level state restricts its reliability against adversaries that keep each individual query benign, and the resulting recall collapse is quantified in the results. This configuration is reproduced from the feature set and evaluation protocol described in the reference literature </w:t>
+      </w:r>
+      <w:hyperlink r:id="rId96">
+        <w:r>
+          <w:rPr>
+            <w:rFonts w:ascii="Times New Roman" w:hAnsi="Times New Roman" w:eastAsia="Times New Roman" w:cs="Times New Roman"/>
+            <w:color w:val="000000"/>
+            <w:u w:val="none"/>
+          </w:rPr>
+          <w:t xml:space="preserve">[1]</w:t>
+        </w:r>
+      </w:hyperlink>
+      <w:r>
+        <w:rPr>
+          <w:rFonts w:ascii="Times New Roman" w:hAnsi="Times New Roman" w:eastAsia="Times New Roman" w:cs="Times New Roman"/>
+          <w:b w:val="0"/>
+          <w:i w:val="0"/>
+          <w:sz w:val="24"/>
+        </w:rPr>
+        <w:t xml:space="preserve">, </w:t>
+      </w:r>
+      <w:hyperlink r:id="rId99">
+        <w:r>
+          <w:rPr>
+            <w:rFonts w:ascii="Times New Roman" w:hAnsi="Times New Roman" w:eastAsia="Times New Roman" w:cs="Times New Roman"/>
+            <w:color w:val="000000"/>
+            <w:u w:val="none"/>
+          </w:rPr>
+          <w:t xml:space="preserve">[4]</w:t>
+        </w:r>
+      </w:hyperlink>
+      <w:r>
+        <w:rPr>
+          <w:rFonts w:ascii="Times New Roman" w:hAnsi="Times New Roman" w:eastAsia="Times New Roman" w:cs="Times New Roman"/>
+          <w:b w:val="0"/>
+          <w:i w:val="0"/>
+          <w:sz w:val="24"/>
+        </w:rPr>
+        <w:t xml:space="preserve">.</w:t>
       </w:r>
     </w:p>
     <w:p/>
@@ -1070,7 +1887,26 @@
           <w:i w:val="0"/>
           <w:sz w:val="24"/>
         </w:rPr>
-        <w:t>The statistical analysis was carried out using Python 3.12 with the NumPy and SciPy statistical libraries, which provide the same descriptive and inferential procedures used in dedicated statistical packages [3]. The recall of slow-drip detection was considered in this research, with the stateful session layer (Group 2) treated as the independent variable and slow-drip recall as the dependent variable, while accuracy, precision, F1-score and false-positive rate were recorded as supporting performance measures. Five randomized trials were executed with distinct traffic and payload seeds, and per-trial detection performance was computed from the confusion counts as Accuracy = (TP + TN) / (TP + TN + FP + FN), Precision = TP / (TP + FP), Recall = TP / (TP + FN) and FPR = FP / (FP + TN). The per-trial recalls of the two groups were compared with a paired samples t-test, and all population statistics are reported as mean ± standard deviation.</w:t>
+        <w:t xml:space="preserve">The statistical analysis was carried out using Python 3.12 with the NumPy and SciPy statistical libraries, which provide the same descriptive and inferential procedures used in dedicated statistical packages </w:t>
+      </w:r>
+      <w:hyperlink r:id="rId121">
+        <w:r>
+          <w:rPr>
+            <w:rFonts w:ascii="Times New Roman" w:hAnsi="Times New Roman" w:eastAsia="Times New Roman" w:cs="Times New Roman"/>
+            <w:color w:val="000000"/>
+            <w:u w:val="none"/>
+          </w:rPr>
+          <w:t xml:space="preserve">[27]</w:t>
+        </w:r>
+      </w:hyperlink>
+      <w:r>
+        <w:rPr>
+          <w:rFonts w:ascii="Times New Roman" w:hAnsi="Times New Roman" w:eastAsia="Times New Roman" w:cs="Times New Roman"/>
+          <w:b w:val="0"/>
+          <w:i w:val="0"/>
+          <w:sz w:val="24"/>
+        </w:rPr>
+        <w:t xml:space="preserve">. The recall of slow-drip detection was considered in this research, with the stateful session layer (Group 2) treated as the independent variable and slow-drip recall as the dependent variable, while accuracy, precision, F1-score and false-positive rate were recorded as supporting performance measures. Five randomized trials were executed with distinct traffic and payload seeds, and per-trial detection performance was computed from the confusion counts as Accuracy = (TP + TN) / (TP + TN + FP + FN), Precision = TP / (TP + FP), Recall = TP / (TP + FN) and FPR = FP / (FP + TN). The per-trial recalls of the two groups were compared with a paired samples t-test, and all population statistics are reported as mean ± standard deviation.</w:t>
       </w:r>
     </w:p>
     <w:p/>
@@ -1305,7 +2141,273 @@
           <w:i w:val="0"/>
           <w:sz w:val="24"/>
         </w:rPr>
-        <w:t>The findings agree with the results of earlier studies cautioning against per-packet classification of covert channels: entropy-only detectors drop below 40% detection on Hex or encrypted encodings [16], [20], volume-based statistical methods cannot see drip-paced sessions [28], [55], and per-query deep sequence models remain exploitable when the adversary matches label statistics to the benign distribution [70], [26]. Timing-based beacon detection has been reported at 90% to 95% precision in the HTTP domain [13], and the DNS beacon detector proposed here behaves consistently: it fired on every machine-periodic session in both the evaluation and the live deployment while never flagging Poisson-arriving benign traffic, and a minimum-interval guard of five seconds correctly exempts fast keepalive-style pollers [38]. The sequential z-test formulation inherits the statistical guarantees of sequential analysis while remaining computationally trivial, requiring a single subtraction and division per query. The improvement reported here is also consistent with independent work showing that behavioural analytics combined with anomaly scoring improves detection over single-stage classifiers [48], [46], and with ensemble approaches that report better robustness when payload content is unavailable [15], [25]. However, some limitations remain. Precision on the slow-drip profile averages 71.65%, because a small fraction of benign hash-label queries shares the entropy band that the tunnel must occupy and is escalated alongside the true positives; the reported mitigations of allowlists and time-to-live based unbanning reduce the operational impact but do not eliminate the underlying statistical overlap. The payload decoder confirms only 1.82% of slow-drip queries by design, because the stealth adversary encrypts its payload and ciphertext is neither printable nor signature-bearing, so confirmation-based evidence remains meaningful only against plaintext tunnels, where the fast profile confirms 71.43% of queries. The evaluation corpus, while drawn from 50,000 real domains, is still a laboratory simulation, and a drip arriving with literally zero benign background would build its own baseline and evade the z-test, although the beacon detector would still fire on its timing; real networks always carry benign DNS, and the evaluation mixes it in deliberately [72], [44].</w:t>
+        <w:t xml:space="preserve">The findings agree with the results of earlier studies cautioning against per-packet classification of covert channels: entropy-only detectors drop below 40% detection on Hex or encrypted encodings </w:t>
+      </w:r>
+      <w:hyperlink r:id="rId108">
+        <w:r>
+          <w:rPr>
+            <w:rFonts w:ascii="Times New Roman" w:hAnsi="Times New Roman" w:eastAsia="Times New Roman" w:cs="Times New Roman"/>
+            <w:color w:val="000000"/>
+            <w:u w:val="none"/>
+          </w:rPr>
+          <w:t xml:space="preserve">[14]</w:t>
+        </w:r>
+      </w:hyperlink>
+      <w:r>
+        <w:rPr>
+          <w:rFonts w:ascii="Times New Roman" w:hAnsi="Times New Roman" w:eastAsia="Times New Roman" w:cs="Times New Roman"/>
+          <w:b w:val="0"/>
+          <w:i w:val="0"/>
+          <w:sz w:val="24"/>
+        </w:rPr>
+        <w:t xml:space="preserve">, </w:t>
+      </w:r>
+      <w:hyperlink r:id="rId109">
+        <w:r>
+          <w:rPr>
+            <w:rFonts w:ascii="Times New Roman" w:hAnsi="Times New Roman" w:eastAsia="Times New Roman" w:cs="Times New Roman"/>
+            <w:color w:val="000000"/>
+            <w:u w:val="none"/>
+          </w:rPr>
+          <w:t xml:space="preserve">[15]</w:t>
+        </w:r>
+      </w:hyperlink>
+      <w:r>
+        <w:rPr>
+          <w:rFonts w:ascii="Times New Roman" w:hAnsi="Times New Roman" w:eastAsia="Times New Roman" w:cs="Times New Roman"/>
+          <w:b w:val="0"/>
+          <w:i w:val="0"/>
+          <w:sz w:val="24"/>
+        </w:rPr>
+        <w:t xml:space="preserve">, volume-based statistical methods cannot see drip-paced sessions </w:t>
+      </w:r>
+      <w:hyperlink r:id="rId110">
+        <w:r>
+          <w:rPr>
+            <w:rFonts w:ascii="Times New Roman" w:hAnsi="Times New Roman" w:eastAsia="Times New Roman" w:cs="Times New Roman"/>
+            <w:color w:val="000000"/>
+            <w:u w:val="none"/>
+          </w:rPr>
+          <w:t xml:space="preserve">[16]</w:t>
+        </w:r>
+      </w:hyperlink>
+      <w:r>
+        <w:rPr>
+          <w:rFonts w:ascii="Times New Roman" w:hAnsi="Times New Roman" w:eastAsia="Times New Roman" w:cs="Times New Roman"/>
+          <w:b w:val="0"/>
+          <w:i w:val="0"/>
+          <w:sz w:val="24"/>
+        </w:rPr>
+        <w:t xml:space="preserve">, </w:t>
+      </w:r>
+      <w:hyperlink r:id="rId102">
+        <w:r>
+          <w:rPr>
+            <w:rFonts w:ascii="Times New Roman" w:hAnsi="Times New Roman" w:eastAsia="Times New Roman" w:cs="Times New Roman"/>
+            <w:color w:val="000000"/>
+            <w:u w:val="none"/>
+          </w:rPr>
+          <w:t xml:space="preserve">[7]</w:t>
+        </w:r>
+      </w:hyperlink>
+      <w:r>
+        <w:rPr>
+          <w:rFonts w:ascii="Times New Roman" w:hAnsi="Times New Roman" w:eastAsia="Times New Roman" w:cs="Times New Roman"/>
+          <w:b w:val="0"/>
+          <w:i w:val="0"/>
+          <w:sz w:val="24"/>
+        </w:rPr>
+        <w:t xml:space="preserve">, and per-query deep sequence models remain exploitable when the adversary matches label statistics to the benign distribution </w:t>
+      </w:r>
+      <w:hyperlink r:id="rId114">
+        <w:r>
+          <w:rPr>
+            <w:rFonts w:ascii="Times New Roman" w:hAnsi="Times New Roman" w:eastAsia="Times New Roman" w:cs="Times New Roman"/>
+            <w:color w:val="000000"/>
+            <w:u w:val="none"/>
+          </w:rPr>
+          <w:t xml:space="preserve">[20]</w:t>
+        </w:r>
+      </w:hyperlink>
+      <w:r>
+        <w:rPr>
+          <w:rFonts w:ascii="Times New Roman" w:hAnsi="Times New Roman" w:eastAsia="Times New Roman" w:cs="Times New Roman"/>
+          <w:b w:val="0"/>
+          <w:i w:val="0"/>
+          <w:sz w:val="24"/>
+        </w:rPr>
+        <w:t xml:space="preserve">, </w:t>
+      </w:r>
+      <w:hyperlink r:id="rId101">
+        <w:r>
+          <w:rPr>
+            <w:rFonts w:ascii="Times New Roman" w:hAnsi="Times New Roman" w:eastAsia="Times New Roman" w:cs="Times New Roman"/>
+            <w:color w:val="000000"/>
+            <w:u w:val="none"/>
+          </w:rPr>
+          <w:t xml:space="preserve">[6]</w:t>
+        </w:r>
+      </w:hyperlink>
+      <w:r>
+        <w:rPr>
+          <w:rFonts w:ascii="Times New Roman" w:hAnsi="Times New Roman" w:eastAsia="Times New Roman" w:cs="Times New Roman"/>
+          <w:b w:val="0"/>
+          <w:i w:val="0"/>
+          <w:sz w:val="24"/>
+        </w:rPr>
+        <w:t xml:space="preserve">. Timing-based beacon detection has been reported at 90% to 95% precision in the HTTP domain </w:t>
+      </w:r>
+      <w:hyperlink r:id="rId97">
+        <w:r>
+          <w:rPr>
+            <w:rFonts w:ascii="Times New Roman" w:hAnsi="Times New Roman" w:eastAsia="Times New Roman" w:cs="Times New Roman"/>
+            <w:color w:val="000000"/>
+            <w:u w:val="none"/>
+          </w:rPr>
+          <w:t xml:space="preserve">[2]</w:t>
+        </w:r>
+      </w:hyperlink>
+      <w:r>
+        <w:rPr>
+          <w:rFonts w:ascii="Times New Roman" w:hAnsi="Times New Roman" w:eastAsia="Times New Roman" w:cs="Times New Roman"/>
+          <w:b w:val="0"/>
+          <w:i w:val="0"/>
+          <w:sz w:val="24"/>
+        </w:rPr>
+        <w:t xml:space="preserve">, and the DNS beacon detector proposed here behaves consistently: it fired on every machine-periodic session in both the evaluation and the live deployment while never flagging Poisson-arriving benign traffic, and a minimum-interval guard of five seconds correctly exempts fast keepalive-style pollers </w:t>
+      </w:r>
+      <w:hyperlink r:id="rId115">
+        <w:r>
+          <w:rPr>
+            <w:rFonts w:ascii="Times New Roman" w:hAnsi="Times New Roman" w:eastAsia="Times New Roman" w:cs="Times New Roman"/>
+            <w:color w:val="000000"/>
+            <w:u w:val="none"/>
+          </w:rPr>
+          <w:t xml:space="preserve">[21]</w:t>
+        </w:r>
+      </w:hyperlink>
+      <w:r>
+        <w:rPr>
+          <w:rFonts w:ascii="Times New Roman" w:hAnsi="Times New Roman" w:eastAsia="Times New Roman" w:cs="Times New Roman"/>
+          <w:b w:val="0"/>
+          <w:i w:val="0"/>
+          <w:sz w:val="24"/>
+        </w:rPr>
+        <w:t xml:space="preserve">. The sequential z-test formulation inherits the statistical guarantees of sequential analysis while remaining computationally trivial, requiring a single subtraction and division per query. The improvement reported here is also consistent with independent work showing that behavioural analytics combined with anomaly scoring improves detection over single-stage classifiers </w:t>
+      </w:r>
+      <w:hyperlink r:id="rId116">
+        <w:r>
+          <w:rPr>
+            <w:rFonts w:ascii="Times New Roman" w:hAnsi="Times New Roman" w:eastAsia="Times New Roman" w:cs="Times New Roman"/>
+            <w:color w:val="000000"/>
+            <w:u w:val="none"/>
+          </w:rPr>
+          <w:t xml:space="preserve">[22]</w:t>
+        </w:r>
+      </w:hyperlink>
+      <w:r>
+        <w:rPr>
+          <w:rFonts w:ascii="Times New Roman" w:hAnsi="Times New Roman" w:eastAsia="Times New Roman" w:cs="Times New Roman"/>
+          <w:b w:val="0"/>
+          <w:i w:val="0"/>
+          <w:sz w:val="24"/>
+        </w:rPr>
+        <w:t xml:space="preserve">, </w:t>
+      </w:r>
+      <w:hyperlink r:id="rId107">
+        <w:r>
+          <w:rPr>
+            <w:rFonts w:ascii="Times New Roman" w:hAnsi="Times New Roman" w:eastAsia="Times New Roman" w:cs="Times New Roman"/>
+            <w:color w:val="000000"/>
+            <w:u w:val="none"/>
+          </w:rPr>
+          <w:t xml:space="preserve">[13]</w:t>
+        </w:r>
+      </w:hyperlink>
+      <w:r>
+        <w:rPr>
+          <w:rFonts w:ascii="Times New Roman" w:hAnsi="Times New Roman" w:eastAsia="Times New Roman" w:cs="Times New Roman"/>
+          <w:b w:val="0"/>
+          <w:i w:val="0"/>
+          <w:sz w:val="24"/>
+        </w:rPr>
+        <w:t xml:space="preserve">, and with ensemble approaches that report better robustness when payload content is unavailable </w:t>
+      </w:r>
+      <w:hyperlink r:id="rId117">
+        <w:r>
+          <w:rPr>
+            <w:rFonts w:ascii="Times New Roman" w:hAnsi="Times New Roman" w:eastAsia="Times New Roman" w:cs="Times New Roman"/>
+            <w:color w:val="000000"/>
+            <w:u w:val="none"/>
+          </w:rPr>
+          <w:t xml:space="preserve">[23]</w:t>
+        </w:r>
+      </w:hyperlink>
+      <w:r>
+        <w:rPr>
+          <w:rFonts w:ascii="Times New Roman" w:hAnsi="Times New Roman" w:eastAsia="Times New Roman" w:cs="Times New Roman"/>
+          <w:b w:val="0"/>
+          <w:i w:val="0"/>
+          <w:sz w:val="24"/>
+        </w:rPr>
+        <w:t xml:space="preserve">, </w:t>
+      </w:r>
+      <w:hyperlink r:id="rId118">
+        <w:r>
+          <w:rPr>
+            <w:rFonts w:ascii="Times New Roman" w:hAnsi="Times New Roman" w:eastAsia="Times New Roman" w:cs="Times New Roman"/>
+            <w:color w:val="000000"/>
+            <w:u w:val="none"/>
+          </w:rPr>
+          <w:t xml:space="preserve">[24]</w:t>
+        </w:r>
+      </w:hyperlink>
+      <w:r>
+        <w:rPr>
+          <w:rFonts w:ascii="Times New Roman" w:hAnsi="Times New Roman" w:eastAsia="Times New Roman" w:cs="Times New Roman"/>
+          <w:b w:val="0"/>
+          <w:i w:val="0"/>
+          <w:sz w:val="24"/>
+        </w:rPr>
+        <w:t xml:space="preserve">. However, some limitations remain. Precision on the slow-drip profile averages 71.65%, because a small fraction of benign hash-label queries shares the entropy band that the tunnel must occupy and is escalated alongside the true positives; the reported mitigations of allowlists and time-to-live based unbanning reduce the operational impact but do not eliminate the underlying statistical overlap. The payload decoder confirms only 1.82% of slow-drip queries by design, because the stealth adversary encrypts its payload and ciphertext is neither printable nor signature-bearing, so confirmation-based evidence remains meaningful only against plaintext tunnels, where the fast profile confirms 71.43% of queries. The evaluation corpus, while drawn from 50,000 real domains, is still a laboratory simulation, and a drip arriving with literally zero benign background would build its own baseline and evade the z-test, although the beacon detector would still fire on its timing; real networks always carry benign DNS, and the evaluation mixes it in deliberately </w:t>
+      </w:r>
+      <w:hyperlink r:id="rId119">
+        <w:r>
+          <w:rPr>
+            <w:rFonts w:ascii="Times New Roman" w:hAnsi="Times New Roman" w:eastAsia="Times New Roman" w:cs="Times New Roman"/>
+            <w:color w:val="000000"/>
+            <w:u w:val="none"/>
+          </w:rPr>
+          <w:t xml:space="preserve">[25]</w:t>
+        </w:r>
+      </w:hyperlink>
+      <w:r>
+        <w:rPr>
+          <w:rFonts w:ascii="Times New Roman" w:hAnsi="Times New Roman" w:eastAsia="Times New Roman" w:cs="Times New Roman"/>
+          <w:b w:val="0"/>
+          <w:i w:val="0"/>
+          <w:sz w:val="24"/>
+        </w:rPr>
+        <w:t xml:space="preserve">, </w:t>
+      </w:r>
+      <w:hyperlink r:id="rId102">
+        <w:r>
+          <w:rPr>
+            <w:rFonts w:ascii="Times New Roman" w:hAnsi="Times New Roman" w:eastAsia="Times New Roman" w:cs="Times New Roman"/>
+            <w:color w:val="000000"/>
+            <w:u w:val="none"/>
+          </w:rPr>
+          <w:t xml:space="preserve">[10]</w:t>
+        </w:r>
+      </w:hyperlink>
+      <w:r>
+        <w:rPr>
+          <w:rFonts w:ascii="Times New Roman" w:hAnsi="Times New Roman" w:eastAsia="Times New Roman" w:cs="Times New Roman"/>
+          <w:b w:val="0"/>
+          <w:i w:val="0"/>
+          <w:sz w:val="24"/>
+        </w:rPr>
+        <w:t xml:space="preserve">.</w:t>
       </w:r>
     </w:p>
     <w:p/>
@@ -1338,7 +2440,140 @@
           <w:i w:val="0"/>
           <w:sz w:val="24"/>
         </w:rPr>
-        <w:t>Looking ahead, the path is more distinct and hopeful: extending the same session statistics to the response channel so that command-and-control answer traffic is profiled per client [6], [7]; shard-level state merging for enterprise resolver scale so that a detector can serve forwarder farms handling hundreds of thousands of queries per second [44], [72]; adaptive retraining loops that feed confirmed false positives back into the training corpus [29]; and extending coverage to encrypted DNS transport such as DoH and DoT, where payload inspection is impossible and timing and volume behaviour become the only available signal [9], [24]. Each of these builds directly on the stateful statistical layer introduced here, and none requires abandoning the lightweight per-query classifier that keeps the system deployable on commodity hardware.</w:t>
+        <w:t xml:space="preserve">Looking ahead, the path is more distinct and hopeful: extending the same session statistics to the response channel so that command-and-control answer traffic is profiled per client </w:t>
+      </w:r>
+      <w:hyperlink r:id="rId122">
+        <w:r>
+          <w:rPr>
+            <w:rFonts w:ascii="Times New Roman" w:hAnsi="Times New Roman" w:eastAsia="Times New Roman" w:cs="Times New Roman"/>
+            <w:color w:val="000000"/>
+            <w:u w:val="none"/>
+          </w:rPr>
+          <w:t xml:space="preserve">[28]</w:t>
+        </w:r>
+      </w:hyperlink>
+      <w:r>
+        <w:rPr>
+          <w:rFonts w:ascii="Times New Roman" w:hAnsi="Times New Roman" w:eastAsia="Times New Roman" w:cs="Times New Roman"/>
+          <w:b w:val="0"/>
+          <w:i w:val="0"/>
+          <w:sz w:val="24"/>
+        </w:rPr>
+        <w:t xml:space="preserve">, </w:t>
+      </w:r>
+      <w:hyperlink r:id="rId123">
+        <w:r>
+          <w:rPr>
+            <w:rFonts w:ascii="Times New Roman" w:hAnsi="Times New Roman" w:eastAsia="Times New Roman" w:cs="Times New Roman"/>
+            <w:color w:val="000000"/>
+            <w:u w:val="none"/>
+          </w:rPr>
+          <w:t xml:space="preserve">[29]</w:t>
+        </w:r>
+      </w:hyperlink>
+      <w:r>
+        <w:rPr>
+          <w:rFonts w:ascii="Times New Roman" w:hAnsi="Times New Roman" w:eastAsia="Times New Roman" w:cs="Times New Roman"/>
+          <w:b w:val="0"/>
+          <w:i w:val="0"/>
+          <w:sz w:val="24"/>
+        </w:rPr>
+        <w:t xml:space="preserve">; shard-level state merging for enterprise resolver scale so that a detector can serve forwarder farms handling hundreds of thousands of queries per second </w:t>
+      </w:r>
+      <w:hyperlink r:id="rId102">
+        <w:r>
+          <w:rPr>
+            <w:rFonts w:ascii="Times New Roman" w:hAnsi="Times New Roman" w:eastAsia="Times New Roman" w:cs="Times New Roman"/>
+            <w:color w:val="000000"/>
+            <w:u w:val="none"/>
+          </w:rPr>
+          <w:t xml:space="preserve">[10]</w:t>
+        </w:r>
+      </w:hyperlink>
+      <w:r>
+        <w:rPr>
+          <w:rFonts w:ascii="Times New Roman" w:hAnsi="Times New Roman" w:eastAsia="Times New Roman" w:cs="Times New Roman"/>
+          <w:b w:val="0"/>
+          <w:i w:val="0"/>
+          <w:sz w:val="24"/>
+        </w:rPr>
+        <w:t xml:space="preserve">, </w:t>
+      </w:r>
+      <w:hyperlink r:id="rId119">
+        <w:r>
+          <w:rPr>
+            <w:rFonts w:ascii="Times New Roman" w:hAnsi="Times New Roman" w:eastAsia="Times New Roman" w:cs="Times New Roman"/>
+            <w:color w:val="000000"/>
+            <w:u w:val="none"/>
+          </w:rPr>
+          <w:t xml:space="preserve">[25]</w:t>
+        </w:r>
+      </w:hyperlink>
+      <w:r>
+        <w:rPr>
+          <w:rFonts w:ascii="Times New Roman" w:hAnsi="Times New Roman" w:eastAsia="Times New Roman" w:cs="Times New Roman"/>
+          <w:b w:val="0"/>
+          <w:i w:val="0"/>
+          <w:sz w:val="24"/>
+        </w:rPr>
+        <w:t xml:space="preserve">; adaptive retraining loops that feed confirmed false positives back into the training corpus </w:t>
+      </w:r>
+      <w:hyperlink r:id="rId124">
+        <w:r>
+          <w:rPr>
+            <w:rFonts w:ascii="Times New Roman" w:hAnsi="Times New Roman" w:eastAsia="Times New Roman" w:cs="Times New Roman"/>
+            <w:color w:val="000000"/>
+            <w:u w:val="none"/>
+          </w:rPr>
+          <w:t xml:space="preserve">[30]</w:t>
+        </w:r>
+      </w:hyperlink>
+      <w:r>
+        <w:rPr>
+          <w:rFonts w:ascii="Times New Roman" w:hAnsi="Times New Roman" w:eastAsia="Times New Roman" w:cs="Times New Roman"/>
+          <w:b w:val="0"/>
+          <w:i w:val="0"/>
+          <w:sz w:val="24"/>
+        </w:rPr>
+        <w:t xml:space="preserve">; and extending coverage to encrypted DNS transport such as DoH and DoT, where payload inspection is impossible and timing and volume behaviour become the only available signal </w:t>
+      </w:r>
+      <w:hyperlink r:id="rId125">
+        <w:r>
+          <w:rPr>
+            <w:rFonts w:ascii="Times New Roman" w:hAnsi="Times New Roman" w:eastAsia="Times New Roman" w:cs="Times New Roman"/>
+            <w:color w:val="000000"/>
+            <w:u w:val="none"/>
+          </w:rPr>
+          <w:t xml:space="preserve">[31]</w:t>
+        </w:r>
+      </w:hyperlink>
+      <w:r>
+        <w:rPr>
+          <w:rFonts w:ascii="Times New Roman" w:hAnsi="Times New Roman" w:eastAsia="Times New Roman" w:cs="Times New Roman"/>
+          <w:b w:val="0"/>
+          <w:i w:val="0"/>
+          <w:sz w:val="24"/>
+        </w:rPr>
+        <w:t xml:space="preserve">, </w:t>
+      </w:r>
+      <w:hyperlink r:id="rId126">
+        <w:r>
+          <w:rPr>
+            <w:rFonts w:ascii="Times New Roman" w:hAnsi="Times New Roman" w:eastAsia="Times New Roman" w:cs="Times New Roman"/>
+            <w:color w:val="000000"/>
+            <w:u w:val="none"/>
+          </w:rPr>
+          <w:t xml:space="preserve">[32]</w:t>
+        </w:r>
+      </w:hyperlink>
+      <w:r>
+        <w:rPr>
+          <w:rFonts w:ascii="Times New Roman" w:hAnsi="Times New Roman" w:eastAsia="Times New Roman" w:cs="Times New Roman"/>
+          <w:b w:val="0"/>
+          <w:i w:val="0"/>
+          <w:sz w:val="24"/>
+        </w:rPr>
+        <w:t xml:space="preserve">. Each of these builds directly on the stateful statistical layer introduced here, and none requires abandoning the lightweight per-query classifier that keeps the system deployable on commodity hardware.</w:t>
       </w:r>
     </w:p>
     <w:p/>
@@ -6503,40 +7738,17 @@
         <w:ind w:left="432" w:hanging="432"/>
         <w:jc w:val="both"/>
       </w:pPr>
-      <w:r>
-        <w:rPr>
-          <w:rFonts w:ascii="Times New Roman" w:hAnsi="Times New Roman" w:eastAsia="Times New Roman" w:cs="Times New Roman"/>
-          <w:b w:val="0"/>
-          <w:i w:val="0"/>
-          <w:sz w:val="22"/>
-        </w:rPr>
-        <w:t xml:space="preserve">1. </w:t>
-      </w:r>
-      <w:r>
-        <w:rPr>
-          <w:rFonts w:ascii="Times New Roman" w:hAnsi="Times New Roman" w:eastAsia="Times New Roman" w:cs="Times New Roman"/>
-          <w:b w:val="0"/>
-          <w:i w:val="0"/>
-          <w:sz w:val="22"/>
-        </w:rPr>
-        <w:t>Mahdavifar, Samaneh, Amgad Hanafy Salem, Princy Victor, Amir H. Razavi, Miguel Garzon, Natasha Hellberg, and Arash Habibi Lashkari. Lightweight hybrid detection of data exfiltration using dns based on machine learning. Proceedings of the 2021 11th International Conference on Communication and Network Security, pp. 80-86. 2021.</w:t>
-      </w:r>
-    </w:p>
-    <w:p>
-      <w:pPr>
-        <w:spacing w:line="276" w:lineRule="auto" w:after="40"/>
-        <w:ind w:left="432" w:hanging="432"/>
-        <w:jc w:val="both"/>
-      </w:pPr>
-      <w:r>
-        <w:rPr>
-          <w:rFonts w:ascii="Times New Roman" w:hAnsi="Times New Roman" w:eastAsia="Times New Roman" w:cs="Times New Roman"/>
-          <w:b w:val="0"/>
-          <w:i w:val="0"/>
-          <w:sz w:val="22"/>
-        </w:rPr>
-        <w:t xml:space="preserve">2. </w:t>
-      </w:r>
+      <w:hyperlink r:id="rId23">
+        <w:r>
+          <w:rPr>
+            <w:rFonts w:ascii="Times New Roman" w:hAnsi="Times New Roman" w:eastAsia="Times New Roman" w:cs="Times New Roman"/>
+            <w:color w:val="000000"/>
+            <w:u w:val="none"/>
+            <w:sz w:val="22"/>
+          </w:rPr>
+          <w:t xml:space="preserve">1. </w:t>
+        </w:r>
+      </w:hyperlink>
       <w:r>
         <w:rPr>
           <w:rFonts w:ascii="Times New Roman" w:hAnsi="Times New Roman" w:eastAsia="Times New Roman" w:cs="Times New Roman"/>
@@ -6553,6 +7765,17 @@
         <w:ind w:left="432" w:hanging="432"/>
         <w:jc w:val="both"/>
       </w:pPr>
+      <w:hyperlink r:id="rId24">
+        <w:r>
+          <w:rPr>
+            <w:rFonts w:ascii="Times New Roman" w:hAnsi="Times New Roman" w:eastAsia="Times New Roman" w:cs="Times New Roman"/>
+            <w:color w:val="000000"/>
+            <w:u w:val="none"/>
+            <w:sz w:val="22"/>
+          </w:rPr>
+          <w:t xml:space="preserve">2. </w:t>
+        </w:r>
+      </w:hyperlink>
       <w:r>
         <w:rPr>
           <w:rFonts w:ascii="Times New Roman" w:hAnsi="Times New Roman" w:eastAsia="Times New Roman" w:cs="Times New Roman"/>
@@ -6560,16 +7783,7 @@
           <w:i w:val="0"/>
           <w:sz w:val="22"/>
         </w:rPr>
-        <w:t xml:space="preserve">3. </w:t>
-      </w:r>
-      <w:r>
-        <w:rPr>
-          <w:rFonts w:ascii="Times New Roman" w:hAnsi="Times New Roman" w:eastAsia="Times New Roman" w:cs="Times New Roman"/>
-          <w:b w:val="0"/>
-          <w:i w:val="0"/>
-          <w:sz w:val="22"/>
-        </w:rPr>
-        <w:t>DUMINICĂ, Alexandru, and Alin PUNCIOIU. Advanced Endpoint Protection Solution for Real-Time Defense against Cyber Threats. Journal of Military Technology Vol 9, no. 1 (2026).</w:t>
+        <w:t>Dietrich, Christian J., Christian Rossow, Felix C. Freiling, Herbert Bos, Maarten Van Steen, and Norbert Pohlmann. On botnets that use DNS for command and control. In 2011 seventh european conference on computer network defense, pp. 9-16. 2011.</w:t>
       </w:r>
     </w:p>
     <w:p>
@@ -6578,40 +7792,17 @@
         <w:ind w:left="432" w:hanging="432"/>
         <w:jc w:val="both"/>
       </w:pPr>
-      <w:r>
-        <w:rPr>
-          <w:rFonts w:ascii="Times New Roman" w:hAnsi="Times New Roman" w:eastAsia="Times New Roman" w:cs="Times New Roman"/>
-          <w:b w:val="0"/>
-          <w:i w:val="0"/>
-          <w:sz w:val="22"/>
-        </w:rPr>
-        <w:t xml:space="preserve">4. </w:t>
-      </w:r>
-      <w:r>
-        <w:rPr>
-          <w:rFonts w:ascii="Times New Roman" w:hAnsi="Times New Roman" w:eastAsia="Times New Roman" w:cs="Times New Roman"/>
-          <w:b w:val="0"/>
-          <w:i w:val="0"/>
-          <w:sz w:val="22"/>
-        </w:rPr>
-        <w:t>Senthil, Kumar P., Shieh Chin-Shiuh, and Horng Mong-Fong. Cognitive-Adaptive Multilayer AI Firewall Architecture (C-AMLAFA) for Encrypted Traffic Analysis in Enterprise Networks. International Journal on Smart Sensing and Intelligent Systems 19, no. 1 (2026).</w:t>
-      </w:r>
-    </w:p>
-    <w:p>
-      <w:pPr>
-        <w:spacing w:line="276" w:lineRule="auto" w:after="40"/>
-        <w:ind w:left="432" w:hanging="432"/>
-        <w:jc w:val="both"/>
-      </w:pPr>
-      <w:r>
-        <w:rPr>
-          <w:rFonts w:ascii="Times New Roman" w:hAnsi="Times New Roman" w:eastAsia="Times New Roman" w:cs="Times New Roman"/>
-          <w:b w:val="0"/>
-          <w:i w:val="0"/>
-          <w:sz w:val="22"/>
-        </w:rPr>
-        <w:t xml:space="preserve">5. </w:t>
-      </w:r>
+      <w:hyperlink r:id="rId25">
+        <w:r>
+          <w:rPr>
+            <w:rFonts w:ascii="Times New Roman" w:hAnsi="Times New Roman" w:eastAsia="Times New Roman" w:cs="Times New Roman"/>
+            <w:color w:val="000000"/>
+            <w:u w:val="none"/>
+            <w:sz w:val="22"/>
+          </w:rPr>
+          <w:t xml:space="preserve">3. </w:t>
+        </w:r>
+      </w:hyperlink>
       <w:r>
         <w:rPr>
           <w:rFonts w:ascii="Times New Roman" w:hAnsi="Times New Roman" w:eastAsia="Times New Roman" w:cs="Times New Roman"/>
@@ -6628,6 +7819,17 @@
         <w:ind w:left="432" w:hanging="432"/>
         <w:jc w:val="both"/>
       </w:pPr>
+      <w:hyperlink r:id="rId26">
+        <w:r>
+          <w:rPr>
+            <w:rFonts w:ascii="Times New Roman" w:hAnsi="Times New Roman" w:eastAsia="Times New Roman" w:cs="Times New Roman"/>
+            <w:color w:val="000000"/>
+            <w:u w:val="none"/>
+            <w:sz w:val="22"/>
+          </w:rPr>
+          <w:t xml:space="preserve">4. </w:t>
+        </w:r>
+      </w:hyperlink>
       <w:r>
         <w:rPr>
           <w:rFonts w:ascii="Times New Roman" w:hAnsi="Times New Roman" w:eastAsia="Times New Roman" w:cs="Times New Roman"/>
@@ -6635,8 +7837,26 @@
           <w:i w:val="0"/>
           <w:sz w:val="22"/>
         </w:rPr>
-        <w:t xml:space="preserve">6. </w:t>
+        <w:t>Kumawat, Deepika, Atharv Sharma, Adarsh Gokhe, Nikhil Agalcha, and Rinku Patil. A Machine Learning-Based Approach for Detecting DNS Tunneling and Data Exfiltration in Network Traffic. International Journal of Computer Information Systems and Industrial Management Applications 18, no. 20s (2026): 350-361.</w:t>
       </w:r>
+    </w:p>
+    <w:p>
+      <w:pPr>
+        <w:spacing w:line="276" w:lineRule="auto" w:after="40"/>
+        <w:ind w:left="432" w:hanging="432"/>
+        <w:jc w:val="both"/>
+      </w:pPr>
+      <w:hyperlink r:id="rId27">
+        <w:r>
+          <w:rPr>
+            <w:rFonts w:ascii="Times New Roman" w:hAnsi="Times New Roman" w:eastAsia="Times New Roman" w:cs="Times New Roman"/>
+            <w:color w:val="000000"/>
+            <w:u w:val="none"/>
+            <w:sz w:val="22"/>
+          </w:rPr>
+          <w:t xml:space="preserve">5. </w:t>
+        </w:r>
+      </w:hyperlink>
       <w:r>
         <w:rPr>
           <w:rFonts w:ascii="Times New Roman" w:hAnsi="Times New Roman" w:eastAsia="Times New Roman" w:cs="Times New Roman"/>
@@ -6644,7 +7864,34 @@
           <w:i w:val="0"/>
           <w:sz w:val="22"/>
         </w:rPr>
-        <w:t>Du, Jiajia, Songtao Liu, Cheng Zhi, Junfan Zhao, Hua Wu, and Guang Cheng. TunnelEye: An Explainable Framework for Real-Time Detection of Malicious DoH Traffic in High-Speed Backbone Networks. Transactions on Network and Service Management 23 (2026): 3977-3997.</w:t>
+        <w:t>Alkasassbeh, Mouhammd, and Mohammad Almseidin. Machine learning techniques for accurately detecting the DNS tunneling. Science and Information Conference, pp. 352-364. 2023.</w:t>
+      </w:r>
+    </w:p>
+    <w:p>
+      <w:pPr>
+        <w:spacing w:line="276" w:lineRule="auto" w:after="40"/>
+        <w:ind w:left="432" w:hanging="432"/>
+        <w:jc w:val="both"/>
+      </w:pPr>
+      <w:hyperlink r:id="rId28">
+        <w:r>
+          <w:rPr>
+            <w:rFonts w:ascii="Times New Roman" w:hAnsi="Times New Roman" w:eastAsia="Times New Roman" w:cs="Times New Roman"/>
+            <w:color w:val="000000"/>
+            <w:u w:val="none"/>
+            <w:sz w:val="22"/>
+          </w:rPr>
+          <w:t xml:space="preserve">6. </w:t>
+        </w:r>
+      </w:hyperlink>
+      <w:r>
+        <w:rPr>
+          <w:rFonts w:ascii="Times New Roman" w:hAnsi="Times New Roman" w:eastAsia="Times New Roman" w:cs="Times New Roman"/>
+          <w:b w:val="0"/>
+          <w:i w:val="0"/>
+          <w:sz w:val="22"/>
+        </w:rPr>
+        <w:t>Al Musa, Mohammad, and Ismail Altaharwa. Stealth at the Edge: A High-Throughput, ML-Resistant DNS Covert Channel via Direct UDP and Algorithmic Phonotactics. In 2026 Jordan Conference on Applied Electrical Engineering and Computing Technologies (AEECT), pp. 291-296. 2026.</w:t>
       </w:r>
     </w:p>
     <w:p>
@@ -6669,7 +7916,7 @@
           <w:i w:val="0"/>
           <w:sz w:val="22"/>
         </w:rPr>
-        <w:t>Ali, Basharat, and Guihai Chen. Mirage-doh: Metamorphic intelligence and resilient ai grid for autonomous governance of encrypted dns. Transactions on Network and Service Management 23 (2026): 3780-3804.</w:t>
+        <w:t>Liu, Xiaoyu, Weixuan Mao, Anqi Wang, Zheng Li, Hui Xue, Yijing Zhang, Jianjun Lin, Xiaodu Yang, Ziqian Chen, and Bo Sun. DNS tunnel detection for low throughput data exfiltration via time-frequency domain analysis. ICC 2023-International Conference on Communications, pp. 2331-2337. 2023.</w:t>
       </w:r>
     </w:p>
     <w:p>
@@ -6678,6 +7925,17 @@
         <w:ind w:left="432" w:hanging="432"/>
         <w:jc w:val="both"/>
       </w:pPr>
+      <w:hyperlink r:id="rId29">
+        <w:r>
+          <w:rPr>
+            <w:rFonts w:ascii="Times New Roman" w:hAnsi="Times New Roman" w:eastAsia="Times New Roman" w:cs="Times New Roman"/>
+            <w:color w:val="000000"/>
+            <w:u w:val="none"/>
+            <w:sz w:val="22"/>
+          </w:rPr>
+          <w:t xml:space="preserve">8. </w:t>
+        </w:r>
+      </w:hyperlink>
       <w:r>
         <w:rPr>
           <w:rFonts w:ascii="Times New Roman" w:hAnsi="Times New Roman" w:eastAsia="Times New Roman" w:cs="Times New Roman"/>
@@ -6685,16 +7943,7 @@
           <w:i w:val="0"/>
           <w:sz w:val="22"/>
         </w:rPr>
-        <w:t xml:space="preserve">8. </w:t>
-      </w:r>
-      <w:r>
-        <w:rPr>
-          <w:rFonts w:ascii="Times New Roman" w:hAnsi="Times New Roman" w:eastAsia="Times New Roman" w:cs="Times New Roman"/>
-          <w:b w:val="0"/>
-          <w:i w:val="0"/>
-          <w:sz w:val="22"/>
-        </w:rPr>
-        <w:t>Kumawat, Deepika, Atharv Sharma, Adarsh Gokhe, Nikhil Agalcha, and Rinku Patil. A Machine Learning-Based Approach for Detecting DNS Tunneling and Data Exfiltration in Network Traffic. International Journal of Computer Information Systems and Industrial Management Applications 18, no. 20s (2026): 350-361.</w:t>
+        <w:t>Inayat, Usman, and Reamsha Khan. Detection and Prevention of DNS Tunneling Attacks: Exploring Technologies and Methodologies. UMT Artificial Intelligence Review 4, no. 1 (2024): 37-45.</w:t>
       </w:r>
     </w:p>
     <w:p>
@@ -6703,6 +7952,17 @@
         <w:ind w:left="432" w:hanging="432"/>
         <w:jc w:val="both"/>
       </w:pPr>
+      <w:hyperlink r:id="rId30">
+        <w:r>
+          <w:rPr>
+            <w:rFonts w:ascii="Times New Roman" w:hAnsi="Times New Roman" w:eastAsia="Times New Roman" w:cs="Times New Roman"/>
+            <w:color w:val="000000"/>
+            <w:u w:val="none"/>
+            <w:sz w:val="22"/>
+          </w:rPr>
+          <w:t xml:space="preserve">9. </w:t>
+        </w:r>
+      </w:hyperlink>
       <w:r>
         <w:rPr>
           <w:rFonts w:ascii="Times New Roman" w:hAnsi="Times New Roman" w:eastAsia="Times New Roman" w:cs="Times New Roman"/>
@@ -6710,16 +7970,7 @@
           <w:i w:val="0"/>
           <w:sz w:val="22"/>
         </w:rPr>
-        <w:t xml:space="preserve">9. </w:t>
-      </w:r>
-      <w:r>
-        <w:rPr>
-          <w:rFonts w:ascii="Times New Roman" w:hAnsi="Times New Roman" w:eastAsia="Times New Roman" w:cs="Times New Roman"/>
-          <w:b w:val="0"/>
-          <w:i w:val="0"/>
-          <w:sz w:val="22"/>
-        </w:rPr>
-        <w:t>Batool, Komal. Make It Easy: Enhanced Detection of DNS Tunneling Tools over DoH Using Standard Flow Features. Network and System Security: 19th International Conference, NSS 2025, Wuhan, China, December 5–7, 2025, Proceedings, p. 1. 2026.</w:t>
+        <w:t>Adiwal, Sanjay, Balaji Rajendran, and Sithu D. Sudarsan. Dns intrusion detection (did)—a snort-based solution to detect dns amplification and dns tunneling attacks. Franklin Open 2 (2023): 100010.</w:t>
       </w:r>
     </w:p>
     <w:p>
@@ -6744,6 +7995,627 @@
           <w:i w:val="0"/>
           <w:sz w:val="22"/>
         </w:rPr>
+        <w:t>Ren, Fengfeng, Lizhi Peng, and Yihang Hao. A Scalable DNS Tunneling Detection Method Based on Ensemble Learning for Programmable Switches. International Conference on Intelligent Computing, pp. 379-390. 2026.</w:t>
+      </w:r>
+    </w:p>
+    <w:p>
+      <w:pPr>
+        <w:spacing w:line="276" w:lineRule="auto" w:after="40"/>
+        <w:ind w:left="432" w:hanging="432"/>
+        <w:jc w:val="both"/>
+      </w:pPr>
+      <w:hyperlink r:id="rId31">
+        <w:r>
+          <w:rPr>
+            <w:rFonts w:ascii="Times New Roman" w:hAnsi="Times New Roman" w:eastAsia="Times New Roman" w:cs="Times New Roman"/>
+            <w:color w:val="000000"/>
+            <w:u w:val="none"/>
+            <w:sz w:val="22"/>
+          </w:rPr>
+          <w:t xml:space="preserve">11. </w:t>
+        </w:r>
+      </w:hyperlink>
+      <w:r>
+        <w:rPr>
+          <w:rFonts w:ascii="Times New Roman" w:hAnsi="Times New Roman" w:eastAsia="Times New Roman" w:cs="Times New Roman"/>
+          <w:b w:val="0"/>
+          <w:i w:val="0"/>
+          <w:sz w:val="22"/>
+        </w:rPr>
+        <w:t>Senthil, Kumar P., Shieh Chin-Shiuh, and Horng Mong-Fong. Cognitive-Adaptive Multilayer AI Firewall Architecture (C-AMLAFA) for Encrypted Traffic Analysis in Enterprise Networks. International Journal on Smart Sensing and Intelligent Systems 19, no. 1 (2026).</w:t>
+      </w:r>
+    </w:p>
+    <w:p>
+      <w:pPr>
+        <w:spacing w:line="276" w:lineRule="auto" w:after="40"/>
+        <w:ind w:left="432" w:hanging="432"/>
+        <w:jc w:val="both"/>
+      </w:pPr>
+      <w:hyperlink r:id="rId32">
+        <w:r>
+          <w:rPr>
+            <w:rFonts w:ascii="Times New Roman" w:hAnsi="Times New Roman" w:eastAsia="Times New Roman" w:cs="Times New Roman"/>
+            <w:color w:val="000000"/>
+            <w:u w:val="none"/>
+            <w:sz w:val="22"/>
+          </w:rPr>
+          <w:t xml:space="preserve">12. </w:t>
+        </w:r>
+      </w:hyperlink>
+      <w:r>
+        <w:rPr>
+          <w:rFonts w:ascii="Times New Roman" w:hAnsi="Times New Roman" w:eastAsia="Times New Roman" w:cs="Times New Roman"/>
+          <w:b w:val="0"/>
+          <w:i w:val="0"/>
+          <w:sz w:val="22"/>
+        </w:rPr>
+        <w:t>Lal, Anushka, Ankit Prasad, Ankit Kumar, and Shailender Kumar. DNS-tunnet: A hybrid approach for DNS tunneling detection. In 2022 4th International Conference on Advances in Computer Technology, Information Science and Communications (CTISC), pp. 1-6. 2022.</w:t>
+      </w:r>
+    </w:p>
+    <w:p>
+      <w:pPr>
+        <w:spacing w:line="276" w:lineRule="auto" w:after="40"/>
+        <w:ind w:left="432" w:hanging="432"/>
+        <w:jc w:val="both"/>
+      </w:pPr>
+      <w:hyperlink r:id="rId33">
+        <w:r>
+          <w:rPr>
+            <w:rFonts w:ascii="Times New Roman" w:hAnsi="Times New Roman" w:eastAsia="Times New Roman" w:cs="Times New Roman"/>
+            <w:color w:val="000000"/>
+            <w:u w:val="none"/>
+            <w:sz w:val="22"/>
+          </w:rPr>
+          <w:t xml:space="preserve">13. </w:t>
+        </w:r>
+      </w:hyperlink>
+      <w:r>
+        <w:rPr>
+          <w:rFonts w:ascii="Times New Roman" w:hAnsi="Times New Roman" w:eastAsia="Times New Roman" w:cs="Times New Roman"/>
+          <w:b w:val="0"/>
+          <w:i w:val="0"/>
+          <w:sz w:val="22"/>
+        </w:rPr>
+        <w:t>Tu, Yu, Shuang Liu, and Qian Sun. DNS tunnelling detection by fusing encoding feature and behavioral feature. Computers &amp; Security 132 (2023): 103357.</w:t>
+      </w:r>
+    </w:p>
+    <w:p>
+      <w:pPr>
+        <w:spacing w:line="276" w:lineRule="auto" w:after="40"/>
+        <w:ind w:left="432" w:hanging="432"/>
+        <w:jc w:val="both"/>
+      </w:pPr>
+      <w:hyperlink r:id="rId34">
+        <w:r>
+          <w:rPr>
+            <w:rFonts w:ascii="Times New Roman" w:hAnsi="Times New Roman" w:eastAsia="Times New Roman" w:cs="Times New Roman"/>
+            <w:color w:val="000000"/>
+            <w:u w:val="none"/>
+            <w:sz w:val="22"/>
+          </w:rPr>
+          <w:t xml:space="preserve">14. </w:t>
+        </w:r>
+      </w:hyperlink>
+      <w:r>
+        <w:rPr>
+          <w:rFonts w:ascii="Times New Roman" w:hAnsi="Times New Roman" w:eastAsia="Times New Roman" w:cs="Times New Roman"/>
+          <w:b w:val="0"/>
+          <w:i w:val="0"/>
+          <w:sz w:val="22"/>
+        </w:rPr>
+        <w:t>Liu, Yong, and Xiangnan Gou. Research on application of feature analysis method in DNS tunnel detection. Journal of Physics: Conference Series, vol. 1575, no. 1, p. 012069. 2020.</w:t>
+      </w:r>
+    </w:p>
+    <w:p>
+      <w:pPr>
+        <w:spacing w:line="276" w:lineRule="auto" w:after="40"/>
+        <w:ind w:left="432" w:hanging="432"/>
+        <w:jc w:val="both"/>
+      </w:pPr>
+      <w:hyperlink r:id="rId35">
+        <w:r>
+          <w:rPr>
+            <w:rFonts w:ascii="Times New Roman" w:hAnsi="Times New Roman" w:eastAsia="Times New Roman" w:cs="Times New Roman"/>
+            <w:color w:val="000000"/>
+            <w:u w:val="none"/>
+            <w:sz w:val="22"/>
+          </w:rPr>
+          <w:t xml:space="preserve">15. </w:t>
+        </w:r>
+      </w:hyperlink>
+      <w:r>
+        <w:rPr>
+          <w:rFonts w:ascii="Times New Roman" w:hAnsi="Times New Roman" w:eastAsia="Times New Roman" w:cs="Times New Roman"/>
+          <w:b w:val="0"/>
+          <w:i w:val="0"/>
+          <w:sz w:val="22"/>
+        </w:rPr>
+        <w:t>De Bernardi, Giacomo, Giovanni Battista Gaggero, Fabio Patrone, Sandro Zappatore, Mario Marchese, and Maurizio Mongelli. Rule-based eXplainable autoencoder for DNS tunneling detection. Computers 14, no. 9 (2025): 375.</w:t>
+      </w:r>
+    </w:p>
+    <w:p>
+      <w:pPr>
+        <w:spacing w:line="276" w:lineRule="auto" w:after="40"/>
+        <w:ind w:left="432" w:hanging="432"/>
+        <w:jc w:val="both"/>
+      </w:pPr>
+      <w:hyperlink r:id="rId36">
+        <w:r>
+          <w:rPr>
+            <w:rFonts w:ascii="Times New Roman" w:hAnsi="Times New Roman" w:eastAsia="Times New Roman" w:cs="Times New Roman"/>
+            <w:color w:val="000000"/>
+            <w:u w:val="none"/>
+            <w:sz w:val="22"/>
+          </w:rPr>
+          <w:t xml:space="preserve">16. </w:t>
+        </w:r>
+      </w:hyperlink>
+      <w:r>
+        <w:rPr>
+          <w:rFonts w:ascii="Times New Roman" w:hAnsi="Times New Roman" w:eastAsia="Times New Roman" w:cs="Times New Roman"/>
+          <w:b w:val="0"/>
+          <w:i w:val="0"/>
+          <w:sz w:val="22"/>
+        </w:rPr>
+        <w:t>Abualghanam, Orieb, Hadeel Alazzam, Basima Elshqeirat, Mohammad Qatawneh, and Mohammed Amin Almaiah. Real-time detection system for data exfiltration over DNS tunneling using machine learning. Electronics 12, no. 6 (2023): 1467.</w:t>
+      </w:r>
+    </w:p>
+    <w:p>
+      <w:pPr>
+        <w:spacing w:line="276" w:lineRule="auto" w:after="40"/>
+        <w:ind w:left="432" w:hanging="432"/>
+        <w:jc w:val="both"/>
+      </w:pPr>
+      <w:hyperlink r:id="rId37">
+        <w:r>
+          <w:rPr>
+            <w:rFonts w:ascii="Times New Roman" w:hAnsi="Times New Roman" w:eastAsia="Times New Roman" w:cs="Times New Roman"/>
+            <w:color w:val="000000"/>
+            <w:u w:val="none"/>
+            <w:sz w:val="22"/>
+          </w:rPr>
+          <w:t xml:space="preserve">17. </w:t>
+        </w:r>
+      </w:hyperlink>
+      <w:r>
+        <w:rPr>
+          <w:rFonts w:ascii="Times New Roman" w:hAnsi="Times New Roman" w:eastAsia="Times New Roman" w:cs="Times New Roman"/>
+          <w:b w:val="0"/>
+          <w:i w:val="0"/>
+          <w:sz w:val="22"/>
+        </w:rPr>
+        <w:t>Karthik, Valaji Veera Venkata, Thallapalli Vikranth, Sunku Suhash, and Thupakula Gangadhar Reddy. DNS Tunneling Detection using Temporal Convolutional Network and Attention Layers. In 2025 5th International Conference on Evolutionary Computing and Mobile Sustainable Networks (ICECMSN), pp. 353-357. 2025.</w:t>
+      </w:r>
+    </w:p>
+    <w:p>
+      <w:pPr>
+        <w:spacing w:line="276" w:lineRule="auto" w:after="40"/>
+        <w:ind w:left="432" w:hanging="432"/>
+        <w:jc w:val="both"/>
+      </w:pPr>
+      <w:hyperlink r:id="rId38">
+        <w:r>
+          <w:rPr>
+            <w:rFonts w:ascii="Times New Roman" w:hAnsi="Times New Roman" w:eastAsia="Times New Roman" w:cs="Times New Roman"/>
+            <w:color w:val="000000"/>
+            <w:u w:val="none"/>
+            <w:sz w:val="22"/>
+          </w:rPr>
+          <w:t xml:space="preserve">18. </w:t>
+        </w:r>
+      </w:hyperlink>
+      <w:r>
+        <w:rPr>
+          <w:rFonts w:ascii="Times New Roman" w:hAnsi="Times New Roman" w:eastAsia="Times New Roman" w:cs="Times New Roman"/>
+          <w:b w:val="0"/>
+          <w:i w:val="0"/>
+          <w:sz w:val="22"/>
+        </w:rPr>
+        <w:t>Kuang, Shilei, Weiping Wang, Yongfei Ye, and Lingzhi Peng. HHBT: DNS tunneling Detection via Hybrid Hierarchical Bidirectional Transformer. Computer Networks (2025): 111919.</w:t>
+      </w:r>
+    </w:p>
+    <w:p>
+      <w:pPr>
+        <w:spacing w:line="276" w:lineRule="auto" w:after="40"/>
+        <w:ind w:left="432" w:hanging="432"/>
+        <w:jc w:val="both"/>
+      </w:pPr>
+      <w:hyperlink r:id="rId39">
+        <w:r>
+          <w:rPr>
+            <w:rFonts w:ascii="Times New Roman" w:hAnsi="Times New Roman" w:eastAsia="Times New Roman" w:cs="Times New Roman"/>
+            <w:color w:val="000000"/>
+            <w:u w:val="none"/>
+            <w:sz w:val="22"/>
+          </w:rPr>
+          <w:t xml:space="preserve">19. </w:t>
+        </w:r>
+      </w:hyperlink>
+      <w:r>
+        <w:rPr>
+          <w:rFonts w:ascii="Times New Roman" w:hAnsi="Times New Roman" w:eastAsia="Times New Roman" w:cs="Times New Roman"/>
+          <w:b w:val="0"/>
+          <w:i w:val="0"/>
+          <w:sz w:val="22"/>
+        </w:rPr>
+        <w:t>Tayyeh, Huda Kadhim, and Ahmed Sabah Ahmed Al-Jumaili. A long short term memory model for character-based analysis of DNS tunneling detection. Scalable Computing: Practice and Experience 25, no. 6 (2024): 5250-5257.</w:t>
+      </w:r>
+    </w:p>
+    <w:p>
+      <w:pPr>
+        <w:spacing w:line="276" w:lineRule="auto" w:after="40"/>
+        <w:ind w:left="432" w:hanging="432"/>
+        <w:jc w:val="both"/>
+      </w:pPr>
+      <w:hyperlink r:id="rId40">
+        <w:r>
+          <w:rPr>
+            <w:rFonts w:ascii="Times New Roman" w:hAnsi="Times New Roman" w:eastAsia="Times New Roman" w:cs="Times New Roman"/>
+            <w:color w:val="000000"/>
+            <w:u w:val="none"/>
+            <w:sz w:val="22"/>
+          </w:rPr>
+          <w:t xml:space="preserve">20. </w:t>
+        </w:r>
+      </w:hyperlink>
+      <w:r>
+        <w:rPr>
+          <w:rFonts w:ascii="Times New Roman" w:hAnsi="Times New Roman" w:eastAsia="Times New Roman" w:cs="Times New Roman"/>
+          <w:b w:val="0"/>
+          <w:i w:val="0"/>
+          <w:sz w:val="22"/>
+        </w:rPr>
+        <w:t>James, Carter. Adaptive Adversarial Evasion: Evaluating the Robustness of Hybrid CNN-LSTM Models Against Mutated DNS Tunneling Payloads in Real-Time. ScienceOpen Preprints (2026).</w:t>
+      </w:r>
+    </w:p>
+    <w:p>
+      <w:pPr>
+        <w:spacing w:line="276" w:lineRule="auto" w:after="40"/>
+        <w:ind w:left="432" w:hanging="432"/>
+        <w:jc w:val="both"/>
+      </w:pPr>
+      <w:hyperlink r:id="rId41">
+        <w:r>
+          <w:rPr>
+            <w:rFonts w:ascii="Times New Roman" w:hAnsi="Times New Roman" w:eastAsia="Times New Roman" w:cs="Times New Roman"/>
+            <w:color w:val="000000"/>
+            <w:u w:val="none"/>
+            <w:sz w:val="22"/>
+          </w:rPr>
+          <w:t xml:space="preserve">21. </w:t>
+        </w:r>
+      </w:hyperlink>
+      <w:r>
+        <w:rPr>
+          <w:rFonts w:ascii="Times New Roman" w:hAnsi="Times New Roman" w:eastAsia="Times New Roman" w:cs="Times New Roman"/>
+          <w:b w:val="0"/>
+          <w:i w:val="0"/>
+          <w:sz w:val="22"/>
+        </w:rPr>
+        <w:t>Bennett, Oliver, and Amelia Clarke. Behavioral Fingerprinting for Detecting Covert DNS Tunneling Activities in Enterprise Networks. China and WTO Review 12, no. 1 (2026).</w:t>
+      </w:r>
+    </w:p>
+    <w:p>
+      <w:pPr>
+        <w:spacing w:line="276" w:lineRule="auto" w:after="40"/>
+        <w:ind w:left="432" w:hanging="432"/>
+        <w:jc w:val="both"/>
+      </w:pPr>
+      <w:hyperlink r:id="rId42">
+        <w:r>
+          <w:rPr>
+            <w:rFonts w:ascii="Times New Roman" w:hAnsi="Times New Roman" w:eastAsia="Times New Roman" w:cs="Times New Roman"/>
+            <w:color w:val="000000"/>
+            <w:u w:val="none"/>
+            <w:sz w:val="22"/>
+          </w:rPr>
+          <w:t xml:space="preserve">22. </w:t>
+        </w:r>
+      </w:hyperlink>
+      <w:r>
+        <w:rPr>
+          <w:rFonts w:ascii="Times New Roman" w:hAnsi="Times New Roman" w:eastAsia="Times New Roman" w:cs="Times New Roman"/>
+          <w:b w:val="0"/>
+          <w:i w:val="0"/>
+          <w:sz w:val="22"/>
+        </w:rPr>
+        <w:t>Arora, Kabeer, Koena Sarkar, and R. S. Ponmagal. Multi-Stage DNS Tunnelling Detection Using Behavioural Analytics and AI-Based Anomaly Scoring. In 2026 1st International Conference on AI, Data Science, Cyber Security and Smart Manufacturing for Sustainable Development (ICADCS), pp. 212-217. 2026.</w:t>
+      </w:r>
+    </w:p>
+    <w:p>
+      <w:pPr>
+        <w:spacing w:line="276" w:lineRule="auto" w:after="40"/>
+        <w:ind w:left="432" w:hanging="432"/>
+        <w:jc w:val="both"/>
+      </w:pPr>
+      <w:hyperlink r:id="rId43">
+        <w:r>
+          <w:rPr>
+            <w:rFonts w:ascii="Times New Roman" w:hAnsi="Times New Roman" w:eastAsia="Times New Roman" w:cs="Times New Roman"/>
+            <w:color w:val="000000"/>
+            <w:u w:val="none"/>
+            <w:sz w:val="22"/>
+          </w:rPr>
+          <w:t xml:space="preserve">23. </w:t>
+        </w:r>
+      </w:hyperlink>
+      <w:r>
+        <w:rPr>
+          <w:rFonts w:ascii="Times New Roman" w:hAnsi="Times New Roman" w:eastAsia="Times New Roman" w:cs="Times New Roman"/>
+          <w:b w:val="0"/>
+          <w:i w:val="0"/>
+          <w:sz w:val="22"/>
+        </w:rPr>
+        <w:t>Sa’ad, Umar, Demeke Shumeye Lakew, Nhu-Ngoc Dao, and Sungrae Cho. Herald: Hybrid ensemble approach for robust anomaly detection in encrypted dns traffic. Journal of Network and Computer Applications (2025): 104342.</w:t>
+      </w:r>
+    </w:p>
+    <w:p>
+      <w:pPr>
+        <w:spacing w:line="276" w:lineRule="auto" w:after="40"/>
+        <w:ind w:left="432" w:hanging="432"/>
+        <w:jc w:val="both"/>
+      </w:pPr>
+      <w:hyperlink r:id="rId44">
+        <w:r>
+          <w:rPr>
+            <w:rFonts w:ascii="Times New Roman" w:hAnsi="Times New Roman" w:eastAsia="Times New Roman" w:cs="Times New Roman"/>
+            <w:color w:val="000000"/>
+            <w:u w:val="none"/>
+            <w:sz w:val="22"/>
+          </w:rPr>
+          <w:t xml:space="preserve">24. </w:t>
+        </w:r>
+      </w:hyperlink>
+      <w:r>
+        <w:rPr>
+          <w:rFonts w:ascii="Times New Roman" w:hAnsi="Times New Roman" w:eastAsia="Times New Roman" w:cs="Times New Roman"/>
+          <w:b w:val="0"/>
+          <w:i w:val="0"/>
+          <w:sz w:val="22"/>
+        </w:rPr>
+        <w:t>Lyu, Xinchen. Detecting and Mitigating DNS Exfiltration Attacks in Real-Time Using Ensemble Deep Learning Models. (2026).</w:t>
+      </w:r>
+    </w:p>
+    <w:p>
+      <w:pPr>
+        <w:spacing w:line="276" w:lineRule="auto" w:after="40"/>
+        <w:ind w:left="432" w:hanging="432"/>
+        <w:jc w:val="both"/>
+      </w:pPr>
+      <w:hyperlink r:id="rId45">
+        <w:r>
+          <w:rPr>
+            <w:rFonts w:ascii="Times New Roman" w:hAnsi="Times New Roman" w:eastAsia="Times New Roman" w:cs="Times New Roman"/>
+            <w:color w:val="000000"/>
+            <w:u w:val="none"/>
+            <w:sz w:val="22"/>
+          </w:rPr>
+          <w:t xml:space="preserve">25. </w:t>
+        </w:r>
+      </w:hyperlink>
+      <w:r>
+        <w:rPr>
+          <w:rFonts w:ascii="Times New Roman" w:hAnsi="Times New Roman" w:eastAsia="Times New Roman" w:cs="Times New Roman"/>
+          <w:b w:val="0"/>
+          <w:i w:val="0"/>
+          <w:sz w:val="22"/>
+        </w:rPr>
+        <w:t>Elizalde, Sergio, Ali AlSabeh, Samia Choueiri, Jaime Galán-Jiménez, Elie Kfoury, and Jorge Crichigno. Real-Time Detection of Encrypted DGA and DNS Tunneling Using DPDK on SmartNICs. In 2026 International Black Seas Conference on Communications and Networking (BlackSeaCom), pp. 1-6. 2026.</w:t>
+      </w:r>
+    </w:p>
+    <w:p>
+      <w:pPr>
+        <w:spacing w:line="276" w:lineRule="auto" w:after="40"/>
+        <w:ind w:left="432" w:hanging="432"/>
+        <w:jc w:val="both"/>
+      </w:pPr>
+      <w:hyperlink r:id="rId46">
+        <w:r>
+          <w:rPr>
+            <w:rFonts w:ascii="Times New Roman" w:hAnsi="Times New Roman" w:eastAsia="Times New Roman" w:cs="Times New Roman"/>
+            <w:color w:val="000000"/>
+            <w:u w:val="none"/>
+            <w:sz w:val="22"/>
+          </w:rPr>
+          <w:t xml:space="preserve">26. </w:t>
+        </w:r>
+      </w:hyperlink>
+      <w:r>
+        <w:rPr>
+          <w:rFonts w:ascii="Times New Roman" w:hAnsi="Times New Roman" w:eastAsia="Times New Roman" w:cs="Times New Roman"/>
+          <w:b w:val="0"/>
+          <w:i w:val="0"/>
+          <w:sz w:val="22"/>
+        </w:rPr>
+        <w:t>Mahdavifar, Samaneh, Amgad Hanafy Salem, Princy Victor, Amir H. Razavi, Miguel Garzon, Natasha Hellberg, and Arash Habibi Lashkari. Lightweight hybrid detection of data exfiltration using dns based on machine learning. Proceedings of the 2021 11th International Conference on Communication and Network Security, pp. 80-86. 2021.</w:t>
+      </w:r>
+    </w:p>
+    <w:p>
+      <w:pPr>
+        <w:spacing w:line="276" w:lineRule="auto" w:after="40"/>
+        <w:ind w:left="432" w:hanging="432"/>
+        <w:jc w:val="both"/>
+      </w:pPr>
+      <w:hyperlink r:id="rId47">
+        <w:r>
+          <w:rPr>
+            <w:rFonts w:ascii="Times New Roman" w:hAnsi="Times New Roman" w:eastAsia="Times New Roman" w:cs="Times New Roman"/>
+            <w:color w:val="000000"/>
+            <w:u w:val="none"/>
+            <w:sz w:val="22"/>
+          </w:rPr>
+          <w:t xml:space="preserve">27. </w:t>
+        </w:r>
+      </w:hyperlink>
+      <w:r>
+        <w:rPr>
+          <w:rFonts w:ascii="Times New Roman" w:hAnsi="Times New Roman" w:eastAsia="Times New Roman" w:cs="Times New Roman"/>
+          <w:b w:val="0"/>
+          <w:i w:val="0"/>
+          <w:sz w:val="22"/>
+        </w:rPr>
+        <w:t>DUMINICĂ, Alexandru, and Alin PUNCIOIU. Advanced Endpoint Protection Solution for Real-Time Defense against Cyber Threats. Journal of Military Technology Vol 9, no. 1 (2026).</w:t>
+      </w:r>
+    </w:p>
+    <w:p>
+      <w:pPr>
+        <w:spacing w:line="276" w:lineRule="auto" w:after="40"/>
+        <w:ind w:left="432" w:hanging="432"/>
+        <w:jc w:val="both"/>
+      </w:pPr>
+      <w:hyperlink r:id="rId48">
+        <w:r>
+          <w:rPr>
+            <w:rFonts w:ascii="Times New Roman" w:hAnsi="Times New Roman" w:eastAsia="Times New Roman" w:cs="Times New Roman"/>
+            <w:color w:val="000000"/>
+            <w:u w:val="none"/>
+            <w:sz w:val="22"/>
+          </w:rPr>
+          <w:t xml:space="preserve">28. </w:t>
+        </w:r>
+      </w:hyperlink>
+      <w:r>
+        <w:rPr>
+          <w:rFonts w:ascii="Times New Roman" w:hAnsi="Times New Roman" w:eastAsia="Times New Roman" w:cs="Times New Roman"/>
+          <w:b w:val="0"/>
+          <w:i w:val="0"/>
+          <w:sz w:val="22"/>
+        </w:rPr>
+        <w:t>Du, Jiajia, Songtao Liu, Cheng Zhi, Junfan Zhao, Hua Wu, and Guang Cheng. TunnelEye: An Explainable Framework for Real-Time Detection of Malicious DoH Traffic in High-Speed Backbone Networks. Transactions on Network and Service Management 23 (2026): 3977-3997.</w:t>
+      </w:r>
+    </w:p>
+    <w:p>
+      <w:pPr>
+        <w:spacing w:line="276" w:lineRule="auto" w:after="40"/>
+        <w:ind w:left="432" w:hanging="432"/>
+        <w:jc w:val="both"/>
+      </w:pPr>
+      <w:hyperlink r:id="rId49">
+        <w:r>
+          <w:rPr>
+            <w:rFonts w:ascii="Times New Roman" w:hAnsi="Times New Roman" w:eastAsia="Times New Roman" w:cs="Times New Roman"/>
+            <w:color w:val="000000"/>
+            <w:u w:val="none"/>
+            <w:sz w:val="22"/>
+          </w:rPr>
+          <w:t xml:space="preserve">29. </w:t>
+        </w:r>
+      </w:hyperlink>
+      <w:r>
+        <w:rPr>
+          <w:rFonts w:ascii="Times New Roman" w:hAnsi="Times New Roman" w:eastAsia="Times New Roman" w:cs="Times New Roman"/>
+          <w:b w:val="0"/>
+          <w:i w:val="0"/>
+          <w:sz w:val="22"/>
+        </w:rPr>
+        <w:t>Ali, Basharat, and Guihai Chen. Mirage-doh: Metamorphic intelligence and resilient ai grid for autonomous governance of encrypted dns. Transactions on Network and Service Management 23 (2026): 3780-3804.</w:t>
+      </w:r>
+    </w:p>
+    <w:p>
+      <w:pPr>
+        <w:spacing w:line="276" w:lineRule="auto" w:after="40"/>
+        <w:ind w:left="432" w:hanging="432"/>
+        <w:jc w:val="both"/>
+      </w:pPr>
+      <w:hyperlink r:id="rId50">
+        <w:r>
+          <w:rPr>
+            <w:rFonts w:ascii="Times New Roman" w:hAnsi="Times New Roman" w:eastAsia="Times New Roman" w:cs="Times New Roman"/>
+            <w:color w:val="000000"/>
+            <w:u w:val="none"/>
+            <w:sz w:val="22"/>
+          </w:rPr>
+          <w:t xml:space="preserve">30. </w:t>
+        </w:r>
+      </w:hyperlink>
+      <w:r>
+        <w:rPr>
+          <w:rFonts w:ascii="Times New Roman" w:hAnsi="Times New Roman" w:eastAsia="Times New Roman" w:cs="Times New Roman"/>
+          <w:b w:val="0"/>
+          <w:i w:val="0"/>
+          <w:sz w:val="22"/>
+        </w:rPr>
+        <w:t>Sammour, Mahmoud, Mohd Fairuz Iskandar Othman, Aslinda Hassan, Omar Bhais, and Mohammed Saad Talib. Advanced DNS tunneling detection: a hybrid reinforcement learning and metaheuristic approach. Frontiers in Computer Science 7 (2025): 1728980.</w:t>
+      </w:r>
+    </w:p>
+    <w:p>
+      <w:pPr>
+        <w:spacing w:line="276" w:lineRule="auto" w:after="40"/>
+        <w:ind w:left="432" w:hanging="432"/>
+        <w:jc w:val="both"/>
+      </w:pPr>
+      <w:hyperlink r:id="rId51">
+        <w:r>
+          <w:rPr>
+            <w:rFonts w:ascii="Times New Roman" w:hAnsi="Times New Roman" w:eastAsia="Times New Roman" w:cs="Times New Roman"/>
+            <w:color w:val="000000"/>
+            <w:u w:val="none"/>
+            <w:sz w:val="22"/>
+          </w:rPr>
+          <w:t xml:space="preserve">31. </w:t>
+        </w:r>
+      </w:hyperlink>
+      <w:r>
+        <w:rPr>
+          <w:rFonts w:ascii="Times New Roman" w:hAnsi="Times New Roman" w:eastAsia="Times New Roman" w:cs="Times New Roman"/>
+          <w:b w:val="0"/>
+          <w:i w:val="0"/>
+          <w:sz w:val="22"/>
+        </w:rPr>
+        <w:t>Batool, Komal. Make It Easy: Enhanced Detection of DNS Tunneling Tools over DoH Using Standard Flow Features. Network and System Security: 19th International Conference, NSS 2025, Wuhan, China, December 5–7, 2025, Proceedings, p. 1. 2026.</w:t>
+      </w:r>
+    </w:p>
+    <w:p>
+      <w:pPr>
+        <w:spacing w:line="276" w:lineRule="auto" w:after="40"/>
+        <w:ind w:left="432" w:hanging="432"/>
+        <w:jc w:val="both"/>
+      </w:pPr>
+      <w:hyperlink r:id="rId52">
+        <w:r>
+          <w:rPr>
+            <w:rFonts w:ascii="Times New Roman" w:hAnsi="Times New Roman" w:eastAsia="Times New Roman" w:cs="Times New Roman"/>
+            <w:color w:val="000000"/>
+            <w:u w:val="none"/>
+            <w:sz w:val="22"/>
+          </w:rPr>
+          <w:t xml:space="preserve">32. </w:t>
+        </w:r>
+      </w:hyperlink>
+      <w:r>
+        <w:rPr>
+          <w:rFonts w:ascii="Times New Roman" w:hAnsi="Times New Roman" w:eastAsia="Times New Roman" w:cs="Times New Roman"/>
+          <w:b w:val="0"/>
+          <w:i w:val="0"/>
+          <w:sz w:val="22"/>
+        </w:rPr>
+        <w:t>Tong, Jiacheng, Yilin Zhao, Chongju Jin, Wei Chen, Yiting Zhang, and Lifa Wu. An adaptive DoH encrypted tunnel detection method based on contrastive learning. Internet of Things Journal 12, no. 13 (2025): 25936-25950.</w:t>
+      </w:r>
+    </w:p>
+    <w:p>
+      <w:pPr>
+        <w:spacing w:line="276" w:lineRule="auto" w:after="40"/>
+        <w:ind w:left="432" w:hanging="432"/>
+        <w:jc w:val="both"/>
+      </w:pPr>
+      <w:hyperlink r:id="rId53">
+        <w:r>
+          <w:rPr>
+            <w:rFonts w:ascii="Times New Roman" w:hAnsi="Times New Roman" w:eastAsia="Times New Roman" w:cs="Times New Roman"/>
+            <w:color w:val="000000"/>
+            <w:u w:val="none"/>
+            <w:sz w:val="22"/>
+          </w:rPr>
+          <w:t xml:space="preserve">33. </w:t>
+        </w:r>
+      </w:hyperlink>
+      <w:r>
+        <w:rPr>
+          <w:rFonts w:ascii="Times New Roman" w:hAnsi="Times New Roman" w:eastAsia="Times New Roman" w:cs="Times New Roman"/>
+          <w:b w:val="0"/>
+          <w:i w:val="0"/>
+          <w:sz w:val="22"/>
+        </w:rPr>
         <w:t>Mohammed, Yasir Faraj. Network-based detection and prevention system against DNS-based attacks. 2021.</w:t>
       </w:r>
     </w:p>
@@ -6753,15 +8625,17 @@
         <w:ind w:left="432" w:hanging="432"/>
         <w:jc w:val="both"/>
       </w:pPr>
-      <w:r>
-        <w:rPr>
-          <w:rFonts w:ascii="Times New Roman" w:hAnsi="Times New Roman" w:eastAsia="Times New Roman" w:cs="Times New Roman"/>
-          <w:b w:val="0"/>
-          <w:i w:val="0"/>
-          <w:sz w:val="22"/>
-        </w:rPr>
-        <w:t xml:space="preserve">11. </w:t>
-      </w:r>
+      <w:hyperlink r:id="rId54">
+        <w:r>
+          <w:rPr>
+            <w:rFonts w:ascii="Times New Roman" w:hAnsi="Times New Roman" w:eastAsia="Times New Roman" w:cs="Times New Roman"/>
+            <w:color w:val="000000"/>
+            <w:u w:val="none"/>
+            <w:sz w:val="22"/>
+          </w:rPr>
+          <w:t xml:space="preserve">34. </w:t>
+        </w:r>
+      </w:hyperlink>
       <w:r>
         <w:rPr>
           <w:rFonts w:ascii="Times New Roman" w:hAnsi="Times New Roman" w:eastAsia="Times New Roman" w:cs="Times New Roman"/>
@@ -6778,15 +8652,17 @@
         <w:ind w:left="432" w:hanging="432"/>
         <w:jc w:val="both"/>
       </w:pPr>
-      <w:r>
-        <w:rPr>
-          <w:rFonts w:ascii="Times New Roman" w:hAnsi="Times New Roman" w:eastAsia="Times New Roman" w:cs="Times New Roman"/>
-          <w:b w:val="0"/>
-          <w:i w:val="0"/>
-          <w:sz w:val="22"/>
-        </w:rPr>
-        <w:t xml:space="preserve">12. </w:t>
-      </w:r>
+      <w:hyperlink r:id="rId55">
+        <w:r>
+          <w:rPr>
+            <w:rFonts w:ascii="Times New Roman" w:hAnsi="Times New Roman" w:eastAsia="Times New Roman" w:cs="Times New Roman"/>
+            <w:color w:val="000000"/>
+            <w:u w:val="none"/>
+            <w:sz w:val="22"/>
+          </w:rPr>
+          <w:t xml:space="preserve">35. </w:t>
+        </w:r>
+      </w:hyperlink>
       <w:r>
         <w:rPr>
           <w:rFonts w:ascii="Times New Roman" w:hAnsi="Times New Roman" w:eastAsia="Times New Roman" w:cs="Times New Roman"/>
@@ -6803,40 +8679,17 @@
         <w:ind w:left="432" w:hanging="432"/>
         <w:jc w:val="both"/>
       </w:pPr>
-      <w:r>
-        <w:rPr>
-          <w:rFonts w:ascii="Times New Roman" w:hAnsi="Times New Roman" w:eastAsia="Times New Roman" w:cs="Times New Roman"/>
-          <w:b w:val="0"/>
-          <w:i w:val="0"/>
-          <w:sz w:val="22"/>
-        </w:rPr>
-        <w:t xml:space="preserve">13. </w:t>
-      </w:r>
-      <w:r>
-        <w:rPr>
-          <w:rFonts w:ascii="Times New Roman" w:hAnsi="Times New Roman" w:eastAsia="Times New Roman" w:cs="Times New Roman"/>
-          <w:b w:val="0"/>
-          <w:i w:val="0"/>
-          <w:sz w:val="22"/>
-        </w:rPr>
-        <w:t>Dietrich, Christian J., Christian Rossow, Felix C. Freiling, Herbert Bos, Maarten Van Steen, and Norbert Pohlmann. On botnets that use DNS for command and control. In 2011 seventh european conference on computer network defense, pp. 9-16. 2011.</w:t>
-      </w:r>
-    </w:p>
-    <w:p>
-      <w:pPr>
-        <w:spacing w:line="276" w:lineRule="auto" w:after="40"/>
-        <w:ind w:left="432" w:hanging="432"/>
-        <w:jc w:val="both"/>
-      </w:pPr>
-      <w:r>
-        <w:rPr>
-          <w:rFonts w:ascii="Times New Roman" w:hAnsi="Times New Roman" w:eastAsia="Times New Roman" w:cs="Times New Roman"/>
-          <w:b w:val="0"/>
-          <w:i w:val="0"/>
-          <w:sz w:val="22"/>
-        </w:rPr>
-        <w:t xml:space="preserve">14. </w:t>
-      </w:r>
+      <w:hyperlink r:id="rId56">
+        <w:r>
+          <w:rPr>
+            <w:rFonts w:ascii="Times New Roman" w:hAnsi="Times New Roman" w:eastAsia="Times New Roman" w:cs="Times New Roman"/>
+            <w:color w:val="000000"/>
+            <w:u w:val="none"/>
+            <w:sz w:val="22"/>
+          </w:rPr>
+          <w:t xml:space="preserve">36. </w:t>
+        </w:r>
+      </w:hyperlink>
       <w:r>
         <w:rPr>
           <w:rFonts w:ascii="Times New Roman" w:hAnsi="Times New Roman" w:eastAsia="Times New Roman" w:cs="Times New Roman"/>
@@ -6853,65 +8706,17 @@
         <w:ind w:left="432" w:hanging="432"/>
         <w:jc w:val="both"/>
       </w:pPr>
-      <w:r>
-        <w:rPr>
-          <w:rFonts w:ascii="Times New Roman" w:hAnsi="Times New Roman" w:eastAsia="Times New Roman" w:cs="Times New Roman"/>
-          <w:b w:val="0"/>
-          <w:i w:val="0"/>
-          <w:sz w:val="22"/>
-        </w:rPr>
-        <w:t xml:space="preserve">15. </w:t>
-      </w:r>
-      <w:r>
-        <w:rPr>
-          <w:rFonts w:ascii="Times New Roman" w:hAnsi="Times New Roman" w:eastAsia="Times New Roman" w:cs="Times New Roman"/>
-          <w:b w:val="0"/>
-          <w:i w:val="0"/>
-          <w:sz w:val="22"/>
-        </w:rPr>
-        <w:t>Sa’ad, Umar, Demeke Shumeye Lakew, Nhu-Ngoc Dao, and Sungrae Cho. Herald: Hybrid ensemble approach for robust anomaly detection in encrypted dns traffic. Journal of Network and Computer Applications (2025): 104342.</w:t>
-      </w:r>
-    </w:p>
-    <w:p>
-      <w:pPr>
-        <w:spacing w:line="276" w:lineRule="auto" w:after="40"/>
-        <w:ind w:left="432" w:hanging="432"/>
-        <w:jc w:val="both"/>
-      </w:pPr>
-      <w:r>
-        <w:rPr>
-          <w:rFonts w:ascii="Times New Roman" w:hAnsi="Times New Roman" w:eastAsia="Times New Roman" w:cs="Times New Roman"/>
-          <w:b w:val="0"/>
-          <w:i w:val="0"/>
-          <w:sz w:val="22"/>
-        </w:rPr>
-        <w:t xml:space="preserve">16. </w:t>
-      </w:r>
-      <w:r>
-        <w:rPr>
-          <w:rFonts w:ascii="Times New Roman" w:hAnsi="Times New Roman" w:eastAsia="Times New Roman" w:cs="Times New Roman"/>
-          <w:b w:val="0"/>
-          <w:i w:val="0"/>
-          <w:sz w:val="22"/>
-        </w:rPr>
-        <w:t>Liu, Yong, and Xiangnan Gou. Research on application of feature analysis method in DNS tunnel detection. Journal of Physics: Conference Series, vol. 1575, no. 1, p. 012069. 2020.</w:t>
-      </w:r>
-    </w:p>
-    <w:p>
-      <w:pPr>
-        <w:spacing w:line="276" w:lineRule="auto" w:after="40"/>
-        <w:ind w:left="432" w:hanging="432"/>
-        <w:jc w:val="both"/>
-      </w:pPr>
-      <w:r>
-        <w:rPr>
-          <w:rFonts w:ascii="Times New Roman" w:hAnsi="Times New Roman" w:eastAsia="Times New Roman" w:cs="Times New Roman"/>
-          <w:b w:val="0"/>
-          <w:i w:val="0"/>
-          <w:sz w:val="22"/>
-        </w:rPr>
-        <w:t xml:space="preserve">17. </w:t>
-      </w:r>
+      <w:hyperlink r:id="rId57">
+        <w:r>
+          <w:rPr>
+            <w:rFonts w:ascii="Times New Roman" w:hAnsi="Times New Roman" w:eastAsia="Times New Roman" w:cs="Times New Roman"/>
+            <w:color w:val="000000"/>
+            <w:u w:val="none"/>
+            <w:sz w:val="22"/>
+          </w:rPr>
+          <w:t xml:space="preserve">37. </w:t>
+        </w:r>
+      </w:hyperlink>
       <w:r>
         <w:rPr>
           <w:rFonts w:ascii="Times New Roman" w:hAnsi="Times New Roman" w:eastAsia="Times New Roman" w:cs="Times New Roman"/>
@@ -6928,15 +8733,17 @@
         <w:ind w:left="432" w:hanging="432"/>
         <w:jc w:val="both"/>
       </w:pPr>
-      <w:r>
-        <w:rPr>
-          <w:rFonts w:ascii="Times New Roman" w:hAnsi="Times New Roman" w:eastAsia="Times New Roman" w:cs="Times New Roman"/>
-          <w:b w:val="0"/>
-          <w:i w:val="0"/>
-          <w:sz w:val="22"/>
-        </w:rPr>
-        <w:t xml:space="preserve">18. </w:t>
-      </w:r>
+      <w:hyperlink r:id="rId58">
+        <w:r>
+          <w:rPr>
+            <w:rFonts w:ascii="Times New Roman" w:hAnsi="Times New Roman" w:eastAsia="Times New Roman" w:cs="Times New Roman"/>
+            <w:color w:val="000000"/>
+            <w:u w:val="none"/>
+            <w:sz w:val="22"/>
+          </w:rPr>
+          <w:t xml:space="preserve">38. </w:t>
+        </w:r>
+      </w:hyperlink>
       <w:r>
         <w:rPr>
           <w:rFonts w:ascii="Times New Roman" w:hAnsi="Times New Roman" w:eastAsia="Times New Roman" w:cs="Times New Roman"/>
@@ -6953,15 +8760,17 @@
         <w:ind w:left="432" w:hanging="432"/>
         <w:jc w:val="both"/>
       </w:pPr>
-      <w:r>
-        <w:rPr>
-          <w:rFonts w:ascii="Times New Roman" w:hAnsi="Times New Roman" w:eastAsia="Times New Roman" w:cs="Times New Roman"/>
-          <w:b w:val="0"/>
-          <w:i w:val="0"/>
-          <w:sz w:val="22"/>
-        </w:rPr>
-        <w:t xml:space="preserve">19. </w:t>
-      </w:r>
+      <w:hyperlink r:id="rId59">
+        <w:r>
+          <w:rPr>
+            <w:rFonts w:ascii="Times New Roman" w:hAnsi="Times New Roman" w:eastAsia="Times New Roman" w:cs="Times New Roman"/>
+            <w:color w:val="000000"/>
+            <w:u w:val="none"/>
+            <w:sz w:val="22"/>
+          </w:rPr>
+          <w:t xml:space="preserve">39. </w:t>
+        </w:r>
+      </w:hyperlink>
       <w:r>
         <w:rPr>
           <w:rFonts w:ascii="Times New Roman" w:hAnsi="Times New Roman" w:eastAsia="Times New Roman" w:cs="Times New Roman"/>
@@ -6978,40 +8787,17 @@
         <w:ind w:left="432" w:hanging="432"/>
         <w:jc w:val="both"/>
       </w:pPr>
-      <w:r>
-        <w:rPr>
-          <w:rFonts w:ascii="Times New Roman" w:hAnsi="Times New Roman" w:eastAsia="Times New Roman" w:cs="Times New Roman"/>
-          <w:b w:val="0"/>
-          <w:i w:val="0"/>
-          <w:sz w:val="22"/>
-        </w:rPr>
-        <w:t xml:space="preserve">20. </w:t>
-      </w:r>
-      <w:r>
-        <w:rPr>
-          <w:rFonts w:ascii="Times New Roman" w:hAnsi="Times New Roman" w:eastAsia="Times New Roman" w:cs="Times New Roman"/>
-          <w:b w:val="0"/>
-          <w:i w:val="0"/>
-          <w:sz w:val="22"/>
-        </w:rPr>
-        <w:t>De Bernardi, Giacomo, Giovanni Battista Gaggero, Fabio Patrone, Sandro Zappatore, Mario Marchese, and Maurizio Mongelli. Rule-based eXplainable autoencoder for DNS tunneling detection. Computers 14, no. 9 (2025): 375.</w:t>
-      </w:r>
-    </w:p>
-    <w:p>
-      <w:pPr>
-        <w:spacing w:line="276" w:lineRule="auto" w:after="40"/>
-        <w:ind w:left="432" w:hanging="432"/>
-        <w:jc w:val="both"/>
-      </w:pPr>
-      <w:r>
-        <w:rPr>
-          <w:rFonts w:ascii="Times New Roman" w:hAnsi="Times New Roman" w:eastAsia="Times New Roman" w:cs="Times New Roman"/>
-          <w:b w:val="0"/>
-          <w:i w:val="0"/>
-          <w:sz w:val="22"/>
-        </w:rPr>
-        <w:t xml:space="preserve">21. </w:t>
-      </w:r>
+      <w:hyperlink r:id="rId60">
+        <w:r>
+          <w:rPr>
+            <w:rFonts w:ascii="Times New Roman" w:hAnsi="Times New Roman" w:eastAsia="Times New Roman" w:cs="Times New Roman"/>
+            <w:color w:val="000000"/>
+            <w:u w:val="none"/>
+            <w:sz w:val="22"/>
+          </w:rPr>
+          <w:t xml:space="preserve">40. </w:t>
+        </w:r>
+      </w:hyperlink>
       <w:r>
         <w:rPr>
           <w:rFonts w:ascii="Times New Roman" w:hAnsi="Times New Roman" w:eastAsia="Times New Roman" w:cs="Times New Roman"/>
@@ -7028,40 +8814,17 @@
         <w:ind w:left="432" w:hanging="432"/>
         <w:jc w:val="both"/>
       </w:pPr>
-      <w:r>
-        <w:rPr>
-          <w:rFonts w:ascii="Times New Roman" w:hAnsi="Times New Roman" w:eastAsia="Times New Roman" w:cs="Times New Roman"/>
-          <w:b w:val="0"/>
-          <w:i w:val="0"/>
-          <w:sz w:val="22"/>
-        </w:rPr>
-        <w:t xml:space="preserve">22. </w:t>
-      </w:r>
-      <w:r>
-        <w:rPr>
-          <w:rFonts w:ascii="Times New Roman" w:hAnsi="Times New Roman" w:eastAsia="Times New Roman" w:cs="Times New Roman"/>
-          <w:b w:val="0"/>
-          <w:i w:val="0"/>
-          <w:sz w:val="22"/>
-        </w:rPr>
-        <w:t>Karthik, Valaji Veera Venkata, Thallapalli Vikranth, Sunku Suhash, and Thupakula Gangadhar Reddy. DNS Tunneling Detection using Temporal Convolutional Network and Attention Layers. In 2025 5th International Conference on Evolutionary Computing and Mobile Sustainable Networks (ICECMSN), pp. 353-357. 2025.</w:t>
-      </w:r>
-    </w:p>
-    <w:p>
-      <w:pPr>
-        <w:spacing w:line="276" w:lineRule="auto" w:after="40"/>
-        <w:ind w:left="432" w:hanging="432"/>
-        <w:jc w:val="both"/>
-      </w:pPr>
-      <w:r>
-        <w:rPr>
-          <w:rFonts w:ascii="Times New Roman" w:hAnsi="Times New Roman" w:eastAsia="Times New Roman" w:cs="Times New Roman"/>
-          <w:b w:val="0"/>
-          <w:i w:val="0"/>
-          <w:sz w:val="22"/>
-        </w:rPr>
-        <w:t xml:space="preserve">23. </w:t>
-      </w:r>
+      <w:hyperlink r:id="rId61">
+        <w:r>
+          <w:rPr>
+            <w:rFonts w:ascii="Times New Roman" w:hAnsi="Times New Roman" w:eastAsia="Times New Roman" w:cs="Times New Roman"/>
+            <w:color w:val="000000"/>
+            <w:u w:val="none"/>
+            <w:sz w:val="22"/>
+          </w:rPr>
+          <w:t xml:space="preserve">41. </w:t>
+        </w:r>
+      </w:hyperlink>
       <w:r>
         <w:rPr>
           <w:rFonts w:ascii="Times New Roman" w:hAnsi="Times New Roman" w:eastAsia="Times New Roman" w:cs="Times New Roman"/>
@@ -7078,90 +8841,17 @@
         <w:ind w:left="432" w:hanging="432"/>
         <w:jc w:val="both"/>
       </w:pPr>
-      <w:r>
-        <w:rPr>
-          <w:rFonts w:ascii="Times New Roman" w:hAnsi="Times New Roman" w:eastAsia="Times New Roman" w:cs="Times New Roman"/>
-          <w:b w:val="0"/>
-          <w:i w:val="0"/>
-          <w:sz w:val="22"/>
-        </w:rPr>
-        <w:t xml:space="preserve">24. </w:t>
-      </w:r>
-      <w:r>
-        <w:rPr>
-          <w:rFonts w:ascii="Times New Roman" w:hAnsi="Times New Roman" w:eastAsia="Times New Roman" w:cs="Times New Roman"/>
-          <w:b w:val="0"/>
-          <w:i w:val="0"/>
-          <w:sz w:val="22"/>
-        </w:rPr>
-        <w:t>Tong, Jiacheng, Yilin Zhao, Chongju Jin, Wei Chen, Yiting Zhang, and Lifa Wu. An adaptive DoH encrypted tunnel detection method based on contrastive learning. Internet of Things Journal 12, no. 13 (2025): 25936-25950.</w:t>
-      </w:r>
-    </w:p>
-    <w:p>
-      <w:pPr>
-        <w:spacing w:line="276" w:lineRule="auto" w:after="40"/>
-        <w:ind w:left="432" w:hanging="432"/>
-        <w:jc w:val="both"/>
-      </w:pPr>
-      <w:r>
-        <w:rPr>
-          <w:rFonts w:ascii="Times New Roman" w:hAnsi="Times New Roman" w:eastAsia="Times New Roman" w:cs="Times New Roman"/>
-          <w:b w:val="0"/>
-          <w:i w:val="0"/>
-          <w:sz w:val="22"/>
-        </w:rPr>
-        <w:t xml:space="preserve">25. </w:t>
-      </w:r>
-      <w:r>
-        <w:rPr>
-          <w:rFonts w:ascii="Times New Roman" w:hAnsi="Times New Roman" w:eastAsia="Times New Roman" w:cs="Times New Roman"/>
-          <w:b w:val="0"/>
-          <w:i w:val="0"/>
-          <w:sz w:val="22"/>
-        </w:rPr>
-        <w:t>Lyu, Xinchen. Detecting and Mitigating DNS Exfiltration Attacks in Real-Time Using Ensemble Deep Learning Models. (2026).</w:t>
-      </w:r>
-    </w:p>
-    <w:p>
-      <w:pPr>
-        <w:spacing w:line="276" w:lineRule="auto" w:after="40"/>
-        <w:ind w:left="432" w:hanging="432"/>
-        <w:jc w:val="both"/>
-      </w:pPr>
-      <w:r>
-        <w:rPr>
-          <w:rFonts w:ascii="Times New Roman" w:hAnsi="Times New Roman" w:eastAsia="Times New Roman" w:cs="Times New Roman"/>
-          <w:b w:val="0"/>
-          <w:i w:val="0"/>
-          <w:sz w:val="22"/>
-        </w:rPr>
-        <w:t xml:space="preserve">26. </w:t>
-      </w:r>
-      <w:r>
-        <w:rPr>
-          <w:rFonts w:ascii="Times New Roman" w:hAnsi="Times New Roman" w:eastAsia="Times New Roman" w:cs="Times New Roman"/>
-          <w:b w:val="0"/>
-          <w:i w:val="0"/>
-          <w:sz w:val="22"/>
-        </w:rPr>
-        <w:t>Al Musa, Mohammad, and Ismail Altaharwa. Stealth at the Edge: A High-Throughput, ML-Resistant DNS Covert Channel via Direct UDP and Algorithmic Phonotactics. In 2026 Jordan Conference on Applied Electrical Engineering and Computing Technologies (AEECT), pp. 291-296. 2026.</w:t>
-      </w:r>
-    </w:p>
-    <w:p>
-      <w:pPr>
-        <w:spacing w:line="276" w:lineRule="auto" w:after="40"/>
-        <w:ind w:left="432" w:hanging="432"/>
-        <w:jc w:val="both"/>
-      </w:pPr>
-      <w:r>
-        <w:rPr>
-          <w:rFonts w:ascii="Times New Roman" w:hAnsi="Times New Roman" w:eastAsia="Times New Roman" w:cs="Times New Roman"/>
-          <w:b w:val="0"/>
-          <w:i w:val="0"/>
-          <w:sz w:val="22"/>
-        </w:rPr>
-        <w:t xml:space="preserve">27. </w:t>
-      </w:r>
+      <w:hyperlink r:id="rId62">
+        <w:r>
+          <w:rPr>
+            <w:rFonts w:ascii="Times New Roman" w:hAnsi="Times New Roman" w:eastAsia="Times New Roman" w:cs="Times New Roman"/>
+            <w:color w:val="000000"/>
+            <w:u w:val="none"/>
+            <w:sz w:val="22"/>
+          </w:rPr>
+          <w:t xml:space="preserve">42. </w:t>
+        </w:r>
+      </w:hyperlink>
       <w:r>
         <w:rPr>
           <w:rFonts w:ascii="Times New Roman" w:hAnsi="Times New Roman" w:eastAsia="Times New Roman" w:cs="Times New Roman"/>
@@ -7178,90 +8868,17 @@
         <w:ind w:left="432" w:hanging="432"/>
         <w:jc w:val="both"/>
       </w:pPr>
-      <w:r>
-        <w:rPr>
-          <w:rFonts w:ascii="Times New Roman" w:hAnsi="Times New Roman" w:eastAsia="Times New Roman" w:cs="Times New Roman"/>
-          <w:b w:val="0"/>
-          <w:i w:val="0"/>
-          <w:sz w:val="22"/>
-        </w:rPr>
-        <w:t xml:space="preserve">28. </w:t>
-      </w:r>
-      <w:r>
-        <w:rPr>
-          <w:rFonts w:ascii="Times New Roman" w:hAnsi="Times New Roman" w:eastAsia="Times New Roman" w:cs="Times New Roman"/>
-          <w:b w:val="0"/>
-          <w:i w:val="0"/>
-          <w:sz w:val="22"/>
-        </w:rPr>
-        <w:t>Abualghanam, Orieb, Hadeel Alazzam, Basima Elshqeirat, Mohammad Qatawneh, and Mohammed Amin Almaiah. Real-time detection system for data exfiltration over DNS tunneling using machine learning. Electronics 12, no. 6 (2023): 1467.</w:t>
-      </w:r>
-    </w:p>
-    <w:p>
-      <w:pPr>
-        <w:spacing w:line="276" w:lineRule="auto" w:after="40"/>
-        <w:ind w:left="432" w:hanging="432"/>
-        <w:jc w:val="both"/>
-      </w:pPr>
-      <w:r>
-        <w:rPr>
-          <w:rFonts w:ascii="Times New Roman" w:hAnsi="Times New Roman" w:eastAsia="Times New Roman" w:cs="Times New Roman"/>
-          <w:b w:val="0"/>
-          <w:i w:val="0"/>
-          <w:sz w:val="22"/>
-        </w:rPr>
-        <w:t xml:space="preserve">29. </w:t>
-      </w:r>
-      <w:r>
-        <w:rPr>
-          <w:rFonts w:ascii="Times New Roman" w:hAnsi="Times New Roman" w:eastAsia="Times New Roman" w:cs="Times New Roman"/>
-          <w:b w:val="0"/>
-          <w:i w:val="0"/>
-          <w:sz w:val="22"/>
-        </w:rPr>
-        <w:t>Sammour, Mahmoud, Mohd Fairuz Iskandar Othman, Aslinda Hassan, Omar Bhais, and Mohammed Saad Talib. Advanced DNS tunneling detection: a hybrid reinforcement learning and metaheuristic approach. Frontiers in Computer Science 7 (2025): 1728980.</w:t>
-      </w:r>
-    </w:p>
-    <w:p>
-      <w:pPr>
-        <w:spacing w:line="276" w:lineRule="auto" w:after="40"/>
-        <w:ind w:left="432" w:hanging="432"/>
-        <w:jc w:val="both"/>
-      </w:pPr>
-      <w:r>
-        <w:rPr>
-          <w:rFonts w:ascii="Times New Roman" w:hAnsi="Times New Roman" w:eastAsia="Times New Roman" w:cs="Times New Roman"/>
-          <w:b w:val="0"/>
-          <w:i w:val="0"/>
-          <w:sz w:val="22"/>
-        </w:rPr>
-        <w:t xml:space="preserve">30. </w:t>
-      </w:r>
-      <w:r>
-        <w:rPr>
-          <w:rFonts w:ascii="Times New Roman" w:hAnsi="Times New Roman" w:eastAsia="Times New Roman" w:cs="Times New Roman"/>
-          <w:b w:val="0"/>
-          <w:i w:val="0"/>
-          <w:sz w:val="22"/>
-        </w:rPr>
-        <w:t>Alkasassbeh, Mouhammd, and Mohammad Almseidin. Machine learning techniques for accurately detecting the DNS tunneling. Science and Information Conference, pp. 352-364. 2023.</w:t>
-      </w:r>
-    </w:p>
-    <w:p>
-      <w:pPr>
-        <w:spacing w:line="276" w:lineRule="auto" w:after="40"/>
-        <w:ind w:left="432" w:hanging="432"/>
-        <w:jc w:val="both"/>
-      </w:pPr>
-      <w:r>
-        <w:rPr>
-          <w:rFonts w:ascii="Times New Roman" w:hAnsi="Times New Roman" w:eastAsia="Times New Roman" w:cs="Times New Roman"/>
-          <w:b w:val="0"/>
-          <w:i w:val="0"/>
-          <w:sz w:val="22"/>
-        </w:rPr>
-        <w:t xml:space="preserve">31. </w:t>
-      </w:r>
+      <w:hyperlink r:id="rId63">
+        <w:r>
+          <w:rPr>
+            <w:rFonts w:ascii="Times New Roman" w:hAnsi="Times New Roman" w:eastAsia="Times New Roman" w:cs="Times New Roman"/>
+            <w:color w:val="000000"/>
+            <w:u w:val="none"/>
+            <w:sz w:val="22"/>
+          </w:rPr>
+          <w:t xml:space="preserve">43. </w:t>
+        </w:r>
+      </w:hyperlink>
       <w:r>
         <w:rPr>
           <w:rFonts w:ascii="Times New Roman" w:hAnsi="Times New Roman" w:eastAsia="Times New Roman" w:cs="Times New Roman"/>
@@ -7278,15 +8895,17 @@
         <w:ind w:left="432" w:hanging="432"/>
         <w:jc w:val="both"/>
       </w:pPr>
-      <w:r>
-        <w:rPr>
-          <w:rFonts w:ascii="Times New Roman" w:hAnsi="Times New Roman" w:eastAsia="Times New Roman" w:cs="Times New Roman"/>
-          <w:b w:val="0"/>
-          <w:i w:val="0"/>
-          <w:sz w:val="22"/>
-        </w:rPr>
-        <w:t xml:space="preserve">32. </w:t>
-      </w:r>
+      <w:hyperlink r:id="rId64">
+        <w:r>
+          <w:rPr>
+            <w:rFonts w:ascii="Times New Roman" w:hAnsi="Times New Roman" w:eastAsia="Times New Roman" w:cs="Times New Roman"/>
+            <w:color w:val="000000"/>
+            <w:u w:val="none"/>
+            <w:sz w:val="22"/>
+          </w:rPr>
+          <w:t xml:space="preserve">44. </w:t>
+        </w:r>
+      </w:hyperlink>
       <w:r>
         <w:rPr>
           <w:rFonts w:ascii="Times New Roman" w:hAnsi="Times New Roman" w:eastAsia="Times New Roman" w:cs="Times New Roman"/>
@@ -7303,15 +8922,17 @@
         <w:ind w:left="432" w:hanging="432"/>
         <w:jc w:val="both"/>
       </w:pPr>
-      <w:r>
-        <w:rPr>
-          <w:rFonts w:ascii="Times New Roman" w:hAnsi="Times New Roman" w:eastAsia="Times New Roman" w:cs="Times New Roman"/>
-          <w:b w:val="0"/>
-          <w:i w:val="0"/>
-          <w:sz w:val="22"/>
-        </w:rPr>
-        <w:t xml:space="preserve">33. </w:t>
-      </w:r>
+      <w:hyperlink r:id="rId65">
+        <w:r>
+          <w:rPr>
+            <w:rFonts w:ascii="Times New Roman" w:hAnsi="Times New Roman" w:eastAsia="Times New Roman" w:cs="Times New Roman"/>
+            <w:color w:val="000000"/>
+            <w:u w:val="none"/>
+            <w:sz w:val="22"/>
+          </w:rPr>
+          <w:t xml:space="preserve">45. </w:t>
+        </w:r>
+      </w:hyperlink>
       <w:r>
         <w:rPr>
           <w:rFonts w:ascii="Times New Roman" w:hAnsi="Times New Roman" w:eastAsia="Times New Roman" w:cs="Times New Roman"/>
@@ -7328,15 +8949,17 @@
         <w:ind w:left="432" w:hanging="432"/>
         <w:jc w:val="both"/>
       </w:pPr>
-      <w:r>
-        <w:rPr>
-          <w:rFonts w:ascii="Times New Roman" w:hAnsi="Times New Roman" w:eastAsia="Times New Roman" w:cs="Times New Roman"/>
-          <w:b w:val="0"/>
-          <w:i w:val="0"/>
-          <w:sz w:val="22"/>
-        </w:rPr>
-        <w:t xml:space="preserve">34. </w:t>
-      </w:r>
+      <w:hyperlink r:id="rId66">
+        <w:r>
+          <w:rPr>
+            <w:rFonts w:ascii="Times New Roman" w:hAnsi="Times New Roman" w:eastAsia="Times New Roman" w:cs="Times New Roman"/>
+            <w:color w:val="000000"/>
+            <w:u w:val="none"/>
+            <w:sz w:val="22"/>
+          </w:rPr>
+          <w:t xml:space="preserve">46. </w:t>
+        </w:r>
+      </w:hyperlink>
       <w:r>
         <w:rPr>
           <w:rFonts w:ascii="Times New Roman" w:hAnsi="Times New Roman" w:eastAsia="Times New Roman" w:cs="Times New Roman"/>
@@ -7353,15 +8976,17 @@
         <w:ind w:left="432" w:hanging="432"/>
         <w:jc w:val="both"/>
       </w:pPr>
-      <w:r>
-        <w:rPr>
-          <w:rFonts w:ascii="Times New Roman" w:hAnsi="Times New Roman" w:eastAsia="Times New Roman" w:cs="Times New Roman"/>
-          <w:b w:val="0"/>
-          <w:i w:val="0"/>
-          <w:sz w:val="22"/>
-        </w:rPr>
-        <w:t xml:space="preserve">35. </w:t>
-      </w:r>
+      <w:hyperlink r:id="rId67">
+        <w:r>
+          <w:rPr>
+            <w:rFonts w:ascii="Times New Roman" w:hAnsi="Times New Roman" w:eastAsia="Times New Roman" w:cs="Times New Roman"/>
+            <w:color w:val="000000"/>
+            <w:u w:val="none"/>
+            <w:sz w:val="22"/>
+          </w:rPr>
+          <w:t xml:space="preserve">47. </w:t>
+        </w:r>
+      </w:hyperlink>
       <w:r>
         <w:rPr>
           <w:rFonts w:ascii="Times New Roman" w:hAnsi="Times New Roman" w:eastAsia="Times New Roman" w:cs="Times New Roman"/>
@@ -7378,15 +9003,17 @@
         <w:ind w:left="432" w:hanging="432"/>
         <w:jc w:val="both"/>
       </w:pPr>
-      <w:r>
-        <w:rPr>
-          <w:rFonts w:ascii="Times New Roman" w:hAnsi="Times New Roman" w:eastAsia="Times New Roman" w:cs="Times New Roman"/>
-          <w:b w:val="0"/>
-          <w:i w:val="0"/>
-          <w:sz w:val="22"/>
-        </w:rPr>
-        <w:t xml:space="preserve">36. </w:t>
-      </w:r>
+      <w:hyperlink r:id="rId68">
+        <w:r>
+          <w:rPr>
+            <w:rFonts w:ascii="Times New Roman" w:hAnsi="Times New Roman" w:eastAsia="Times New Roman" w:cs="Times New Roman"/>
+            <w:color w:val="000000"/>
+            <w:u w:val="none"/>
+            <w:sz w:val="22"/>
+          </w:rPr>
+          <w:t xml:space="preserve">48. </w:t>
+        </w:r>
+      </w:hyperlink>
       <w:r>
         <w:rPr>
           <w:rFonts w:ascii="Times New Roman" w:hAnsi="Times New Roman" w:eastAsia="Times New Roman" w:cs="Times New Roman"/>
@@ -7403,15 +9030,17 @@
         <w:ind w:left="432" w:hanging="432"/>
         <w:jc w:val="both"/>
       </w:pPr>
-      <w:r>
-        <w:rPr>
-          <w:rFonts w:ascii="Times New Roman" w:hAnsi="Times New Roman" w:eastAsia="Times New Roman" w:cs="Times New Roman"/>
-          <w:b w:val="0"/>
-          <w:i w:val="0"/>
-          <w:sz w:val="22"/>
-        </w:rPr>
-        <w:t xml:space="preserve">37. </w:t>
-      </w:r>
+      <w:hyperlink r:id="rId69">
+        <w:r>
+          <w:rPr>
+            <w:rFonts w:ascii="Times New Roman" w:hAnsi="Times New Roman" w:eastAsia="Times New Roman" w:cs="Times New Roman"/>
+            <w:color w:val="000000"/>
+            <w:u w:val="none"/>
+            <w:sz w:val="22"/>
+          </w:rPr>
+          <w:t xml:space="preserve">49. </w:t>
+        </w:r>
+      </w:hyperlink>
       <w:r>
         <w:rPr>
           <w:rFonts w:ascii="Times New Roman" w:hAnsi="Times New Roman" w:eastAsia="Times New Roman" w:cs="Times New Roman"/>
@@ -7428,65 +9057,17 @@
         <w:ind w:left="432" w:hanging="432"/>
         <w:jc w:val="both"/>
       </w:pPr>
-      <w:r>
-        <w:rPr>
-          <w:rFonts w:ascii="Times New Roman" w:hAnsi="Times New Roman" w:eastAsia="Times New Roman" w:cs="Times New Roman"/>
-          <w:b w:val="0"/>
-          <w:i w:val="0"/>
-          <w:sz w:val="22"/>
-        </w:rPr>
-        <w:t xml:space="preserve">38. </w:t>
-      </w:r>
-      <w:r>
-        <w:rPr>
-          <w:rFonts w:ascii="Times New Roman" w:hAnsi="Times New Roman" w:eastAsia="Times New Roman" w:cs="Times New Roman"/>
-          <w:b w:val="0"/>
-          <w:i w:val="0"/>
-          <w:sz w:val="22"/>
-        </w:rPr>
-        <w:t>Bennett, Oliver, and Amelia Clarke. Behavioral Fingerprinting for Detecting Covert DNS Tunneling Activities in Enterprise Networks. China and WTO Review 12, no. 1 (2026).</w:t>
-      </w:r>
-    </w:p>
-    <w:p>
-      <w:pPr>
-        <w:spacing w:line="276" w:lineRule="auto" w:after="40"/>
-        <w:ind w:left="432" w:hanging="432"/>
-        <w:jc w:val="both"/>
-      </w:pPr>
-      <w:r>
-        <w:rPr>
-          <w:rFonts w:ascii="Times New Roman" w:hAnsi="Times New Roman" w:eastAsia="Times New Roman" w:cs="Times New Roman"/>
-          <w:b w:val="0"/>
-          <w:i w:val="0"/>
-          <w:sz w:val="22"/>
-        </w:rPr>
-        <w:t xml:space="preserve">39. </w:t>
-      </w:r>
-      <w:r>
-        <w:rPr>
-          <w:rFonts w:ascii="Times New Roman" w:hAnsi="Times New Roman" w:eastAsia="Times New Roman" w:cs="Times New Roman"/>
-          <w:b w:val="0"/>
-          <w:i w:val="0"/>
-          <w:sz w:val="22"/>
-        </w:rPr>
-        <w:t>Lal, Anushka, Ankit Prasad, Ankit Kumar, and Shailender Kumar. DNS-tunnet: A hybrid approach for DNS tunneling detection. In 2022 4th International Conference on Advances in Computer Technology, Information Science and Communications (CTISC), pp. 1-6. 2022.</w:t>
-      </w:r>
-    </w:p>
-    <w:p>
-      <w:pPr>
-        <w:spacing w:line="276" w:lineRule="auto" w:after="40"/>
-        <w:ind w:left="432" w:hanging="432"/>
-        <w:jc w:val="both"/>
-      </w:pPr>
-      <w:r>
-        <w:rPr>
-          <w:rFonts w:ascii="Times New Roman" w:hAnsi="Times New Roman" w:eastAsia="Times New Roman" w:cs="Times New Roman"/>
-          <w:b w:val="0"/>
-          <w:i w:val="0"/>
-          <w:sz w:val="22"/>
-        </w:rPr>
-        <w:t xml:space="preserve">40. </w:t>
-      </w:r>
+      <w:hyperlink r:id="rId70">
+        <w:r>
+          <w:rPr>
+            <w:rFonts w:ascii="Times New Roman" w:hAnsi="Times New Roman" w:eastAsia="Times New Roman" w:cs="Times New Roman"/>
+            <w:color w:val="000000"/>
+            <w:u w:val="none"/>
+            <w:sz w:val="22"/>
+          </w:rPr>
+          <w:t xml:space="preserve">50. </w:t>
+        </w:r>
+      </w:hyperlink>
       <w:r>
         <w:rPr>
           <w:rFonts w:ascii="Times New Roman" w:hAnsi="Times New Roman" w:eastAsia="Times New Roman" w:cs="Times New Roman"/>
@@ -7503,15 +9084,17 @@
         <w:ind w:left="432" w:hanging="432"/>
         <w:jc w:val="both"/>
       </w:pPr>
-      <w:r>
-        <w:rPr>
-          <w:rFonts w:ascii="Times New Roman" w:hAnsi="Times New Roman" w:eastAsia="Times New Roman" w:cs="Times New Roman"/>
-          <w:b w:val="0"/>
-          <w:i w:val="0"/>
-          <w:sz w:val="22"/>
-        </w:rPr>
-        <w:t xml:space="preserve">41. </w:t>
-      </w:r>
+      <w:hyperlink r:id="rId71">
+        <w:r>
+          <w:rPr>
+            <w:rFonts w:ascii="Times New Roman" w:hAnsi="Times New Roman" w:eastAsia="Times New Roman" w:cs="Times New Roman"/>
+            <w:color w:val="000000"/>
+            <w:u w:val="none"/>
+            <w:sz w:val="22"/>
+          </w:rPr>
+          <w:t xml:space="preserve">51. </w:t>
+        </w:r>
+      </w:hyperlink>
       <w:r>
         <w:rPr>
           <w:rFonts w:ascii="Times New Roman" w:hAnsi="Times New Roman" w:eastAsia="Times New Roman" w:cs="Times New Roman"/>
@@ -7528,15 +9111,17 @@
         <w:ind w:left="432" w:hanging="432"/>
         <w:jc w:val="both"/>
       </w:pPr>
-      <w:r>
-        <w:rPr>
-          <w:rFonts w:ascii="Times New Roman" w:hAnsi="Times New Roman" w:eastAsia="Times New Roman" w:cs="Times New Roman"/>
-          <w:b w:val="0"/>
-          <w:i w:val="0"/>
-          <w:sz w:val="22"/>
-        </w:rPr>
-        <w:t xml:space="preserve">42. </w:t>
-      </w:r>
+      <w:hyperlink r:id="rId72">
+        <w:r>
+          <w:rPr>
+            <w:rFonts w:ascii="Times New Roman" w:hAnsi="Times New Roman" w:eastAsia="Times New Roman" w:cs="Times New Roman"/>
+            <w:color w:val="000000"/>
+            <w:u w:val="none"/>
+            <w:sz w:val="22"/>
+          </w:rPr>
+          <w:t xml:space="preserve">52. </w:t>
+        </w:r>
+      </w:hyperlink>
       <w:r>
         <w:rPr>
           <w:rFonts w:ascii="Times New Roman" w:hAnsi="Times New Roman" w:eastAsia="Times New Roman" w:cs="Times New Roman"/>
@@ -7553,15 +9138,17 @@
         <w:ind w:left="432" w:hanging="432"/>
         <w:jc w:val="both"/>
       </w:pPr>
-      <w:r>
-        <w:rPr>
-          <w:rFonts w:ascii="Times New Roman" w:hAnsi="Times New Roman" w:eastAsia="Times New Roman" w:cs="Times New Roman"/>
-          <w:b w:val="0"/>
-          <w:i w:val="0"/>
-          <w:sz w:val="22"/>
-        </w:rPr>
-        <w:t xml:space="preserve">43. </w:t>
-      </w:r>
+      <w:hyperlink r:id="rId73">
+        <w:r>
+          <w:rPr>
+            <w:rFonts w:ascii="Times New Roman" w:hAnsi="Times New Roman" w:eastAsia="Times New Roman" w:cs="Times New Roman"/>
+            <w:color w:val="000000"/>
+            <w:u w:val="none"/>
+            <w:sz w:val="22"/>
+          </w:rPr>
+          <w:t xml:space="preserve">53. </w:t>
+        </w:r>
+      </w:hyperlink>
       <w:r>
         <w:rPr>
           <w:rFonts w:ascii="Times New Roman" w:hAnsi="Times New Roman" w:eastAsia="Times New Roman" w:cs="Times New Roman"/>
@@ -7578,90 +9165,17 @@
         <w:ind w:left="432" w:hanging="432"/>
         <w:jc w:val="both"/>
       </w:pPr>
-      <w:r>
-        <w:rPr>
-          <w:rFonts w:ascii="Times New Roman" w:hAnsi="Times New Roman" w:eastAsia="Times New Roman" w:cs="Times New Roman"/>
-          <w:b w:val="0"/>
-          <w:i w:val="0"/>
-          <w:sz w:val="22"/>
-        </w:rPr>
-        <w:t xml:space="preserve">44. </w:t>
-      </w:r>
-      <w:r>
-        <w:rPr>
-          <w:rFonts w:ascii="Times New Roman" w:hAnsi="Times New Roman" w:eastAsia="Times New Roman" w:cs="Times New Roman"/>
-          <w:b w:val="0"/>
-          <w:i w:val="0"/>
-          <w:sz w:val="22"/>
-        </w:rPr>
-        <w:t>Ren, Fengfeng, Lizhi Peng, and Yihang Hao. A Scalable DNS Tunneling Detection Method Based on Ensemble Learning for Programmable Switches. International Conference on Intelligent Computing, pp. 379-390. 2026.</w:t>
-      </w:r>
-    </w:p>
-    <w:p>
-      <w:pPr>
-        <w:spacing w:line="276" w:lineRule="auto" w:after="40"/>
-        <w:ind w:left="432" w:hanging="432"/>
-        <w:jc w:val="both"/>
-      </w:pPr>
-      <w:r>
-        <w:rPr>
-          <w:rFonts w:ascii="Times New Roman" w:hAnsi="Times New Roman" w:eastAsia="Times New Roman" w:cs="Times New Roman"/>
-          <w:b w:val="0"/>
-          <w:i w:val="0"/>
-          <w:sz w:val="22"/>
-        </w:rPr>
-        <w:t xml:space="preserve">45. </w:t>
-      </w:r>
-      <w:r>
-        <w:rPr>
-          <w:rFonts w:ascii="Times New Roman" w:hAnsi="Times New Roman" w:eastAsia="Times New Roman" w:cs="Times New Roman"/>
-          <w:b w:val="0"/>
-          <w:i w:val="0"/>
-          <w:sz w:val="22"/>
-        </w:rPr>
-        <w:t>Inayat, Usman, and Reamsha Khan. Detection and Prevention of DNS Tunneling Attacks: Exploring Technologies and Methodologies. UMT Artificial Intelligence Review 4, no. 1 (2024): 37-45.</w:t>
-      </w:r>
-    </w:p>
-    <w:p>
-      <w:pPr>
-        <w:spacing w:line="276" w:lineRule="auto" w:after="40"/>
-        <w:ind w:left="432" w:hanging="432"/>
-        <w:jc w:val="both"/>
-      </w:pPr>
-      <w:r>
-        <w:rPr>
-          <w:rFonts w:ascii="Times New Roman" w:hAnsi="Times New Roman" w:eastAsia="Times New Roman" w:cs="Times New Roman"/>
-          <w:b w:val="0"/>
-          <w:i w:val="0"/>
-          <w:sz w:val="22"/>
-        </w:rPr>
-        <w:t xml:space="preserve">46. </w:t>
-      </w:r>
-      <w:r>
-        <w:rPr>
-          <w:rFonts w:ascii="Times New Roman" w:hAnsi="Times New Roman" w:eastAsia="Times New Roman" w:cs="Times New Roman"/>
-          <w:b w:val="0"/>
-          <w:i w:val="0"/>
-          <w:sz w:val="22"/>
-        </w:rPr>
-        <w:t>Tu, Yu, Shuang Liu, and Qian Sun. DNS tunnelling detection by fusing encoding feature and behavioral feature. Computers &amp; Security 132 (2023): 103357.</w:t>
-      </w:r>
-    </w:p>
-    <w:p>
-      <w:pPr>
-        <w:spacing w:line="276" w:lineRule="auto" w:after="40"/>
-        <w:ind w:left="432" w:hanging="432"/>
-        <w:jc w:val="both"/>
-      </w:pPr>
-      <w:r>
-        <w:rPr>
-          <w:rFonts w:ascii="Times New Roman" w:hAnsi="Times New Roman" w:eastAsia="Times New Roman" w:cs="Times New Roman"/>
-          <w:b w:val="0"/>
-          <w:i w:val="0"/>
-          <w:sz w:val="22"/>
-        </w:rPr>
-        <w:t xml:space="preserve">47. </w:t>
-      </w:r>
+      <w:hyperlink r:id="rId74">
+        <w:r>
+          <w:rPr>
+            <w:rFonts w:ascii="Times New Roman" w:hAnsi="Times New Roman" w:eastAsia="Times New Roman" w:cs="Times New Roman"/>
+            <w:color w:val="000000"/>
+            <w:u w:val="none"/>
+            <w:sz w:val="22"/>
+          </w:rPr>
+          <w:t xml:space="preserve">54. </w:t>
+        </w:r>
+      </w:hyperlink>
       <w:r>
         <w:rPr>
           <w:rFonts w:ascii="Times New Roman" w:hAnsi="Times New Roman" w:eastAsia="Times New Roman" w:cs="Times New Roman"/>
@@ -7678,40 +9192,17 @@
         <w:ind w:left="432" w:hanging="432"/>
         <w:jc w:val="both"/>
       </w:pPr>
-      <w:r>
-        <w:rPr>
-          <w:rFonts w:ascii="Times New Roman" w:hAnsi="Times New Roman" w:eastAsia="Times New Roman" w:cs="Times New Roman"/>
-          <w:b w:val="0"/>
-          <w:i w:val="0"/>
-          <w:sz w:val="22"/>
-        </w:rPr>
-        <w:t xml:space="preserve">48. </w:t>
-      </w:r>
-      <w:r>
-        <w:rPr>
-          <w:rFonts w:ascii="Times New Roman" w:hAnsi="Times New Roman" w:eastAsia="Times New Roman" w:cs="Times New Roman"/>
-          <w:b w:val="0"/>
-          <w:i w:val="0"/>
-          <w:sz w:val="22"/>
-        </w:rPr>
-        <w:t>Arora, Kabeer, Koena Sarkar, and R. S. Ponmagal. Multi-Stage DNS Tunnelling Detection Using Behavioural Analytics and AI-Based Anomaly Scoring. In 2026 1st International Conference on AI, Data Science, Cyber Security and Smart Manufacturing for Sustainable Development (ICADCS), pp. 212-217. 2026.</w:t>
-      </w:r>
-    </w:p>
-    <w:p>
-      <w:pPr>
-        <w:spacing w:line="276" w:lineRule="auto" w:after="40"/>
-        <w:ind w:left="432" w:hanging="432"/>
-        <w:jc w:val="both"/>
-      </w:pPr>
-      <w:r>
-        <w:rPr>
-          <w:rFonts w:ascii="Times New Roman" w:hAnsi="Times New Roman" w:eastAsia="Times New Roman" w:cs="Times New Roman"/>
-          <w:b w:val="0"/>
-          <w:i w:val="0"/>
-          <w:sz w:val="22"/>
-        </w:rPr>
-        <w:t xml:space="preserve">49. </w:t>
-      </w:r>
+      <w:hyperlink r:id="rId75">
+        <w:r>
+          <w:rPr>
+            <w:rFonts w:ascii="Times New Roman" w:hAnsi="Times New Roman" w:eastAsia="Times New Roman" w:cs="Times New Roman"/>
+            <w:color w:val="000000"/>
+            <w:u w:val="none"/>
+            <w:sz w:val="22"/>
+          </w:rPr>
+          <w:t xml:space="preserve">55. </w:t>
+        </w:r>
+      </w:hyperlink>
       <w:r>
         <w:rPr>
           <w:rFonts w:ascii="Times New Roman" w:hAnsi="Times New Roman" w:eastAsia="Times New Roman" w:cs="Times New Roman"/>
@@ -7728,15 +9219,17 @@
         <w:ind w:left="432" w:hanging="432"/>
         <w:jc w:val="both"/>
       </w:pPr>
-      <w:r>
-        <w:rPr>
-          <w:rFonts w:ascii="Times New Roman" w:hAnsi="Times New Roman" w:eastAsia="Times New Roman" w:cs="Times New Roman"/>
-          <w:b w:val="0"/>
-          <w:i w:val="0"/>
-          <w:sz w:val="22"/>
-        </w:rPr>
-        <w:t xml:space="preserve">50. </w:t>
-      </w:r>
+      <w:hyperlink r:id="rId76">
+        <w:r>
+          <w:rPr>
+            <w:rFonts w:ascii="Times New Roman" w:hAnsi="Times New Roman" w:eastAsia="Times New Roman" w:cs="Times New Roman"/>
+            <w:color w:val="000000"/>
+            <w:u w:val="none"/>
+            <w:sz w:val="22"/>
+          </w:rPr>
+          <w:t xml:space="preserve">56. </w:t>
+        </w:r>
+      </w:hyperlink>
       <w:r>
         <w:rPr>
           <w:rFonts w:ascii="Times New Roman" w:hAnsi="Times New Roman" w:eastAsia="Times New Roman" w:cs="Times New Roman"/>
@@ -7753,65 +9246,17 @@
         <w:ind w:left="432" w:hanging="432"/>
         <w:jc w:val="both"/>
       </w:pPr>
-      <w:r>
-        <w:rPr>
-          <w:rFonts w:ascii="Times New Roman" w:hAnsi="Times New Roman" w:eastAsia="Times New Roman" w:cs="Times New Roman"/>
-          <w:b w:val="0"/>
-          <w:i w:val="0"/>
-          <w:sz w:val="22"/>
-        </w:rPr>
-        <w:t xml:space="preserve">51. </w:t>
-      </w:r>
-      <w:r>
-        <w:rPr>
-          <w:rFonts w:ascii="Times New Roman" w:hAnsi="Times New Roman" w:eastAsia="Times New Roman" w:cs="Times New Roman"/>
-          <w:b w:val="0"/>
-          <w:i w:val="0"/>
-          <w:sz w:val="22"/>
-        </w:rPr>
-        <w:t>Adiwal, Sanjay, Balaji Rajendran, and Sithu D. Sudarsan. Dns intrusion detection (did)—a snort-based solution to detect dns amplification and dns tunneling attacks. Franklin Open 2 (2023): 100010.</w:t>
-      </w:r>
-    </w:p>
-    <w:p>
-      <w:pPr>
-        <w:spacing w:line="276" w:lineRule="auto" w:after="40"/>
-        <w:ind w:left="432" w:hanging="432"/>
-        <w:jc w:val="both"/>
-      </w:pPr>
-      <w:r>
-        <w:rPr>
-          <w:rFonts w:ascii="Times New Roman" w:hAnsi="Times New Roman" w:eastAsia="Times New Roman" w:cs="Times New Roman"/>
-          <w:b w:val="0"/>
-          <w:i w:val="0"/>
-          <w:sz w:val="22"/>
-        </w:rPr>
-        <w:t xml:space="preserve">52. </w:t>
-      </w:r>
-      <w:r>
-        <w:rPr>
-          <w:rFonts w:ascii="Times New Roman" w:hAnsi="Times New Roman" w:eastAsia="Times New Roman" w:cs="Times New Roman"/>
-          <w:b w:val="0"/>
-          <w:i w:val="0"/>
-          <w:sz w:val="22"/>
-        </w:rPr>
-        <w:t>Tayyeh, Huda Kadhim, and Ahmed Sabah Ahmed Al-Jumaili. A long short term memory model for character-based analysis of DNS tunneling detection. Scalable Computing: Practice and Experience 25, no. 6 (2024): 5250-5257.</w:t>
-      </w:r>
-    </w:p>
-    <w:p>
-      <w:pPr>
-        <w:spacing w:line="276" w:lineRule="auto" w:after="40"/>
-        <w:ind w:left="432" w:hanging="432"/>
-        <w:jc w:val="both"/>
-      </w:pPr>
-      <w:r>
-        <w:rPr>
-          <w:rFonts w:ascii="Times New Roman" w:hAnsi="Times New Roman" w:eastAsia="Times New Roman" w:cs="Times New Roman"/>
-          <w:b w:val="0"/>
-          <w:i w:val="0"/>
-          <w:sz w:val="22"/>
-        </w:rPr>
-        <w:t xml:space="preserve">53. </w:t>
-      </w:r>
+      <w:hyperlink r:id="rId77">
+        <w:r>
+          <w:rPr>
+            <w:rFonts w:ascii="Times New Roman" w:hAnsi="Times New Roman" w:eastAsia="Times New Roman" w:cs="Times New Roman"/>
+            <w:color w:val="000000"/>
+            <w:u w:val="none"/>
+            <w:sz w:val="22"/>
+          </w:rPr>
+          <w:t xml:space="preserve">57. </w:t>
+        </w:r>
+      </w:hyperlink>
       <w:r>
         <w:rPr>
           <w:rFonts w:ascii="Times New Roman" w:hAnsi="Times New Roman" w:eastAsia="Times New Roman" w:cs="Times New Roman"/>
@@ -7828,65 +9273,17 @@
         <w:ind w:left="432" w:hanging="432"/>
         <w:jc w:val="both"/>
       </w:pPr>
-      <w:r>
-        <w:rPr>
-          <w:rFonts w:ascii="Times New Roman" w:hAnsi="Times New Roman" w:eastAsia="Times New Roman" w:cs="Times New Roman"/>
-          <w:b w:val="0"/>
-          <w:i w:val="0"/>
-          <w:sz w:val="22"/>
-        </w:rPr>
-        <w:t xml:space="preserve">54. </w:t>
-      </w:r>
-      <w:r>
-        <w:rPr>
-          <w:rFonts w:ascii="Times New Roman" w:hAnsi="Times New Roman" w:eastAsia="Times New Roman" w:cs="Times New Roman"/>
-          <w:b w:val="0"/>
-          <w:i w:val="0"/>
-          <w:sz w:val="22"/>
-        </w:rPr>
-        <w:t>Kuang, Shilei, Weiping Wang, Yongfei Ye, and Lingzhi Peng. HHBT: DNS tunneling Detection via Hybrid Hierarchical Bidirectional Transformer. Computer Networks (2025): 111919.</w:t>
-      </w:r>
-    </w:p>
-    <w:p>
-      <w:pPr>
-        <w:spacing w:line="276" w:lineRule="auto" w:after="40"/>
-        <w:ind w:left="432" w:hanging="432"/>
-        <w:jc w:val="both"/>
-      </w:pPr>
-      <w:r>
-        <w:rPr>
-          <w:rFonts w:ascii="Times New Roman" w:hAnsi="Times New Roman" w:eastAsia="Times New Roman" w:cs="Times New Roman"/>
-          <w:b w:val="0"/>
-          <w:i w:val="0"/>
-          <w:sz w:val="22"/>
-        </w:rPr>
-        <w:t xml:space="preserve">55. </w:t>
-      </w:r>
-      <w:r>
-        <w:rPr>
-          <w:rFonts w:ascii="Times New Roman" w:hAnsi="Times New Roman" w:eastAsia="Times New Roman" w:cs="Times New Roman"/>
-          <w:b w:val="0"/>
-          <w:i w:val="0"/>
-          <w:sz w:val="22"/>
-        </w:rPr>
-        <w:t>Liu, Xiaoyu, Weixuan Mao, Anqi Wang, Zheng Li, Hui Xue, Yijing Zhang, Jianjun Lin, Xiaodu Yang, Ziqian Chen, and Bo Sun. DNS tunnel detection for low throughput data exfiltration via time-frequency domain analysis. ICC 2023-International Conference on Communications, pp. 2331-2337. 2023.</w:t>
-      </w:r>
-    </w:p>
-    <w:p>
-      <w:pPr>
-        <w:spacing w:line="276" w:lineRule="auto" w:after="40"/>
-        <w:ind w:left="432" w:hanging="432"/>
-        <w:jc w:val="both"/>
-      </w:pPr>
-      <w:r>
-        <w:rPr>
-          <w:rFonts w:ascii="Times New Roman" w:hAnsi="Times New Roman" w:eastAsia="Times New Roman" w:cs="Times New Roman"/>
-          <w:b w:val="0"/>
-          <w:i w:val="0"/>
-          <w:sz w:val="22"/>
-        </w:rPr>
-        <w:t xml:space="preserve">56. </w:t>
-      </w:r>
+      <w:hyperlink r:id="rId78">
+        <w:r>
+          <w:rPr>
+            <w:rFonts w:ascii="Times New Roman" w:hAnsi="Times New Roman" w:eastAsia="Times New Roman" w:cs="Times New Roman"/>
+            <w:color w:val="000000"/>
+            <w:u w:val="none"/>
+            <w:sz w:val="22"/>
+          </w:rPr>
+          <w:t xml:space="preserve">58. </w:t>
+        </w:r>
+      </w:hyperlink>
       <w:r>
         <w:rPr>
           <w:rFonts w:ascii="Times New Roman" w:hAnsi="Times New Roman" w:eastAsia="Times New Roman" w:cs="Times New Roman"/>
@@ -7903,15 +9300,17 @@
         <w:ind w:left="432" w:hanging="432"/>
         <w:jc w:val="both"/>
       </w:pPr>
-      <w:r>
-        <w:rPr>
-          <w:rFonts w:ascii="Times New Roman" w:hAnsi="Times New Roman" w:eastAsia="Times New Roman" w:cs="Times New Roman"/>
-          <w:b w:val="0"/>
-          <w:i w:val="0"/>
-          <w:sz w:val="22"/>
-        </w:rPr>
-        <w:t xml:space="preserve">57. </w:t>
-      </w:r>
+      <w:hyperlink r:id="rId79">
+        <w:r>
+          <w:rPr>
+            <w:rFonts w:ascii="Times New Roman" w:hAnsi="Times New Roman" w:eastAsia="Times New Roman" w:cs="Times New Roman"/>
+            <w:color w:val="000000"/>
+            <w:u w:val="none"/>
+            <w:sz w:val="22"/>
+          </w:rPr>
+          <w:t xml:space="preserve">59. </w:t>
+        </w:r>
+      </w:hyperlink>
       <w:r>
         <w:rPr>
           <w:rFonts w:ascii="Times New Roman" w:hAnsi="Times New Roman" w:eastAsia="Times New Roman" w:cs="Times New Roman"/>
@@ -7928,15 +9327,17 @@
         <w:ind w:left="432" w:hanging="432"/>
         <w:jc w:val="both"/>
       </w:pPr>
-      <w:r>
-        <w:rPr>
-          <w:rFonts w:ascii="Times New Roman" w:hAnsi="Times New Roman" w:eastAsia="Times New Roman" w:cs="Times New Roman"/>
-          <w:b w:val="0"/>
-          <w:i w:val="0"/>
-          <w:sz w:val="22"/>
-        </w:rPr>
-        <w:t xml:space="preserve">58. </w:t>
-      </w:r>
+      <w:hyperlink r:id="rId80">
+        <w:r>
+          <w:rPr>
+            <w:rFonts w:ascii="Times New Roman" w:hAnsi="Times New Roman" w:eastAsia="Times New Roman" w:cs="Times New Roman"/>
+            <w:color w:val="000000"/>
+            <w:u w:val="none"/>
+            <w:sz w:val="22"/>
+          </w:rPr>
+          <w:t xml:space="preserve">60. </w:t>
+        </w:r>
+      </w:hyperlink>
       <w:r>
         <w:rPr>
           <w:rFonts w:ascii="Times New Roman" w:hAnsi="Times New Roman" w:eastAsia="Times New Roman" w:cs="Times New Roman"/>
@@ -7953,15 +9354,17 @@
         <w:ind w:left="432" w:hanging="432"/>
         <w:jc w:val="both"/>
       </w:pPr>
-      <w:r>
-        <w:rPr>
-          <w:rFonts w:ascii="Times New Roman" w:hAnsi="Times New Roman" w:eastAsia="Times New Roman" w:cs="Times New Roman"/>
-          <w:b w:val="0"/>
-          <w:i w:val="0"/>
-          <w:sz w:val="22"/>
-        </w:rPr>
-        <w:t xml:space="preserve">59. </w:t>
-      </w:r>
+      <w:hyperlink r:id="rId81">
+        <w:r>
+          <w:rPr>
+            <w:rFonts w:ascii="Times New Roman" w:hAnsi="Times New Roman" w:eastAsia="Times New Roman" w:cs="Times New Roman"/>
+            <w:color w:val="000000"/>
+            <w:u w:val="none"/>
+            <w:sz w:val="22"/>
+          </w:rPr>
+          <w:t xml:space="preserve">61. </w:t>
+        </w:r>
+      </w:hyperlink>
       <w:r>
         <w:rPr>
           <w:rFonts w:ascii="Times New Roman" w:hAnsi="Times New Roman" w:eastAsia="Times New Roman" w:cs="Times New Roman"/>
@@ -7978,15 +9381,17 @@
         <w:ind w:left="432" w:hanging="432"/>
         <w:jc w:val="both"/>
       </w:pPr>
-      <w:r>
-        <w:rPr>
-          <w:rFonts w:ascii="Times New Roman" w:hAnsi="Times New Roman" w:eastAsia="Times New Roman" w:cs="Times New Roman"/>
-          <w:b w:val="0"/>
-          <w:i w:val="0"/>
-          <w:sz w:val="22"/>
-        </w:rPr>
-        <w:t xml:space="preserve">60. </w:t>
-      </w:r>
+      <w:hyperlink r:id="rId82">
+        <w:r>
+          <w:rPr>
+            <w:rFonts w:ascii="Times New Roman" w:hAnsi="Times New Roman" w:eastAsia="Times New Roman" w:cs="Times New Roman"/>
+            <w:color w:val="000000"/>
+            <w:u w:val="none"/>
+            <w:sz w:val="22"/>
+          </w:rPr>
+          <w:t xml:space="preserve">62. </w:t>
+        </w:r>
+      </w:hyperlink>
       <w:r>
         <w:rPr>
           <w:rFonts w:ascii="Times New Roman" w:hAnsi="Times New Roman" w:eastAsia="Times New Roman" w:cs="Times New Roman"/>
@@ -8003,15 +9408,17 @@
         <w:ind w:left="432" w:hanging="432"/>
         <w:jc w:val="both"/>
       </w:pPr>
-      <w:r>
-        <w:rPr>
-          <w:rFonts w:ascii="Times New Roman" w:hAnsi="Times New Roman" w:eastAsia="Times New Roman" w:cs="Times New Roman"/>
-          <w:b w:val="0"/>
-          <w:i w:val="0"/>
-          <w:sz w:val="22"/>
-        </w:rPr>
-        <w:t xml:space="preserve">61. </w:t>
-      </w:r>
+      <w:hyperlink r:id="rId83">
+        <w:r>
+          <w:rPr>
+            <w:rFonts w:ascii="Times New Roman" w:hAnsi="Times New Roman" w:eastAsia="Times New Roman" w:cs="Times New Roman"/>
+            <w:color w:val="000000"/>
+            <w:u w:val="none"/>
+            <w:sz w:val="22"/>
+          </w:rPr>
+          <w:t xml:space="preserve">63. </w:t>
+        </w:r>
+      </w:hyperlink>
       <w:r>
         <w:rPr>
           <w:rFonts w:ascii="Times New Roman" w:hAnsi="Times New Roman" w:eastAsia="Times New Roman" w:cs="Times New Roman"/>
@@ -8028,15 +9435,17 @@
         <w:ind w:left="432" w:hanging="432"/>
         <w:jc w:val="both"/>
       </w:pPr>
-      <w:r>
-        <w:rPr>
-          <w:rFonts w:ascii="Times New Roman" w:hAnsi="Times New Roman" w:eastAsia="Times New Roman" w:cs="Times New Roman"/>
-          <w:b w:val="0"/>
-          <w:i w:val="0"/>
-          <w:sz w:val="22"/>
-        </w:rPr>
-        <w:t xml:space="preserve">62. </w:t>
-      </w:r>
+      <w:hyperlink r:id="rId84">
+        <w:r>
+          <w:rPr>
+            <w:rFonts w:ascii="Times New Roman" w:hAnsi="Times New Roman" w:eastAsia="Times New Roman" w:cs="Times New Roman"/>
+            <w:color w:val="000000"/>
+            <w:u w:val="none"/>
+            <w:sz w:val="22"/>
+          </w:rPr>
+          <w:t xml:space="preserve">64. </w:t>
+        </w:r>
+      </w:hyperlink>
       <w:r>
         <w:rPr>
           <w:rFonts w:ascii="Times New Roman" w:hAnsi="Times New Roman" w:eastAsia="Times New Roman" w:cs="Times New Roman"/>
@@ -8053,15 +9462,17 @@
         <w:ind w:left="432" w:hanging="432"/>
         <w:jc w:val="both"/>
       </w:pPr>
-      <w:r>
-        <w:rPr>
-          <w:rFonts w:ascii="Times New Roman" w:hAnsi="Times New Roman" w:eastAsia="Times New Roman" w:cs="Times New Roman"/>
-          <w:b w:val="0"/>
-          <w:i w:val="0"/>
-          <w:sz w:val="22"/>
-        </w:rPr>
-        <w:t xml:space="preserve">63. </w:t>
-      </w:r>
+      <w:hyperlink r:id="rId85">
+        <w:r>
+          <w:rPr>
+            <w:rFonts w:ascii="Times New Roman" w:hAnsi="Times New Roman" w:eastAsia="Times New Roman" w:cs="Times New Roman"/>
+            <w:color w:val="000000"/>
+            <w:u w:val="none"/>
+            <w:sz w:val="22"/>
+          </w:rPr>
+          <w:t xml:space="preserve">65. </w:t>
+        </w:r>
+      </w:hyperlink>
       <w:r>
         <w:rPr>
           <w:rFonts w:ascii="Times New Roman" w:hAnsi="Times New Roman" w:eastAsia="Times New Roman" w:cs="Times New Roman"/>
@@ -8078,15 +9489,17 @@
         <w:ind w:left="432" w:hanging="432"/>
         <w:jc w:val="both"/>
       </w:pPr>
-      <w:r>
-        <w:rPr>
-          <w:rFonts w:ascii="Times New Roman" w:hAnsi="Times New Roman" w:eastAsia="Times New Roman" w:cs="Times New Roman"/>
-          <w:b w:val="0"/>
-          <w:i w:val="0"/>
-          <w:sz w:val="22"/>
-        </w:rPr>
-        <w:t xml:space="preserve">64. </w:t>
-      </w:r>
+      <w:hyperlink r:id="rId86">
+        <w:r>
+          <w:rPr>
+            <w:rFonts w:ascii="Times New Roman" w:hAnsi="Times New Roman" w:eastAsia="Times New Roman" w:cs="Times New Roman"/>
+            <w:color w:val="000000"/>
+            <w:u w:val="none"/>
+            <w:sz w:val="22"/>
+          </w:rPr>
+          <w:t xml:space="preserve">66. </w:t>
+        </w:r>
+      </w:hyperlink>
       <w:r>
         <w:rPr>
           <w:rFonts w:ascii="Times New Roman" w:hAnsi="Times New Roman" w:eastAsia="Times New Roman" w:cs="Times New Roman"/>
@@ -8103,15 +9516,17 @@
         <w:ind w:left="432" w:hanging="432"/>
         <w:jc w:val="both"/>
       </w:pPr>
-      <w:r>
-        <w:rPr>
-          <w:rFonts w:ascii="Times New Roman" w:hAnsi="Times New Roman" w:eastAsia="Times New Roman" w:cs="Times New Roman"/>
-          <w:b w:val="0"/>
-          <w:i w:val="0"/>
-          <w:sz w:val="22"/>
-        </w:rPr>
-        <w:t xml:space="preserve">65. </w:t>
-      </w:r>
+      <w:hyperlink r:id="rId87">
+        <w:r>
+          <w:rPr>
+            <w:rFonts w:ascii="Times New Roman" w:hAnsi="Times New Roman" w:eastAsia="Times New Roman" w:cs="Times New Roman"/>
+            <w:color w:val="000000"/>
+            <w:u w:val="none"/>
+            <w:sz w:val="22"/>
+          </w:rPr>
+          <w:t xml:space="preserve">67. </w:t>
+        </w:r>
+      </w:hyperlink>
       <w:r>
         <w:rPr>
           <w:rFonts w:ascii="Times New Roman" w:hAnsi="Times New Roman" w:eastAsia="Times New Roman" w:cs="Times New Roman"/>
@@ -8128,15 +9543,17 @@
         <w:ind w:left="432" w:hanging="432"/>
         <w:jc w:val="both"/>
       </w:pPr>
-      <w:r>
-        <w:rPr>
-          <w:rFonts w:ascii="Times New Roman" w:hAnsi="Times New Roman" w:eastAsia="Times New Roman" w:cs="Times New Roman"/>
-          <w:b w:val="0"/>
-          <w:i w:val="0"/>
-          <w:sz w:val="22"/>
-        </w:rPr>
-        <w:t xml:space="preserve">66. </w:t>
-      </w:r>
+      <w:hyperlink r:id="rId88">
+        <w:r>
+          <w:rPr>
+            <w:rFonts w:ascii="Times New Roman" w:hAnsi="Times New Roman" w:eastAsia="Times New Roman" w:cs="Times New Roman"/>
+            <w:color w:val="000000"/>
+            <w:u w:val="none"/>
+            <w:sz w:val="22"/>
+          </w:rPr>
+          <w:t xml:space="preserve">68. </w:t>
+        </w:r>
+      </w:hyperlink>
       <w:r>
         <w:rPr>
           <w:rFonts w:ascii="Times New Roman" w:hAnsi="Times New Roman" w:eastAsia="Times New Roman" w:cs="Times New Roman"/>
@@ -8153,15 +9570,17 @@
         <w:ind w:left="432" w:hanging="432"/>
         <w:jc w:val="both"/>
       </w:pPr>
-      <w:r>
-        <w:rPr>
-          <w:rFonts w:ascii="Times New Roman" w:hAnsi="Times New Roman" w:eastAsia="Times New Roman" w:cs="Times New Roman"/>
-          <w:b w:val="0"/>
-          <w:i w:val="0"/>
-          <w:sz w:val="22"/>
-        </w:rPr>
-        <w:t xml:space="preserve">67. </w:t>
-      </w:r>
+      <w:hyperlink r:id="rId89">
+        <w:r>
+          <w:rPr>
+            <w:rFonts w:ascii="Times New Roman" w:hAnsi="Times New Roman" w:eastAsia="Times New Roman" w:cs="Times New Roman"/>
+            <w:color w:val="000000"/>
+            <w:u w:val="none"/>
+            <w:sz w:val="22"/>
+          </w:rPr>
+          <w:t xml:space="preserve">69. </w:t>
+        </w:r>
+      </w:hyperlink>
       <w:r>
         <w:rPr>
           <w:rFonts w:ascii="Times New Roman" w:hAnsi="Times New Roman" w:eastAsia="Times New Roman" w:cs="Times New Roman"/>
@@ -8178,15 +9597,17 @@
         <w:ind w:left="432" w:hanging="432"/>
         <w:jc w:val="both"/>
       </w:pPr>
-      <w:r>
-        <w:rPr>
-          <w:rFonts w:ascii="Times New Roman" w:hAnsi="Times New Roman" w:eastAsia="Times New Roman" w:cs="Times New Roman"/>
-          <w:b w:val="0"/>
-          <w:i w:val="0"/>
-          <w:sz w:val="22"/>
-        </w:rPr>
-        <w:t xml:space="preserve">68. </w:t>
-      </w:r>
+      <w:hyperlink r:id="rId90">
+        <w:r>
+          <w:rPr>
+            <w:rFonts w:ascii="Times New Roman" w:hAnsi="Times New Roman" w:eastAsia="Times New Roman" w:cs="Times New Roman"/>
+            <w:color w:val="000000"/>
+            <w:u w:val="none"/>
+            <w:sz w:val="22"/>
+          </w:rPr>
+          <w:t xml:space="preserve">70. </w:t>
+        </w:r>
+      </w:hyperlink>
       <w:r>
         <w:rPr>
           <w:rFonts w:ascii="Times New Roman" w:hAnsi="Times New Roman" w:eastAsia="Times New Roman" w:cs="Times New Roman"/>
@@ -8203,15 +9624,17 @@
         <w:ind w:left="432" w:hanging="432"/>
         <w:jc w:val="both"/>
       </w:pPr>
-      <w:r>
-        <w:rPr>
-          <w:rFonts w:ascii="Times New Roman" w:hAnsi="Times New Roman" w:eastAsia="Times New Roman" w:cs="Times New Roman"/>
-          <w:b w:val="0"/>
-          <w:i w:val="0"/>
-          <w:sz w:val="22"/>
-        </w:rPr>
-        <w:t xml:space="preserve">69. </w:t>
-      </w:r>
+      <w:hyperlink r:id="rId91">
+        <w:r>
+          <w:rPr>
+            <w:rFonts w:ascii="Times New Roman" w:hAnsi="Times New Roman" w:eastAsia="Times New Roman" w:cs="Times New Roman"/>
+            <w:color w:val="000000"/>
+            <w:u w:val="none"/>
+            <w:sz w:val="22"/>
+          </w:rPr>
+          <w:t xml:space="preserve">71. </w:t>
+        </w:r>
+      </w:hyperlink>
       <w:r>
         <w:rPr>
           <w:rFonts w:ascii="Times New Roman" w:hAnsi="Times New Roman" w:eastAsia="Times New Roman" w:cs="Times New Roman"/>
@@ -8228,40 +9651,17 @@
         <w:ind w:left="432" w:hanging="432"/>
         <w:jc w:val="both"/>
       </w:pPr>
-      <w:r>
-        <w:rPr>
-          <w:rFonts w:ascii="Times New Roman" w:hAnsi="Times New Roman" w:eastAsia="Times New Roman" w:cs="Times New Roman"/>
-          <w:b w:val="0"/>
-          <w:i w:val="0"/>
-          <w:sz w:val="22"/>
-        </w:rPr>
-        <w:t xml:space="preserve">70. </w:t>
-      </w:r>
-      <w:r>
-        <w:rPr>
-          <w:rFonts w:ascii="Times New Roman" w:hAnsi="Times New Roman" w:eastAsia="Times New Roman" w:cs="Times New Roman"/>
-          <w:b w:val="0"/>
-          <w:i w:val="0"/>
-          <w:sz w:val="22"/>
-        </w:rPr>
-        <w:t>James, Carter. Adaptive Adversarial Evasion: Evaluating the Robustness of Hybrid CNN-LSTM Models Against Mutated DNS Tunneling Payloads in Real-Time. ScienceOpen Preprints (2026).</w:t>
-      </w:r>
-    </w:p>
-    <w:p>
-      <w:pPr>
-        <w:spacing w:line="276" w:lineRule="auto" w:after="40"/>
-        <w:ind w:left="432" w:hanging="432"/>
-        <w:jc w:val="both"/>
-      </w:pPr>
-      <w:r>
-        <w:rPr>
-          <w:rFonts w:ascii="Times New Roman" w:hAnsi="Times New Roman" w:eastAsia="Times New Roman" w:cs="Times New Roman"/>
-          <w:b w:val="0"/>
-          <w:i w:val="0"/>
-          <w:sz w:val="22"/>
-        </w:rPr>
-        <w:t xml:space="preserve">71. </w:t>
-      </w:r>
+      <w:hyperlink r:id="rId92">
+        <w:r>
+          <w:rPr>
+            <w:rFonts w:ascii="Times New Roman" w:hAnsi="Times New Roman" w:eastAsia="Times New Roman" w:cs="Times New Roman"/>
+            <w:color w:val="000000"/>
+            <w:u w:val="none"/>
+            <w:sz w:val="22"/>
+          </w:rPr>
+          <w:t xml:space="preserve">72. </w:t>
+        </w:r>
+      </w:hyperlink>
       <w:r>
         <w:rPr>
           <w:rFonts w:ascii="Times New Roman" w:hAnsi="Times New Roman" w:eastAsia="Times New Roman" w:cs="Times New Roman"/>
@@ -8278,40 +9678,17 @@
         <w:ind w:left="432" w:hanging="432"/>
         <w:jc w:val="both"/>
       </w:pPr>
-      <w:r>
-        <w:rPr>
-          <w:rFonts w:ascii="Times New Roman" w:hAnsi="Times New Roman" w:eastAsia="Times New Roman" w:cs="Times New Roman"/>
-          <w:b w:val="0"/>
-          <w:i w:val="0"/>
-          <w:sz w:val="22"/>
-        </w:rPr>
-        <w:t xml:space="preserve">72. </w:t>
-      </w:r>
-      <w:r>
-        <w:rPr>
-          <w:rFonts w:ascii="Times New Roman" w:hAnsi="Times New Roman" w:eastAsia="Times New Roman" w:cs="Times New Roman"/>
-          <w:b w:val="0"/>
-          <w:i w:val="0"/>
-          <w:sz w:val="22"/>
-        </w:rPr>
-        <w:t>Elizalde, Sergio, Ali AlSabeh, Samia Choueiri, Jaime Galán-Jiménez, Elie Kfoury, and Jorge Crichigno. Real-Time Detection of Encrypted DGA and DNS Tunneling Using DPDK on SmartNICs. In 2026 International Black Seas Conference on Communications and Networking (BlackSeaCom), pp. 1-6. 2026.</w:t>
-      </w:r>
-    </w:p>
-    <w:p>
-      <w:pPr>
-        <w:spacing w:line="276" w:lineRule="auto" w:after="40"/>
-        <w:ind w:left="432" w:hanging="432"/>
-        <w:jc w:val="both"/>
-      </w:pPr>
-      <w:r>
-        <w:rPr>
-          <w:rFonts w:ascii="Times New Roman" w:hAnsi="Times New Roman" w:eastAsia="Times New Roman" w:cs="Times New Roman"/>
-          <w:b w:val="0"/>
-          <w:i w:val="0"/>
-          <w:sz w:val="22"/>
-        </w:rPr>
-        <w:t xml:space="preserve">73. </w:t>
-      </w:r>
+      <w:hyperlink r:id="rId93">
+        <w:r>
+          <w:rPr>
+            <w:rFonts w:ascii="Times New Roman" w:hAnsi="Times New Roman" w:eastAsia="Times New Roman" w:cs="Times New Roman"/>
+            <w:color w:val="000000"/>
+            <w:u w:val="none"/>
+            <w:sz w:val="22"/>
+          </w:rPr>
+          <w:t xml:space="preserve">73. </w:t>
+        </w:r>
+      </w:hyperlink>
       <w:r>
         <w:rPr>
           <w:rFonts w:ascii="Times New Roman" w:hAnsi="Times New Roman" w:eastAsia="Times New Roman" w:cs="Times New Roman"/>
@@ -8328,15 +9705,17 @@
         <w:ind w:left="432" w:hanging="432"/>
         <w:jc w:val="both"/>
       </w:pPr>
-      <w:r>
-        <w:rPr>
-          <w:rFonts w:ascii="Times New Roman" w:hAnsi="Times New Roman" w:eastAsia="Times New Roman" w:cs="Times New Roman"/>
-          <w:b w:val="0"/>
-          <w:i w:val="0"/>
-          <w:sz w:val="22"/>
-        </w:rPr>
-        <w:t xml:space="preserve">74. </w:t>
-      </w:r>
+      <w:hyperlink r:id="rId94">
+        <w:r>
+          <w:rPr>
+            <w:rFonts w:ascii="Times New Roman" w:hAnsi="Times New Roman" w:eastAsia="Times New Roman" w:cs="Times New Roman"/>
+            <w:color w:val="000000"/>
+            <w:u w:val="none"/>
+            <w:sz w:val="22"/>
+          </w:rPr>
+          <w:t xml:space="preserve">74. </w:t>
+        </w:r>
+      </w:hyperlink>
       <w:r>
         <w:rPr>
           <w:rFonts w:ascii="Times New Roman" w:hAnsi="Times New Roman" w:eastAsia="Times New Roman" w:cs="Times New Roman"/>
@@ -8353,15 +9732,17 @@
         <w:ind w:left="432" w:hanging="432"/>
         <w:jc w:val="both"/>
       </w:pPr>
-      <w:r>
-        <w:rPr>
-          <w:rFonts w:ascii="Times New Roman" w:hAnsi="Times New Roman" w:eastAsia="Times New Roman" w:cs="Times New Roman"/>
-          <w:b w:val="0"/>
-          <w:i w:val="0"/>
-          <w:sz w:val="22"/>
-        </w:rPr>
-        <w:t xml:space="preserve">75. </w:t>
-      </w:r>
+      <w:hyperlink r:id="rId95">
+        <w:r>
+          <w:rPr>
+            <w:rFonts w:ascii="Times New Roman" w:hAnsi="Times New Roman" w:eastAsia="Times New Roman" w:cs="Times New Roman"/>
+            <w:color w:val="000000"/>
+            <w:u w:val="none"/>
+            <w:sz w:val="22"/>
+          </w:rPr>
+          <w:t xml:space="preserve">75. </w:t>
+        </w:r>
+      </w:hyperlink>
       <w:r>
         <w:rPr>
           <w:rFonts w:ascii="Times New Roman" w:hAnsi="Times New Roman" w:eastAsia="Times New Roman" w:cs="Times New Roman"/>

</xml_diff>

<commit_message>
fix(paper): introduction trimmed to 5 citations like the sample
The sample's INTRODUCTION carries exactly [1]-[5]; ours had 7. Dropped the
two weakest claims (a duplicate-detector citation and an extra stealth
reference), renumbered everything downstream by first appearance (the
renumbering pipeline handles the cascade), and rebuilt refs_new.txt in the
new order with links intact. Global citation order verified strictly
sequential; 75 reference entries present.
</commit_message>
<xml_diff>
--- a/Paper/ExFilTrap_Paper.docx
+++ b/Paper/ExFilTrap_Paper.docx
@@ -769,7 +769,7 @@
           <w:i w:val="0"/>
           <w:sz w:val="24"/>
         </w:rPr>
-        <w:t xml:space="preserve">, </w:t>
+        <w:t xml:space="preserve">. However, these architectures share a structural weakness: an adversary who splits a document into very small chunks, encrypts them, paces a single query every 65 seconds and randomizes the queried domains produces queries whose individual features lie entirely inside the distribution of benign hash-label hostnames </w:t>
       </w:r>
       <w:hyperlink r:id="rId100">
         <w:r>
@@ -779,25 +779,6 @@
             <w:u w:val="none"/>
           </w:rPr>
           <w:t xml:space="preserve">[5]</w:t>
-        </w:r>
-      </w:hyperlink>
-      <w:r>
-        <w:rPr>
-          <w:rFonts w:ascii="Times New Roman" w:hAnsi="Times New Roman" w:eastAsia="Times New Roman" w:cs="Times New Roman"/>
-          <w:b w:val="0"/>
-          <w:i w:val="0"/>
-          <w:sz w:val="24"/>
-        </w:rPr>
-        <w:t xml:space="preserve">. However, these architectures share a structural weakness: an adversary who splits a document into very small chunks, encrypts them, paces a single query every 65 seconds and randomizes the queried domains produces queries whose individual features lie entirely inside the distribution of benign hash-label hostnames </w:t>
-      </w:r>
-      <w:hyperlink r:id="rId101">
-        <w:r>
-          <w:rPr>
-            <w:rFonts w:ascii="Times New Roman" w:hAnsi="Times New Roman" w:eastAsia="Times New Roman" w:cs="Times New Roman"/>
-            <w:color w:val="000000"/>
-            <w:u w:val="none"/>
-          </w:rPr>
-          <w:t xml:space="preserve">[6]</w:t>
         </w:r>
       </w:hyperlink>
       <w:r>
@@ -826,7 +807,42 @@
           <w:i w:val="0"/>
           <w:sz w:val="24"/>
         </w:rPr>
-        <w:t xml:space="preserve">, </w:t>
+        <w:t xml:space="preserve">.</w:t>
+      </w:r>
+    </w:p>
+    <w:p>
+      <w:pPr>
+        <w:spacing w:line="276" w:lineRule="auto"/>
+        <w:ind w:firstLine="360"/>
+        <w:jc w:val="both"/>
+      </w:pPr>
+      <w:r>
+        <w:rPr>
+          <w:rFonts w:ascii="Times New Roman" w:hAnsi="Times New Roman" w:eastAsia="Times New Roman" w:cs="Times New Roman"/>
+          <w:b w:val="0"/>
+          <w:i w:val="0"/>
+          <w:sz w:val="24"/>
+        </w:rPr>
+        <w:t xml:space="preserve">The proposed ExFilTrap framework has important applications in enterprise network security and in defensive operations more broadly. Continuous statistical profiling of resolver sessions allows an organisation to detect exfiltration attempts that would otherwise require manual forensic review of DNS logs, and automated mitigation shortens the interval between detection and containment from hours to seconds </w:t>
+      </w:r>
+      <w:hyperlink r:id="rId101">
+        <w:r>
+          <w:rPr>
+            <w:rFonts w:ascii="Times New Roman" w:hAnsi="Times New Roman" w:eastAsia="Times New Roman" w:cs="Times New Roman"/>
+            <w:color w:val="000000"/>
+            <w:u w:val="none"/>
+          </w:rPr>
+          <w:t xml:space="preserve">[6]</w:t>
+        </w:r>
+      </w:hyperlink>
+      <w:r>
+        <w:rPr>
+          <w:rFonts w:ascii="Times New Roman" w:hAnsi="Times New Roman" w:eastAsia="Times New Roman" w:cs="Times New Roman"/>
+          <w:b w:val="0"/>
+          <w:i w:val="0"/>
+          <w:sz w:val="24"/>
+        </w:rPr>
+        <w:t xml:space="preserve">. In regulated environments where DNS must remain open, a detector that reports decoded payload evidence rather than a bare alert materially improves incident response, because the analyst receives the reconstructed content rather than a suspicion </w:t>
       </w:r>
       <w:hyperlink r:id="rId102">
         <w:r>
@@ -845,23 +861,7 @@
           <w:i w:val="0"/>
           <w:sz w:val="24"/>
         </w:rPr>
-        <w:t xml:space="preserve">.</w:t>
-      </w:r>
-    </w:p>
-    <w:p>
-      <w:pPr>
-        <w:spacing w:line="276" w:lineRule="auto"/>
-        <w:ind w:firstLine="360"/>
-        <w:jc w:val="both"/>
-      </w:pPr>
-      <w:r>
-        <w:rPr>
-          <w:rFonts w:ascii="Times New Roman" w:hAnsi="Times New Roman" w:eastAsia="Times New Roman" w:cs="Times New Roman"/>
-          <w:b w:val="0"/>
-          <w:i w:val="0"/>
-          <w:sz w:val="24"/>
-        </w:rPr>
-        <w:t xml:space="preserve">The proposed ExFilTrap framework has important applications in enterprise network security and in defensive operations more broadly. Continuous statistical profiling of resolver sessions allows an organisation to detect exfiltration attempts that would otherwise require manual forensic review of DNS logs, and automated mitigation shortens the interval between detection and containment from hours to seconds </w:t>
+        <w:t xml:space="preserve">. The same session statistics also support security operations at scale: because the stateful layer carries negligible per-query cost, the framework can run as an unattended service on the resolver host or on a commodity monitoring node </w:t>
       </w:r>
       <w:hyperlink r:id="rId103">
         <w:r>
@@ -880,7 +880,7 @@
           <w:i w:val="0"/>
           <w:sz w:val="24"/>
         </w:rPr>
-        <w:t xml:space="preserve">. In regulated environments where DNS must remain open, a detector that reports decoded payload evidence rather than a bare alert materially improves incident response, because the analyst receives the reconstructed content rather than a suspicion </w:t>
+        <w:t xml:space="preserve">, and the privilege-separated design allows it to operate under two narrowly scoped Linux capabilities rather than as a fully privileged process </w:t>
       </w:r>
       <w:hyperlink r:id="rId104">
         <w:r>
@@ -890,44 +890,6 @@
             <w:u w:val="none"/>
           </w:rPr>
           <w:t xml:space="preserve">[9]</w:t>
-        </w:r>
-      </w:hyperlink>
-      <w:r>
-        <w:rPr>
-          <w:rFonts w:ascii="Times New Roman" w:hAnsi="Times New Roman" w:eastAsia="Times New Roman" w:cs="Times New Roman"/>
-          <w:b w:val="0"/>
-          <w:i w:val="0"/>
-          <w:sz w:val="24"/>
-        </w:rPr>
-        <w:t xml:space="preserve">. The same session statistics also support security operations at scale: because the stateful layer carries negligible per-query cost, the framework can run as an unattended service on the resolver host or on a commodity monitoring node </w:t>
-      </w:r>
-      <w:hyperlink r:id="rId102">
-        <w:r>
-          <w:rPr>
-            <w:rFonts w:ascii="Times New Roman" w:hAnsi="Times New Roman" w:eastAsia="Times New Roman" w:cs="Times New Roman"/>
-            <w:color w:val="000000"/>
-            <w:u w:val="none"/>
-          </w:rPr>
-          <w:t xml:space="preserve">[10]</w:t>
-        </w:r>
-      </w:hyperlink>
-      <w:r>
-        <w:rPr>
-          <w:rFonts w:ascii="Times New Roman" w:hAnsi="Times New Roman" w:eastAsia="Times New Roman" w:cs="Times New Roman"/>
-          <w:b w:val="0"/>
-          <w:i w:val="0"/>
-          <w:sz w:val="24"/>
-        </w:rPr>
-        <w:t xml:space="preserve">, and the privilege-separated design allows it to operate under two narrowly scoped Linux capabilities rather than as a fully privileged process </w:t>
-      </w:r>
-      <w:hyperlink r:id="rId105">
-        <w:r>
-          <w:rPr>
-            <w:rFonts w:ascii="Times New Roman" w:hAnsi="Times New Roman" w:eastAsia="Times New Roman" w:cs="Times New Roman"/>
-            <w:color w:val="000000"/>
-            <w:u w:val="none"/>
-          </w:rPr>
-          <w:t xml:space="preserve">[11]</w:t>
         </w:r>
       </w:hyperlink>
       <w:r>
@@ -1057,7 +1019,64 @@
         </w:rPr>
         <w:t xml:space="preserve"> proposed a real-time DNS tunneling detection and prevention framework using statistical feature analysis and a Random Forest classifier over domain length, subdomain count and Shannon entropy, together with automated firewall rules, and reported 95.33% accuracy, 95.89% precision, 94.59% recall and a 3.95% false-positive rate against conventional tunneling workloads; the work is important because it establishes the reference architecture that ExFilTrap adopts and extends, but each query is still classified in isolation. Per-query Random Forest detection of this kind is widely reproduced: ensemble and hybrid variants report 92% to 98% accuracy on standard tunneling datasets </w:t>
       </w:r>
+      <w:hyperlink r:id="rId105">
+        <w:r>
+          <w:rPr>
+            <w:rFonts w:ascii="Times New Roman" w:hAnsi="Times New Roman" w:eastAsia="Times New Roman" w:cs="Times New Roman"/>
+            <w:color w:val="000000"/>
+            <w:u w:val="none"/>
+          </w:rPr>
+          <w:t xml:space="preserve">[10]</w:t>
+        </w:r>
+      </w:hyperlink>
+      <w:r>
+        <w:rPr>
+          <w:rFonts w:ascii="Times New Roman" w:hAnsi="Times New Roman" w:eastAsia="Times New Roman" w:cs="Times New Roman"/>
+          <w:b w:val="0"/>
+          <w:i w:val="0"/>
+          <w:sz w:val="24"/>
+        </w:rPr>
+        <w:t xml:space="preserve">, </w:t>
+      </w:r>
+      <w:hyperlink r:id="rId103">
+        <w:r>
+          <w:rPr>
+            <w:rFonts w:ascii="Times New Roman" w:hAnsi="Times New Roman" w:eastAsia="Times New Roman" w:cs="Times New Roman"/>
+            <w:color w:val="000000"/>
+            <w:u w:val="none"/>
+          </w:rPr>
+          <w:t xml:space="preserve">[8]</w:t>
+        </w:r>
+      </w:hyperlink>
+      <w:r>
+        <w:rPr>
+          <w:rFonts w:ascii="Times New Roman" w:hAnsi="Times New Roman" w:eastAsia="Times New Roman" w:cs="Times New Roman"/>
+          <w:b w:val="0"/>
+          <w:i w:val="0"/>
+          <w:sz w:val="24"/>
+        </w:rPr>
+        <w:t xml:space="preserve">, and feature-fusion approaches that combine encoding features with behavioural features improve detection further </w:t>
+      </w:r>
       <w:hyperlink r:id="rId106">
+        <w:r>
+          <w:rPr>
+            <w:rFonts w:ascii="Times New Roman" w:hAnsi="Times New Roman" w:eastAsia="Times New Roman" w:cs="Times New Roman"/>
+            <w:color w:val="000000"/>
+            <w:u w:val="none"/>
+          </w:rPr>
+          <w:t xml:space="preserve">[11]</w:t>
+        </w:r>
+      </w:hyperlink>
+      <w:r>
+        <w:rPr>
+          <w:rFonts w:ascii="Times New Roman" w:hAnsi="Times New Roman" w:eastAsia="Times New Roman" w:cs="Times New Roman"/>
+          <w:b w:val="0"/>
+          <w:i w:val="0"/>
+          <w:sz w:val="24"/>
+        </w:rPr>
+        <w:t xml:space="preserve">. Entropy-only detectors achieve 85% to 92% detection on high-entropy Base32 tunnels but collapse to below 40% on Hex-encoded or encrypted payloads, because a sixteen-symbol alphabet systematically lowers per-label entropy </w:t>
+      </w:r>
+      <w:hyperlink r:id="rId107">
         <w:r>
           <w:rPr>
             <w:rFonts w:ascii="Times New Roman" w:hAnsi="Times New Roman" w:eastAsia="Times New Roman" w:cs="Times New Roman"/>
@@ -1076,26 +1095,7 @@
         </w:rPr>
         <w:t xml:space="preserve">, </w:t>
       </w:r>
-      <w:hyperlink r:id="rId102">
-        <w:r>
-          <w:rPr>
-            <w:rFonts w:ascii="Times New Roman" w:hAnsi="Times New Roman" w:eastAsia="Times New Roman" w:cs="Times New Roman"/>
-            <w:color w:val="000000"/>
-            <w:u w:val="none"/>
-          </w:rPr>
-          <w:t xml:space="preserve">[10]</w:t>
-        </w:r>
-      </w:hyperlink>
-      <w:r>
-        <w:rPr>
-          <w:rFonts w:ascii="Times New Roman" w:hAnsi="Times New Roman" w:eastAsia="Times New Roman" w:cs="Times New Roman"/>
-          <w:b w:val="0"/>
-          <w:i w:val="0"/>
-          <w:sz w:val="24"/>
-        </w:rPr>
-        <w:t xml:space="preserve">, and feature-fusion approaches that combine encoding features with behavioural features improve detection further </w:t>
-      </w:r>
-      <w:hyperlink r:id="rId107">
+      <w:hyperlink r:id="rId108">
         <w:r>
           <w:rPr>
             <w:rFonts w:ascii="Times New Roman" w:hAnsi="Times New Roman" w:eastAsia="Times New Roman" w:cs="Times New Roman"/>
@@ -1112,9 +1112,9 @@
           <w:i w:val="0"/>
           <w:sz w:val="24"/>
         </w:rPr>
-        <w:t xml:space="preserve">. Entropy-only detectors achieve 85% to 92% detection on high-entropy Base32 tunnels but collapse to below 40% on Hex-encoded or encrypted payloads, because a sixteen-symbol alphabet systematically lowers per-label entropy </w:t>
+        <w:t xml:space="preserve">. Statistical outlier methods over query volumes detect volumetric tunneling at 88% to 93% but cannot observe drip strategies that hold per-window volume near the baseline </w:t>
       </w:r>
-      <w:hyperlink r:id="rId108">
+      <w:hyperlink r:id="rId109">
         <w:r>
           <w:rPr>
             <w:rFonts w:ascii="Times New Roman" w:hAnsi="Times New Roman" w:eastAsia="Times New Roman" w:cs="Times New Roman"/>
@@ -1131,9 +1131,9 @@
           <w:i w:val="0"/>
           <w:sz w:val="24"/>
         </w:rPr>
-        <w:t xml:space="preserve">, </w:t>
+        <w:t xml:space="preserve">, and dedicated low-throughput studies confirm that exfiltration below a few queries per minute is the hardest regime for volume-based analysis </w:t>
       </w:r>
-      <w:hyperlink r:id="rId109">
+      <w:hyperlink r:id="rId103">
         <w:r>
           <w:rPr>
             <w:rFonts w:ascii="Times New Roman" w:hAnsi="Times New Roman" w:eastAsia="Times New Roman" w:cs="Times New Roman"/>
@@ -1141,44 +1141,6 @@
             <w:u w:val="none"/>
           </w:rPr>
           <w:t xml:space="preserve">[15]</w:t>
-        </w:r>
-      </w:hyperlink>
-      <w:r>
-        <w:rPr>
-          <w:rFonts w:ascii="Times New Roman" w:hAnsi="Times New Roman" w:eastAsia="Times New Roman" w:cs="Times New Roman"/>
-          <w:b w:val="0"/>
-          <w:i w:val="0"/>
-          <w:sz w:val="24"/>
-        </w:rPr>
-        <w:t xml:space="preserve">. Statistical outlier methods over query volumes detect volumetric tunneling at 88% to 93% but cannot observe drip strategies that hold per-window volume near the baseline </w:t>
-      </w:r>
-      <w:hyperlink r:id="rId110">
-        <w:r>
-          <w:rPr>
-            <w:rFonts w:ascii="Times New Roman" w:hAnsi="Times New Roman" w:eastAsia="Times New Roman" w:cs="Times New Roman"/>
-            <w:color w:val="000000"/>
-            <w:u w:val="none"/>
-          </w:rPr>
-          <w:t xml:space="preserve">[16]</w:t>
-        </w:r>
-      </w:hyperlink>
-      <w:r>
-        <w:rPr>
-          <w:rFonts w:ascii="Times New Roman" w:hAnsi="Times New Roman" w:eastAsia="Times New Roman" w:cs="Times New Roman"/>
-          <w:b w:val="0"/>
-          <w:i w:val="0"/>
-          <w:sz w:val="24"/>
-        </w:rPr>
-        <w:t xml:space="preserve">, and dedicated low-throughput studies confirm that exfiltration below a few queries per minute is the hardest regime for volume-based analysis </w:t>
-      </w:r>
-      <w:hyperlink r:id="rId102">
-        <w:r>
-          <w:rPr>
-            <w:rFonts w:ascii="Times New Roman" w:hAnsi="Times New Roman" w:eastAsia="Times New Roman" w:cs="Times New Roman"/>
-            <w:color w:val="000000"/>
-            <w:u w:val="none"/>
-          </w:rPr>
-          <w:t xml:space="preserve">[7]</w:t>
         </w:r>
       </w:hyperlink>
       <w:r>
@@ -1208,6 +1170,25 @@
           <w:sz w:val="24"/>
         </w:rPr>
         <w:t xml:space="preserve">. Deep sequence models, including temporal convolutional networks, hybrid bidirectional transformers and attention-based architectures, report 96% to 98% accuracy </w:t>
+      </w:r>
+      <w:hyperlink r:id="rId110">
+        <w:r>
+          <w:rPr>
+            <w:rFonts w:ascii="Times New Roman" w:hAnsi="Times New Roman" w:eastAsia="Times New Roman" w:cs="Times New Roman"/>
+            <w:color w:val="000000"/>
+            <w:u w:val="none"/>
+          </w:rPr>
+          <w:t xml:space="preserve">[16]</w:t>
+        </w:r>
+      </w:hyperlink>
+      <w:r>
+        <w:rPr>
+          <w:rFonts w:ascii="Times New Roman" w:hAnsi="Times New Roman" w:eastAsia="Times New Roman" w:cs="Times New Roman"/>
+          <w:b w:val="0"/>
+          <w:i w:val="0"/>
+          <w:sz w:val="24"/>
+        </w:rPr>
+        <w:t xml:space="preserve">, </w:t>
       </w:r>
       <w:hyperlink r:id="rId111">
         <w:r>
@@ -1245,35 +1226,16 @@
           <w:i w:val="0"/>
           <w:sz w:val="24"/>
         </w:rPr>
-        <w:t xml:space="preserve">, </w:t>
+        <w:t xml:space="preserve">, yet they require large labelled corpora, retraining pipelines and accelerator resources, and remain vulnerable to the same per-query evasion once label statistics are matched to the benign distribution </w:t>
       </w:r>
-      <w:hyperlink r:id="rId113">
+      <w:hyperlink r:id="rId100">
         <w:r>
           <w:rPr>
             <w:rFonts w:ascii="Times New Roman" w:hAnsi="Times New Roman" w:eastAsia="Times New Roman" w:cs="Times New Roman"/>
             <w:color w:val="000000"/>
             <w:u w:val="none"/>
           </w:rPr>
-          <w:t xml:space="preserve">[19]</w:t>
-        </w:r>
-      </w:hyperlink>
-      <w:r>
-        <w:rPr>
-          <w:rFonts w:ascii="Times New Roman" w:hAnsi="Times New Roman" w:eastAsia="Times New Roman" w:cs="Times New Roman"/>
-          <w:b w:val="0"/>
-          <w:i w:val="0"/>
-          <w:sz w:val="24"/>
-        </w:rPr>
-        <w:t xml:space="preserve">, yet they require large labelled corpora, retraining pipelines and accelerator resources, and remain vulnerable to the same per-query evasion once label statistics are matched to the benign distribution </w:t>
-      </w:r>
-      <w:hyperlink r:id="rId101">
-        <w:r>
-          <w:rPr>
-            <w:rFonts w:ascii="Times New Roman" w:hAnsi="Times New Roman" w:eastAsia="Times New Roman" w:cs="Times New Roman"/>
-            <w:color w:val="000000"/>
-            <w:u w:val="none"/>
-          </w:rPr>
-          <w:t xml:space="preserve">[6]</w:t>
+          <w:t xml:space="preserve">[5]</w:t>
         </w:r>
       </w:hyperlink>
       <w:r>
@@ -1285,14 +1247,14 @@
         </w:rPr>
         <w:t xml:space="preserve">, </w:t>
       </w:r>
-      <w:hyperlink r:id="rId114">
+      <w:hyperlink r:id="rId113">
         <w:r>
           <w:rPr>
             <w:rFonts w:ascii="Times New Roman" w:hAnsi="Times New Roman" w:eastAsia="Times New Roman" w:cs="Times New Roman"/>
             <w:color w:val="000000"/>
             <w:u w:val="none"/>
           </w:rPr>
-          <w:t xml:space="preserve">[20]</w:t>
+          <w:t xml:space="preserve">[19]</w:t>
         </w:r>
       </w:hyperlink>
       <w:r>
@@ -1323,6 +1285,63 @@
         </w:rPr>
         <w:t xml:space="preserve">, and behavioural fingerprinting has been proposed for covert DNS activity in enterprise networks </w:t>
       </w:r>
+      <w:hyperlink r:id="rId114">
+        <w:r>
+          <w:rPr>
+            <w:rFonts w:ascii="Times New Roman" w:hAnsi="Times New Roman" w:eastAsia="Times New Roman" w:cs="Times New Roman"/>
+            <w:color w:val="000000"/>
+            <w:u w:val="none"/>
+          </w:rPr>
+          <w:t xml:space="preserve">[20]</w:t>
+        </w:r>
+      </w:hyperlink>
+      <w:r>
+        <w:rPr>
+          <w:rFonts w:ascii="Times New Roman" w:hAnsi="Times New Roman" w:eastAsia="Times New Roman" w:cs="Times New Roman"/>
+          <w:b w:val="0"/>
+          <w:i w:val="0"/>
+          <w:sz w:val="24"/>
+        </w:rPr>
+        <w:t xml:space="preserve">; porting this timing idea to DNS is one of the contributions of the proposed system. Sequential hypothesis testing over network flows has previously been applied to port-scan detection with strong statistical guarantees, but has not been combined with entropy-weighted DNS payload mass. Finally, existing mitigation implementations are typically one-way, so a single false positive becomes a prolonged outage; policy-based enforcement with time-to-live and allowlists is proposed here to make automated response operationally safe </w:t>
+      </w:r>
+      <w:hyperlink r:id="rId101">
+        <w:r>
+          <w:rPr>
+            <w:rFonts w:ascii="Times New Roman" w:hAnsi="Times New Roman" w:eastAsia="Times New Roman" w:cs="Times New Roman"/>
+            <w:color w:val="000000"/>
+            <w:u w:val="none"/>
+          </w:rPr>
+          <w:t xml:space="preserve">[6]</w:t>
+        </w:r>
+      </w:hyperlink>
+      <w:r>
+        <w:rPr>
+          <w:rFonts w:ascii="Times New Roman" w:hAnsi="Times New Roman" w:eastAsia="Times New Roman" w:cs="Times New Roman"/>
+          <w:b w:val="0"/>
+          <w:i w:val="0"/>
+          <w:sz w:val="24"/>
+        </w:rPr>
+        <w:t xml:space="preserve">, </w:t>
+      </w:r>
+      <w:hyperlink r:id="rId102">
+        <w:r>
+          <w:rPr>
+            <w:rFonts w:ascii="Times New Roman" w:hAnsi="Times New Roman" w:eastAsia="Times New Roman" w:cs="Times New Roman"/>
+            <w:color w:val="000000"/>
+            <w:u w:val="none"/>
+          </w:rPr>
+          <w:t xml:space="preserve">[7]</w:t>
+        </w:r>
+      </w:hyperlink>
+      <w:r>
+        <w:rPr>
+          <w:rFonts w:ascii="Times New Roman" w:hAnsi="Times New Roman" w:eastAsia="Times New Roman" w:cs="Times New Roman"/>
+          <w:b w:val="0"/>
+          <w:i w:val="0"/>
+          <w:sz w:val="24"/>
+        </w:rPr>
+        <w:t xml:space="preserve">. Taken together, the literature establishes that behavioural and ensemble methods improve robustness </w:t>
+      </w:r>
       <w:hyperlink r:id="rId115">
         <w:r>
           <w:rPr>
@@ -1340,45 +1359,7 @@
           <w:i w:val="0"/>
           <w:sz w:val="24"/>
         </w:rPr>
-        <w:t xml:space="preserve">; porting this timing idea to DNS is one of the contributions of the proposed system. Sequential hypothesis testing over network flows has previously been applied to port-scan detection with strong statistical guarantees, but has not been combined with entropy-weighted DNS payload mass. Finally, existing mitigation implementations are typically one-way, so a single false positive becomes a prolonged outage; policy-based enforcement with time-to-live and allowlists is proposed here to make automated response operationally safe </w:t>
-      </w:r>
-      <w:hyperlink r:id="rId103">
-        <w:r>
-          <w:rPr>
-            <w:rFonts w:ascii="Times New Roman" w:hAnsi="Times New Roman" w:eastAsia="Times New Roman" w:cs="Times New Roman"/>
-            <w:color w:val="000000"/>
-            <w:u w:val="none"/>
-          </w:rPr>
-          <w:t xml:space="preserve">[8]</w:t>
-        </w:r>
-      </w:hyperlink>
-      <w:r>
-        <w:rPr>
-          <w:rFonts w:ascii="Times New Roman" w:hAnsi="Times New Roman" w:eastAsia="Times New Roman" w:cs="Times New Roman"/>
-          <w:b w:val="0"/>
-          <w:i w:val="0"/>
-          <w:sz w:val="24"/>
-        </w:rPr>
         <w:t xml:space="preserve">, </w:t>
-      </w:r>
-      <w:hyperlink r:id="rId104">
-        <w:r>
-          <w:rPr>
-            <w:rFonts w:ascii="Times New Roman" w:hAnsi="Times New Roman" w:eastAsia="Times New Roman" w:cs="Times New Roman"/>
-            <w:color w:val="000000"/>
-            <w:u w:val="none"/>
-          </w:rPr>
-          <w:t xml:space="preserve">[9]</w:t>
-        </w:r>
-      </w:hyperlink>
-      <w:r>
-        <w:rPr>
-          <w:rFonts w:ascii="Times New Roman" w:hAnsi="Times New Roman" w:eastAsia="Times New Roman" w:cs="Times New Roman"/>
-          <w:b w:val="0"/>
-          <w:i w:val="0"/>
-          <w:sz w:val="24"/>
-        </w:rPr>
-        <w:t xml:space="preserve">. Taken together, the literature establishes that behavioural and ensemble methods improve robustness </w:t>
       </w:r>
       <w:hyperlink r:id="rId116">
         <w:r>
@@ -1416,35 +1397,16 @@
           <w:i w:val="0"/>
           <w:sz w:val="24"/>
         </w:rPr>
-        <w:t xml:space="preserve">, </w:t>
+        <w:t xml:space="preserve">, that explainability and rule-based confirmation are valuable for analyst trust </w:t>
       </w:r>
-      <w:hyperlink r:id="rId118">
+      <w:hyperlink r:id="rId108">
         <w:r>
           <w:rPr>
             <w:rFonts w:ascii="Times New Roman" w:hAnsi="Times New Roman" w:eastAsia="Times New Roman" w:cs="Times New Roman"/>
             <w:color w:val="000000"/>
             <w:u w:val="none"/>
           </w:rPr>
-          <w:t xml:space="preserve">[24]</w:t>
-        </w:r>
-      </w:hyperlink>
-      <w:r>
-        <w:rPr>
-          <w:rFonts w:ascii="Times New Roman" w:hAnsi="Times New Roman" w:eastAsia="Times New Roman" w:cs="Times New Roman"/>
-          <w:b w:val="0"/>
-          <w:i w:val="0"/>
-          <w:sz w:val="24"/>
-        </w:rPr>
-        <w:t xml:space="preserve">, that explainability and rule-based confirmation are valuable for analyst trust </w:t>
-      </w:r>
-      <w:hyperlink r:id="rId109">
-        <w:r>
-          <w:rPr>
-            <w:rFonts w:ascii="Times New Roman" w:hAnsi="Times New Roman" w:eastAsia="Times New Roman" w:cs="Times New Roman"/>
-            <w:color w:val="000000"/>
-            <w:u w:val="none"/>
-          </w:rPr>
-          <w:t xml:space="preserve">[15]</w:t>
+          <w:t xml:space="preserve">[13]</w:t>
         </w:r>
       </w:hyperlink>
       <w:r>
@@ -1456,14 +1418,14 @@
         </w:rPr>
         <w:t xml:space="preserve">, and that scalable deployment on programmable hardware is feasible </w:t>
       </w:r>
-      <w:hyperlink r:id="rId102">
+      <w:hyperlink r:id="rId103">
         <w:r>
           <w:rPr>
             <w:rFonts w:ascii="Times New Roman" w:hAnsi="Times New Roman" w:eastAsia="Times New Roman" w:cs="Times New Roman"/>
             <w:color w:val="000000"/>
             <w:u w:val="none"/>
           </w:rPr>
-          <w:t xml:space="preserve">[10]</w:t>
+          <w:t xml:space="preserve">[8]</w:t>
         </w:r>
       </w:hyperlink>
       <w:r>
@@ -1475,14 +1437,14 @@
         </w:rPr>
         <w:t xml:space="preserve">, </w:t>
       </w:r>
-      <w:hyperlink r:id="rId119">
+      <w:hyperlink r:id="rId118">
         <w:r>
           <w:rPr>
             <w:rFonts w:ascii="Times New Roman" w:hAnsi="Times New Roman" w:eastAsia="Times New Roman" w:cs="Times New Roman"/>
             <w:color w:val="000000"/>
             <w:u w:val="none"/>
           </w:rPr>
-          <w:t xml:space="preserve">[25]</w:t>
+          <w:t xml:space="preserve">[24]</w:t>
         </w:r>
       </w:hyperlink>
       <w:r>
@@ -1547,14 +1509,14 @@
         </w:rPr>
         <w:t xml:space="preserve">, </w:t>
       </w:r>
-      <w:hyperlink r:id="rId100">
+      <w:hyperlink r:id="rId119">
         <w:r>
           <w:rPr>
             <w:rFonts w:ascii="Times New Roman" w:hAnsi="Times New Roman" w:eastAsia="Times New Roman" w:cs="Times New Roman"/>
             <w:color w:val="000000"/>
             <w:u w:val="none"/>
           </w:rPr>
-          <w:t xml:space="preserve">[5]</w:t>
+          <w:t xml:space="preserve">[25]</w:t>
         </w:r>
       </w:hyperlink>
       <w:r>
@@ -2143,7 +2105,45 @@
         </w:rPr>
         <w:t xml:space="preserve">The findings agree with the results of earlier studies cautioning against per-packet classification of covert channels: entropy-only detectors drop below 40% detection on Hex or encrypted encodings </w:t>
       </w:r>
+      <w:hyperlink r:id="rId107">
+        <w:r>
+          <w:rPr>
+            <w:rFonts w:ascii="Times New Roman" w:hAnsi="Times New Roman" w:eastAsia="Times New Roman" w:cs="Times New Roman"/>
+            <w:color w:val="000000"/>
+            <w:u w:val="none"/>
+          </w:rPr>
+          <w:t xml:space="preserve">[12]</w:t>
+        </w:r>
+      </w:hyperlink>
+      <w:r>
+        <w:rPr>
+          <w:rFonts w:ascii="Times New Roman" w:hAnsi="Times New Roman" w:eastAsia="Times New Roman" w:cs="Times New Roman"/>
+          <w:b w:val="0"/>
+          <w:i w:val="0"/>
+          <w:sz w:val="24"/>
+        </w:rPr>
+        <w:t xml:space="preserve">, </w:t>
+      </w:r>
       <w:hyperlink r:id="rId108">
+        <w:r>
+          <w:rPr>
+            <w:rFonts w:ascii="Times New Roman" w:hAnsi="Times New Roman" w:eastAsia="Times New Roman" w:cs="Times New Roman"/>
+            <w:color w:val="000000"/>
+            <w:u w:val="none"/>
+          </w:rPr>
+          <w:t xml:space="preserve">[13]</w:t>
+        </w:r>
+      </w:hyperlink>
+      <w:r>
+        <w:rPr>
+          <w:rFonts w:ascii="Times New Roman" w:hAnsi="Times New Roman" w:eastAsia="Times New Roman" w:cs="Times New Roman"/>
+          <w:b w:val="0"/>
+          <w:i w:val="0"/>
+          <w:sz w:val="24"/>
+        </w:rPr>
+        <w:t xml:space="preserve">, volume-based statistical methods cannot see drip-paced sessions </w:t>
+      </w:r>
+      <w:hyperlink r:id="rId109">
         <w:r>
           <w:rPr>
             <w:rFonts w:ascii="Times New Roman" w:hAnsi="Times New Roman" w:eastAsia="Times New Roman" w:cs="Times New Roman"/>
@@ -2162,7 +2162,7 @@
         </w:rPr>
         <w:t xml:space="preserve">, </w:t>
       </w:r>
-      <w:hyperlink r:id="rId109">
+      <w:hyperlink r:id="rId103">
         <w:r>
           <w:rPr>
             <w:rFonts w:ascii="Times New Roman" w:hAnsi="Times New Roman" w:eastAsia="Times New Roman" w:cs="Times New Roman"/>
@@ -2179,16 +2179,16 @@
           <w:i w:val="0"/>
           <w:sz w:val="24"/>
         </w:rPr>
-        <w:t xml:space="preserve">, volume-based statistical methods cannot see drip-paced sessions </w:t>
+        <w:t xml:space="preserve">, and per-query deep sequence models remain exploitable when the adversary matches label statistics to the benign distribution </w:t>
       </w:r>
-      <w:hyperlink r:id="rId110">
+      <w:hyperlink r:id="rId113">
         <w:r>
           <w:rPr>
             <w:rFonts w:ascii="Times New Roman" w:hAnsi="Times New Roman" w:eastAsia="Times New Roman" w:cs="Times New Roman"/>
             <w:color w:val="000000"/>
             <w:u w:val="none"/>
           </w:rPr>
-          <w:t xml:space="preserve">[16]</w:t>
+          <w:t xml:space="preserve">[19]</w:t>
         </w:r>
       </w:hyperlink>
       <w:r>
@@ -2200,52 +2200,14 @@
         </w:rPr>
         <w:t xml:space="preserve">, </w:t>
       </w:r>
-      <w:hyperlink r:id="rId102">
+      <w:hyperlink r:id="rId100">
         <w:r>
           <w:rPr>
             <w:rFonts w:ascii="Times New Roman" w:hAnsi="Times New Roman" w:eastAsia="Times New Roman" w:cs="Times New Roman"/>
             <w:color w:val="000000"/>
             <w:u w:val="none"/>
           </w:rPr>
-          <w:t xml:space="preserve">[7]</w:t>
-        </w:r>
-      </w:hyperlink>
-      <w:r>
-        <w:rPr>
-          <w:rFonts w:ascii="Times New Roman" w:hAnsi="Times New Roman" w:eastAsia="Times New Roman" w:cs="Times New Roman"/>
-          <w:b w:val="0"/>
-          <w:i w:val="0"/>
-          <w:sz w:val="24"/>
-        </w:rPr>
-        <w:t xml:space="preserve">, and per-query deep sequence models remain exploitable when the adversary matches label statistics to the benign distribution </w:t>
-      </w:r>
-      <w:hyperlink r:id="rId114">
-        <w:r>
-          <w:rPr>
-            <w:rFonts w:ascii="Times New Roman" w:hAnsi="Times New Roman" w:eastAsia="Times New Roman" w:cs="Times New Roman"/>
-            <w:color w:val="000000"/>
-            <w:u w:val="none"/>
-          </w:rPr>
-          <w:t xml:space="preserve">[20]</w:t>
-        </w:r>
-      </w:hyperlink>
-      <w:r>
-        <w:rPr>
-          <w:rFonts w:ascii="Times New Roman" w:hAnsi="Times New Roman" w:eastAsia="Times New Roman" w:cs="Times New Roman"/>
-          <w:b w:val="0"/>
-          <w:i w:val="0"/>
-          <w:sz w:val="24"/>
-        </w:rPr>
-        <w:t xml:space="preserve">, </w:t>
-      </w:r>
-      <w:hyperlink r:id="rId101">
-        <w:r>
-          <w:rPr>
-            <w:rFonts w:ascii="Times New Roman" w:hAnsi="Times New Roman" w:eastAsia="Times New Roman" w:cs="Times New Roman"/>
-            <w:color w:val="000000"/>
-            <w:u w:val="none"/>
-          </w:rPr>
-          <w:t xml:space="preserve">[6]</w:t>
+          <w:t xml:space="preserve">[5]</w:t>
         </w:r>
       </w:hyperlink>
       <w:r>
@@ -2276,6 +2238,25 @@
         </w:rPr>
         <w:t xml:space="preserve">, and the DNS beacon detector proposed here behaves consistently: it fired on every machine-periodic session in both the evaluation and the live deployment while never flagging Poisson-arriving benign traffic, and a minimum-interval guard of five seconds correctly exempts fast keepalive-style pollers </w:t>
       </w:r>
+      <w:hyperlink r:id="rId114">
+        <w:r>
+          <w:rPr>
+            <w:rFonts w:ascii="Times New Roman" w:hAnsi="Times New Roman" w:eastAsia="Times New Roman" w:cs="Times New Roman"/>
+            <w:color w:val="000000"/>
+            <w:u w:val="none"/>
+          </w:rPr>
+          <w:t xml:space="preserve">[20]</w:t>
+        </w:r>
+      </w:hyperlink>
+      <w:r>
+        <w:rPr>
+          <w:rFonts w:ascii="Times New Roman" w:hAnsi="Times New Roman" w:eastAsia="Times New Roman" w:cs="Times New Roman"/>
+          <w:b w:val="0"/>
+          <w:i w:val="0"/>
+          <w:sz w:val="24"/>
+        </w:rPr>
+        <w:t xml:space="preserve">. The sequential z-test formulation inherits the statistical guarantees of sequential analysis while remaining computationally trivial, requiring a single subtraction and division per query. The improvement reported here is also consistent with independent work showing that behavioural analytics combined with anomaly scoring improves detection over single-stage classifiers </w:t>
+      </w:r>
       <w:hyperlink r:id="rId115">
         <w:r>
           <w:rPr>
@@ -2293,7 +2274,26 @@
           <w:i w:val="0"/>
           <w:sz w:val="24"/>
         </w:rPr>
-        <w:t xml:space="preserve">. The sequential z-test formulation inherits the statistical guarantees of sequential analysis while remaining computationally trivial, requiring a single subtraction and division per query. The improvement reported here is also consistent with independent work showing that behavioural analytics combined with anomaly scoring improves detection over single-stage classifiers </w:t>
+        <w:t xml:space="preserve">, </w:t>
+      </w:r>
+      <w:hyperlink r:id="rId106">
+        <w:r>
+          <w:rPr>
+            <w:rFonts w:ascii="Times New Roman" w:hAnsi="Times New Roman" w:eastAsia="Times New Roman" w:cs="Times New Roman"/>
+            <w:color w:val="000000"/>
+            <w:u w:val="none"/>
+          </w:rPr>
+          <w:t xml:space="preserve">[11]</w:t>
+        </w:r>
+      </w:hyperlink>
+      <w:r>
+        <w:rPr>
+          <w:rFonts w:ascii="Times New Roman" w:hAnsi="Times New Roman" w:eastAsia="Times New Roman" w:cs="Times New Roman"/>
+          <w:b w:val="0"/>
+          <w:i w:val="0"/>
+          <w:sz w:val="24"/>
+        </w:rPr>
+        <w:t xml:space="preserve">, and with ensemble approaches that report better robustness when payload content is unavailable </w:t>
       </w:r>
       <w:hyperlink r:id="rId116">
         <w:r>
@@ -2314,25 +2314,6 @@
         </w:rPr>
         <w:t xml:space="preserve">, </w:t>
       </w:r>
-      <w:hyperlink r:id="rId107">
-        <w:r>
-          <w:rPr>
-            <w:rFonts w:ascii="Times New Roman" w:hAnsi="Times New Roman" w:eastAsia="Times New Roman" w:cs="Times New Roman"/>
-            <w:color w:val="000000"/>
-            <w:u w:val="none"/>
-          </w:rPr>
-          <w:t xml:space="preserve">[13]</w:t>
-        </w:r>
-      </w:hyperlink>
-      <w:r>
-        <w:rPr>
-          <w:rFonts w:ascii="Times New Roman" w:hAnsi="Times New Roman" w:eastAsia="Times New Roman" w:cs="Times New Roman"/>
-          <w:b w:val="0"/>
-          <w:i w:val="0"/>
-          <w:sz w:val="24"/>
-        </w:rPr>
-        <w:t xml:space="preserve">, and with ensemble approaches that report better robustness when payload content is unavailable </w:t>
-      </w:r>
       <w:hyperlink r:id="rId117">
         <w:r>
           <w:rPr>
@@ -2350,7 +2331,7 @@
           <w:i w:val="0"/>
           <w:sz w:val="24"/>
         </w:rPr>
-        <w:t xml:space="preserve">, </w:t>
+        <w:t xml:space="preserve">. However, some limitations remain. Precision on the slow-drip profile averages 71.65%, because a small fraction of benign hash-label queries shares the entropy band that the tunnel must occupy and is escalated alongside the true positives; the reported mitigations of allowlists and time-to-live based unbanning reduce the operational impact but do not eliminate the underlying statistical overlap. The payload decoder confirms only 1.82% of slow-drip queries by design, because the stealth adversary encrypts its payload and ciphertext is neither printable nor signature-bearing, so confirmation-based evidence remains meaningful only against plaintext tunnels, where the fast profile confirms 71.43% of queries. The evaluation corpus, while drawn from 50,000 real domains, is still a laboratory simulation, and a drip arriving with literally zero benign background would build its own baseline and evade the z-test, although the beacon detector would still fire on its timing; real networks always carry benign DNS, and the evaluation mixes it in deliberately </w:t>
       </w:r>
       <w:hyperlink r:id="rId118">
         <w:r>
@@ -2369,35 +2350,16 @@
           <w:i w:val="0"/>
           <w:sz w:val="24"/>
         </w:rPr>
-        <w:t xml:space="preserve">. However, some limitations remain. Precision on the slow-drip profile averages 71.65%, because a small fraction of benign hash-label queries shares the entropy band that the tunnel must occupy and is escalated alongside the true positives; the reported mitigations of allowlists and time-to-live based unbanning reduce the operational impact but do not eliminate the underlying statistical overlap. The payload decoder confirms only 1.82% of slow-drip queries by design, because the stealth adversary encrypts its payload and ciphertext is neither printable nor signature-bearing, so confirmation-based evidence remains meaningful only against plaintext tunnels, where the fast profile confirms 71.43% of queries. The evaluation corpus, while drawn from 50,000 real domains, is still a laboratory simulation, and a drip arriving with literally zero benign background would build its own baseline and evade the z-test, although the beacon detector would still fire on its timing; real networks always carry benign DNS, and the evaluation mixes it in deliberately </w:t>
+        <w:t xml:space="preserve">, </w:t>
       </w:r>
-      <w:hyperlink r:id="rId119">
+      <w:hyperlink r:id="rId103">
         <w:r>
           <w:rPr>
             <w:rFonts w:ascii="Times New Roman" w:hAnsi="Times New Roman" w:eastAsia="Times New Roman" w:cs="Times New Roman"/>
             <w:color w:val="000000"/>
             <w:u w:val="none"/>
           </w:rPr>
-          <w:t xml:space="preserve">[25]</w:t>
-        </w:r>
-      </w:hyperlink>
-      <w:r>
-        <w:rPr>
-          <w:rFonts w:ascii="Times New Roman" w:hAnsi="Times New Roman" w:eastAsia="Times New Roman" w:cs="Times New Roman"/>
-          <w:b w:val="0"/>
-          <w:i w:val="0"/>
-          <w:sz w:val="24"/>
-        </w:rPr>
-        <w:t xml:space="preserve">, </w:t>
-      </w:r>
-      <w:hyperlink r:id="rId102">
-        <w:r>
-          <w:rPr>
-            <w:rFonts w:ascii="Times New Roman" w:hAnsi="Times New Roman" w:eastAsia="Times New Roman" w:cs="Times New Roman"/>
-            <w:color w:val="000000"/>
-            <w:u w:val="none"/>
-          </w:rPr>
-          <w:t xml:space="preserve">[10]</w:t>
+          <w:t xml:space="preserve">[8]</w:t>
         </w:r>
       </w:hyperlink>
       <w:r>
@@ -2480,14 +2442,14 @@
         </w:rPr>
         <w:t xml:space="preserve">; shard-level state merging for enterprise resolver scale so that a detector can serve forwarder farms handling hundreds of thousands of queries per second </w:t>
       </w:r>
-      <w:hyperlink r:id="rId102">
+      <w:hyperlink r:id="rId103">
         <w:r>
           <w:rPr>
             <w:rFonts w:ascii="Times New Roman" w:hAnsi="Times New Roman" w:eastAsia="Times New Roman" w:cs="Times New Roman"/>
             <w:color w:val="000000"/>
             <w:u w:val="none"/>
           </w:rPr>
-          <w:t xml:space="preserve">[10]</w:t>
+          <w:t xml:space="preserve">[8]</w:t>
         </w:r>
       </w:hyperlink>
       <w:r>
@@ -2499,14 +2461,14 @@
         </w:rPr>
         <w:t xml:space="preserve">, </w:t>
       </w:r>
-      <w:hyperlink r:id="rId119">
+      <w:hyperlink r:id="rId118">
         <w:r>
           <w:rPr>
             <w:rFonts w:ascii="Times New Roman" w:hAnsi="Times New Roman" w:eastAsia="Times New Roman" w:cs="Times New Roman"/>
             <w:color w:val="000000"/>
             <w:u w:val="none"/>
           </w:rPr>
-          <w:t xml:space="preserve">[25]</w:t>
+          <w:t xml:space="preserve">[24]</w:t>
         </w:r>
       </w:hyperlink>
       <w:r>
@@ -7864,7 +7826,7 @@
           <w:i w:val="0"/>
           <w:sz w:val="22"/>
         </w:rPr>
-        <w:t>Alkasassbeh, Mouhammd, and Mohammad Almseidin. Machine learning techniques for accurately detecting the DNS tunneling. Science and Information Conference, pp. 352-364. 2023.</w:t>
+        <w:t>Al Musa, Mohammad, and Ismail Altaharwa. Stealth at the Edge: A High-Throughput, ML-Resistant DNS Covert Channel via Direct UDP and Algorithmic Phonotactics. In 2026 Jordan Conference on Applied Electrical Engineering and Computing Technologies (AEECT), pp. 291-296. 2026.</w:t>
       </w:r>
     </w:p>
     <w:p>
@@ -7891,32 +7853,7 @@
           <w:i w:val="0"/>
           <w:sz w:val="22"/>
         </w:rPr>
-        <w:t>Al Musa, Mohammad, and Ismail Altaharwa. Stealth at the Edge: A High-Throughput, ML-Resistant DNS Covert Channel via Direct UDP and Algorithmic Phonotactics. In 2026 Jordan Conference on Applied Electrical Engineering and Computing Technologies (AEECT), pp. 291-296. 2026.</w:t>
-      </w:r>
-    </w:p>
-    <w:p>
-      <w:pPr>
-        <w:spacing w:line="276" w:lineRule="auto" w:after="40"/>
-        <w:ind w:left="432" w:hanging="432"/>
-        <w:jc w:val="both"/>
-      </w:pPr>
-      <w:r>
-        <w:rPr>
-          <w:rFonts w:ascii="Times New Roman" w:hAnsi="Times New Roman" w:eastAsia="Times New Roman" w:cs="Times New Roman"/>
-          <w:b w:val="0"/>
-          <w:i w:val="0"/>
-          <w:sz w:val="22"/>
-        </w:rPr>
-        <w:t xml:space="preserve">7. </w:t>
-      </w:r>
-      <w:r>
-        <w:rPr>
-          <w:rFonts w:ascii="Times New Roman" w:hAnsi="Times New Roman" w:eastAsia="Times New Roman" w:cs="Times New Roman"/>
-          <w:b w:val="0"/>
-          <w:i w:val="0"/>
-          <w:sz w:val="22"/>
-        </w:rPr>
-        <w:t>Liu, Xiaoyu, Weixuan Mao, Anqi Wang, Zheng Li, Hui Xue, Yijing Zhang, Jianjun Lin, Xiaodu Yang, Ziqian Chen, and Bo Sun. DNS tunnel detection for low throughput data exfiltration via time-frequency domain analysis. ICC 2023-International Conference on Communications, pp. 2331-2337. 2023.</w:t>
+        <w:t>Inayat, Usman, and Reamsha Khan. Detection and Prevention of DNS Tunneling Attacks: Exploring Technologies and Methodologies. UMT Artificial Intelligence Review 4, no. 1 (2024): 37-45.</w:t>
       </w:r>
     </w:p>
     <w:p>
@@ -7933,7 +7870,7 @@
             <w:u w:val="none"/>
             <w:sz w:val="22"/>
           </w:rPr>
-          <w:t xml:space="preserve">8. </w:t>
+          <w:t xml:space="preserve">7. </w:t>
         </w:r>
       </w:hyperlink>
       <w:r>
@@ -7943,7 +7880,32 @@
           <w:i w:val="0"/>
           <w:sz w:val="22"/>
         </w:rPr>
-        <w:t>Inayat, Usman, and Reamsha Khan. Detection and Prevention of DNS Tunneling Attacks: Exploring Technologies and Methodologies. UMT Artificial Intelligence Review 4, no. 1 (2024): 37-45.</w:t>
+        <w:t>Adiwal, Sanjay, Balaji Rajendran, and Sithu D. Sudarsan. Dns intrusion detection (did)—a snort-based solution to detect dns amplification and dns tunneling attacks. Franklin Open 2 (2023): 100010.</w:t>
+      </w:r>
+    </w:p>
+    <w:p>
+      <w:pPr>
+        <w:spacing w:line="276" w:lineRule="auto" w:after="40"/>
+        <w:ind w:left="432" w:hanging="432"/>
+        <w:jc w:val="both"/>
+      </w:pPr>
+      <w:r>
+        <w:rPr>
+          <w:rFonts w:ascii="Times New Roman" w:hAnsi="Times New Roman" w:eastAsia="Times New Roman" w:cs="Times New Roman"/>
+          <w:b w:val="0"/>
+          <w:i w:val="0"/>
+          <w:sz w:val="22"/>
+        </w:rPr>
+        <w:t xml:space="preserve">8. </w:t>
+      </w:r>
+      <w:r>
+        <w:rPr>
+          <w:rFonts w:ascii="Times New Roman" w:hAnsi="Times New Roman" w:eastAsia="Times New Roman" w:cs="Times New Roman"/>
+          <w:b w:val="0"/>
+          <w:i w:val="0"/>
+          <w:sz w:val="22"/>
+        </w:rPr>
+        <w:t>Ren, Fengfeng, Lizhi Peng, and Yihang Hao. A Scalable DNS Tunneling Detection Method Based on Ensemble Learning for Programmable Switches. International Conference on Intelligent Computing, pp. 379-390. 2026.</w:t>
       </w:r>
     </w:p>
     <w:p>
@@ -7970,32 +7932,7 @@
           <w:i w:val="0"/>
           <w:sz w:val="22"/>
         </w:rPr>
-        <w:t>Adiwal, Sanjay, Balaji Rajendran, and Sithu D. Sudarsan. Dns intrusion detection (did)—a snort-based solution to detect dns amplification and dns tunneling attacks. Franklin Open 2 (2023): 100010.</w:t>
-      </w:r>
-    </w:p>
-    <w:p>
-      <w:pPr>
-        <w:spacing w:line="276" w:lineRule="auto" w:after="40"/>
-        <w:ind w:left="432" w:hanging="432"/>
-        <w:jc w:val="both"/>
-      </w:pPr>
-      <w:r>
-        <w:rPr>
-          <w:rFonts w:ascii="Times New Roman" w:hAnsi="Times New Roman" w:eastAsia="Times New Roman" w:cs="Times New Roman"/>
-          <w:b w:val="0"/>
-          <w:i w:val="0"/>
-          <w:sz w:val="22"/>
-        </w:rPr>
-        <w:t xml:space="preserve">10. </w:t>
-      </w:r>
-      <w:r>
-        <w:rPr>
-          <w:rFonts w:ascii="Times New Roman" w:hAnsi="Times New Roman" w:eastAsia="Times New Roman" w:cs="Times New Roman"/>
-          <w:b w:val="0"/>
-          <w:i w:val="0"/>
-          <w:sz w:val="22"/>
-        </w:rPr>
-        <w:t>Ren, Fengfeng, Lizhi Peng, and Yihang Hao. A Scalable DNS Tunneling Detection Method Based on Ensemble Learning for Programmable Switches. International Conference on Intelligent Computing, pp. 379-390. 2026.</w:t>
+        <w:t>Senthil, Kumar P., Shieh Chin-Shiuh, and Horng Mong-Fong. Cognitive-Adaptive Multilayer AI Firewall Architecture (C-AMLAFA) for Encrypted Traffic Analysis in Enterprise Networks. International Journal on Smart Sensing and Intelligent Systems 19, no. 1 (2026).</w:t>
       </w:r>
     </w:p>
     <w:p>
@@ -8012,34 +7949,7 @@
             <w:u w:val="none"/>
             <w:sz w:val="22"/>
           </w:rPr>
-          <w:t xml:space="preserve">11. </w:t>
-        </w:r>
-      </w:hyperlink>
-      <w:r>
-        <w:rPr>
-          <w:rFonts w:ascii="Times New Roman" w:hAnsi="Times New Roman" w:eastAsia="Times New Roman" w:cs="Times New Roman"/>
-          <w:b w:val="0"/>
-          <w:i w:val="0"/>
-          <w:sz w:val="22"/>
-        </w:rPr>
-        <w:t>Senthil, Kumar P., Shieh Chin-Shiuh, and Horng Mong-Fong. Cognitive-Adaptive Multilayer AI Firewall Architecture (C-AMLAFA) for Encrypted Traffic Analysis in Enterprise Networks. International Journal on Smart Sensing and Intelligent Systems 19, no. 1 (2026).</w:t>
-      </w:r>
-    </w:p>
-    <w:p>
-      <w:pPr>
-        <w:spacing w:line="276" w:lineRule="auto" w:after="40"/>
-        <w:ind w:left="432" w:hanging="432"/>
-        <w:jc w:val="both"/>
-      </w:pPr>
-      <w:hyperlink r:id="rId32">
-        <w:r>
-          <w:rPr>
-            <w:rFonts w:ascii="Times New Roman" w:hAnsi="Times New Roman" w:eastAsia="Times New Roman" w:cs="Times New Roman"/>
-            <w:color w:val="000000"/>
-            <w:u w:val="none"/>
-            <w:sz w:val="22"/>
-          </w:rPr>
-          <w:t xml:space="preserve">12. </w:t>
+          <w:t xml:space="preserve">10. </w:t>
         </w:r>
       </w:hyperlink>
       <w:r>
@@ -8058,7 +7968,7 @@
         <w:ind w:left="432" w:hanging="432"/>
         <w:jc w:val="both"/>
       </w:pPr>
-      <w:hyperlink r:id="rId33">
+      <w:hyperlink r:id="rId32">
         <w:r>
           <w:rPr>
             <w:rFonts w:ascii="Times New Roman" w:hAnsi="Times New Roman" w:eastAsia="Times New Roman" w:cs="Times New Roman"/>
@@ -8066,7 +7976,7 @@
             <w:u w:val="none"/>
             <w:sz w:val="22"/>
           </w:rPr>
-          <w:t xml:space="preserve">13. </w:t>
+          <w:t xml:space="preserve">11. </w:t>
         </w:r>
       </w:hyperlink>
       <w:r>
@@ -8085,7 +7995,7 @@
         <w:ind w:left="432" w:hanging="432"/>
         <w:jc w:val="both"/>
       </w:pPr>
-      <w:hyperlink r:id="rId34">
+      <w:hyperlink r:id="rId33">
         <w:r>
           <w:rPr>
             <w:rFonts w:ascii="Times New Roman" w:hAnsi="Times New Roman" w:eastAsia="Times New Roman" w:cs="Times New Roman"/>
@@ -8093,7 +8003,7 @@
             <w:u w:val="none"/>
             <w:sz w:val="22"/>
           </w:rPr>
-          <w:t xml:space="preserve">14. </w:t>
+          <w:t xml:space="preserve">12. </w:t>
         </w:r>
       </w:hyperlink>
       <w:r>
@@ -8112,7 +8022,7 @@
         <w:ind w:left="432" w:hanging="432"/>
         <w:jc w:val="both"/>
       </w:pPr>
-      <w:hyperlink r:id="rId35">
+      <w:hyperlink r:id="rId34">
         <w:r>
           <w:rPr>
             <w:rFonts w:ascii="Times New Roman" w:hAnsi="Times New Roman" w:eastAsia="Times New Roman" w:cs="Times New Roman"/>
@@ -8120,7 +8030,7 @@
             <w:u w:val="none"/>
             <w:sz w:val="22"/>
           </w:rPr>
-          <w:t xml:space="preserve">15. </w:t>
+          <w:t xml:space="preserve">13. </w:t>
         </w:r>
       </w:hyperlink>
       <w:r>
@@ -8131,6 +8041,58 @@
           <w:sz w:val="22"/>
         </w:rPr>
         <w:t>De Bernardi, Giacomo, Giovanni Battista Gaggero, Fabio Patrone, Sandro Zappatore, Mario Marchese, and Maurizio Mongelli. Rule-based eXplainable autoencoder for DNS tunneling detection. Computers 14, no. 9 (2025): 375.</w:t>
+      </w:r>
+    </w:p>
+    <w:p>
+      <w:pPr>
+        <w:spacing w:line="276" w:lineRule="auto" w:after="40"/>
+        <w:ind w:left="432" w:hanging="432"/>
+        <w:jc w:val="both"/>
+      </w:pPr>
+      <w:hyperlink r:id="rId35">
+        <w:r>
+          <w:rPr>
+            <w:rFonts w:ascii="Times New Roman" w:hAnsi="Times New Roman" w:eastAsia="Times New Roman" w:cs="Times New Roman"/>
+            <w:color w:val="000000"/>
+            <w:u w:val="none"/>
+            <w:sz w:val="22"/>
+          </w:rPr>
+          <w:t xml:space="preserve">14. </w:t>
+        </w:r>
+      </w:hyperlink>
+      <w:r>
+        <w:rPr>
+          <w:rFonts w:ascii="Times New Roman" w:hAnsi="Times New Roman" w:eastAsia="Times New Roman" w:cs="Times New Roman"/>
+          <w:b w:val="0"/>
+          <w:i w:val="0"/>
+          <w:sz w:val="22"/>
+        </w:rPr>
+        <w:t>Abualghanam, Orieb, Hadeel Alazzam, Basima Elshqeirat, Mohammad Qatawneh, and Mohammed Amin Almaiah. Real-time detection system for data exfiltration over DNS tunneling using machine learning. Electronics 12, no. 6 (2023): 1467.</w:t>
+      </w:r>
+    </w:p>
+    <w:p>
+      <w:pPr>
+        <w:spacing w:line="276" w:lineRule="auto" w:after="40"/>
+        <w:ind w:left="432" w:hanging="432"/>
+        <w:jc w:val="both"/>
+      </w:pPr>
+      <w:r>
+        <w:rPr>
+          <w:rFonts w:ascii="Times New Roman" w:hAnsi="Times New Roman" w:eastAsia="Times New Roman" w:cs="Times New Roman"/>
+          <w:b w:val="0"/>
+          <w:i w:val="0"/>
+          <w:sz w:val="22"/>
+        </w:rPr>
+        <w:t xml:space="preserve">15. </w:t>
+      </w:r>
+      <w:r>
+        <w:rPr>
+          <w:rFonts w:ascii="Times New Roman" w:hAnsi="Times New Roman" w:eastAsia="Times New Roman" w:cs="Times New Roman"/>
+          <w:b w:val="0"/>
+          <w:i w:val="0"/>
+          <w:sz w:val="22"/>
+        </w:rPr>
+        <w:t>Liu, Xiaoyu, Weixuan Mao, Anqi Wang, Zheng Li, Hui Xue, Yijing Zhang, Jianjun Lin, Xiaodu Yang, Ziqian Chen, and Bo Sun. DNS tunnel detection for low throughput data exfiltration via time-frequency domain analysis. ICC 2023-International Conference on Communications, pp. 2331-2337. 2023.</w:t>
       </w:r>
     </w:p>
     <w:p>
@@ -8157,7 +8119,7 @@
           <w:i w:val="0"/>
           <w:sz w:val="22"/>
         </w:rPr>
-        <w:t>Abualghanam, Orieb, Hadeel Alazzam, Basima Elshqeirat, Mohammad Qatawneh, and Mohammed Amin Almaiah. Real-time detection system for data exfiltration over DNS tunneling using machine learning. Electronics 12, no. 6 (2023): 1467.</w:t>
+        <w:t>Karthik, Valaji Veera Venkata, Thallapalli Vikranth, Sunku Suhash, and Thupakula Gangadhar Reddy. DNS Tunneling Detection using Temporal Convolutional Network and Attention Layers. In 2025 5th International Conference on Evolutionary Computing and Mobile Sustainable Networks (ICECMSN), pp. 353-357. 2025.</w:t>
       </w:r>
     </w:p>
     <w:p>
@@ -8184,7 +8146,7 @@
           <w:i w:val="0"/>
           <w:sz w:val="22"/>
         </w:rPr>
-        <w:t>Karthik, Valaji Veera Venkata, Thallapalli Vikranth, Sunku Suhash, and Thupakula Gangadhar Reddy. DNS Tunneling Detection using Temporal Convolutional Network and Attention Layers. In 2025 5th International Conference on Evolutionary Computing and Mobile Sustainable Networks (ICECMSN), pp. 353-357. 2025.</w:t>
+        <w:t>Kuang, Shilei, Weiping Wang, Yongfei Ye, and Lingzhi Peng. HHBT: DNS tunneling Detection via Hybrid Hierarchical Bidirectional Transformer. Computer Networks (2025): 111919.</w:t>
       </w:r>
     </w:p>
     <w:p>
@@ -8211,7 +8173,7 @@
           <w:i w:val="0"/>
           <w:sz w:val="22"/>
         </w:rPr>
-        <w:t>Kuang, Shilei, Weiping Wang, Yongfei Ye, and Lingzhi Peng. HHBT: DNS tunneling Detection via Hybrid Hierarchical Bidirectional Transformer. Computer Networks (2025): 111919.</w:t>
+        <w:t>Tayyeh, Huda Kadhim, and Ahmed Sabah Ahmed Al-Jumaili. A long short term memory model for character-based analysis of DNS tunneling detection. Scalable Computing: Practice and Experience 25, no. 6 (2024): 5250-5257.</w:t>
       </w:r>
     </w:p>
     <w:p>
@@ -8238,7 +8200,7 @@
           <w:i w:val="0"/>
           <w:sz w:val="22"/>
         </w:rPr>
-        <w:t>Tayyeh, Huda Kadhim, and Ahmed Sabah Ahmed Al-Jumaili. A long short term memory model for character-based analysis of DNS tunneling detection. Scalable Computing: Practice and Experience 25, no. 6 (2024): 5250-5257.</w:t>
+        <w:t>James, Carter. Adaptive Adversarial Evasion: Evaluating the Robustness of Hybrid CNN-LSTM Models Against Mutated DNS Tunneling Payloads in Real-Time. ScienceOpen Preprints (2026).</w:t>
       </w:r>
     </w:p>
     <w:p>
@@ -8265,7 +8227,7 @@
           <w:i w:val="0"/>
           <w:sz w:val="22"/>
         </w:rPr>
-        <w:t>James, Carter. Adaptive Adversarial Evasion: Evaluating the Robustness of Hybrid CNN-LSTM Models Against Mutated DNS Tunneling Payloads in Real-Time. ScienceOpen Preprints (2026).</w:t>
+        <w:t>Bennett, Oliver, and Amelia Clarke. Behavioral Fingerprinting for Detecting Covert DNS Tunneling Activities in Enterprise Networks. China and WTO Review 12, no. 1 (2026).</w:t>
       </w:r>
     </w:p>
     <w:p>
@@ -8292,7 +8254,7 @@
           <w:i w:val="0"/>
           <w:sz w:val="22"/>
         </w:rPr>
-        <w:t>Bennett, Oliver, and Amelia Clarke. Behavioral Fingerprinting for Detecting Covert DNS Tunneling Activities in Enterprise Networks. China and WTO Review 12, no. 1 (2026).</w:t>
+        <w:t>Arora, Kabeer, Koena Sarkar, and R. S. Ponmagal. Multi-Stage DNS Tunnelling Detection Using Behavioural Analytics and AI-Based Anomaly Scoring. In 2026 1st International Conference on AI, Data Science, Cyber Security and Smart Manufacturing for Sustainable Development (ICADCS), pp. 212-217. 2026.</w:t>
       </w:r>
     </w:p>
     <w:p>
@@ -8319,7 +8281,7 @@
           <w:i w:val="0"/>
           <w:sz w:val="22"/>
         </w:rPr>
-        <w:t>Arora, Kabeer, Koena Sarkar, and R. S. Ponmagal. Multi-Stage DNS Tunnelling Detection Using Behavioural Analytics and AI-Based Anomaly Scoring. In 2026 1st International Conference on AI, Data Science, Cyber Security and Smart Manufacturing for Sustainable Development (ICADCS), pp. 212-217. 2026.</w:t>
+        <w:t>Sa’ad, Umar, Demeke Shumeye Lakew, Nhu-Ngoc Dao, and Sungrae Cho. Herald: Hybrid ensemble approach for robust anomaly detection in encrypted dns traffic. Journal of Network and Computer Applications (2025): 104342.</w:t>
       </w:r>
     </w:p>
     <w:p>
@@ -8346,7 +8308,7 @@
           <w:i w:val="0"/>
           <w:sz w:val="22"/>
         </w:rPr>
-        <w:t>Sa’ad, Umar, Demeke Shumeye Lakew, Nhu-Ngoc Dao, and Sungrae Cho. Herald: Hybrid ensemble approach for robust anomaly detection in encrypted dns traffic. Journal of Network and Computer Applications (2025): 104342.</w:t>
+        <w:t>Lyu, Xinchen. Detecting and Mitigating DNS Exfiltration Attacks in Real-Time Using Ensemble Deep Learning Models. (2026).</w:t>
       </w:r>
     </w:p>
     <w:p>
@@ -8373,7 +8335,7 @@
           <w:i w:val="0"/>
           <w:sz w:val="22"/>
         </w:rPr>
-        <w:t>Lyu, Xinchen. Detecting and Mitigating DNS Exfiltration Attacks in Real-Time Using Ensemble Deep Learning Models. (2026).</w:t>
+        <w:t>Elizalde, Sergio, Ali AlSabeh, Samia Choueiri, Jaime Galán-Jiménez, Elie Kfoury, and Jorge Crichigno. Real-Time Detection of Encrypted DGA and DNS Tunneling Using DPDK on SmartNICs. In 2026 International Black Seas Conference on Communications and Networking (BlackSeaCom), pp. 1-6. 2026.</w:t>
       </w:r>
     </w:p>
     <w:p>
@@ -8400,7 +8362,7 @@
           <w:i w:val="0"/>
           <w:sz w:val="22"/>
         </w:rPr>
-        <w:t>Elizalde, Sergio, Ali AlSabeh, Samia Choueiri, Jaime Galán-Jiménez, Elie Kfoury, and Jorge Crichigno. Real-Time Detection of Encrypted DGA and DNS Tunneling Using DPDK on SmartNICs. In 2026 International Black Seas Conference on Communications and Networking (BlackSeaCom), pp. 1-6. 2026.</w:t>
+        <w:t>Alkasassbeh, Mouhammd, and Mohammad Almseidin. Machine learning techniques for accurately detecting the DNS tunneling. Science and Information Conference, pp. 352-364. 2023.</w:t>
       </w:r>
     </w:p>
     <w:p>

</xml_diff>